<commit_message>
ci: un rilancio della release aggiorna anche le note; Android nella v1.0.0
- release.yml: con la release gia' presente, dopo il caricamento dei file le note vengono riscritte
  (gh release edit), cosi' "Non ancora disponibile" sparisce quando il sistema mancante viene aggiunto
- CLAUDE.md e docs/PDFz_20261016.docx: Android aggiunto alla release v1.0.0 (APK firmato con la chiave
  di PDFz), chiave conservata fuori dal repository, note della release corrette

Co-Authored-By: Claude Opus 5.5 <noreply@anthropic.com>
</commit_message>
<xml_diff>
--- a/docs/PDFz_20261016.docx
+++ b/docs/PDFz_20261016.docx
@@ -16,7 +16,7 @@
           <w:noProof/>
         </w:rPr>
         <w:drawing>
-          <wp:inline distT="0" distB="0" distL="0" distR="0" wp14:anchorId="6421E3FF" wp14:editId="033489CD">
+          <wp:inline distT="0" distB="0" distL="0" distR="0" wp14:anchorId="1568B848" wp14:editId="6D724F1C">
             <wp:extent cx="3619500" cy="1285875"/>
             <wp:effectExtent l="0" t="0" r="0" b="0"/>
             <wp:docPr id="1" name="Immagine 1"/>
@@ -135,7 +135,7 @@
     <w:sdt>
       <w:sdtPr>
         <w:alias w:val="Indice"/>
-        <w:id w:val="1088045598"/>
+        <w:id w:val="568697442"/>
       </w:sdtPr>
       <w:sdtEndPr/>
       <w:sdtContent>
@@ -158,7 +158,7 @@
           <w:r>
             <w:fldChar w:fldCharType="separate"/>
           </w:r>
-          <w:hyperlink w:anchor="_Toc243065225" w:history="1">
+          <w:hyperlink w:anchor="_Toc243069360" w:history="1">
             <w:r>
               <w:rPr>
                 <w:rStyle w:val="Collegamentoipertestuale"/>
@@ -182,7 +182,7 @@
               <w:rPr>
                 <w:noProof/>
               </w:rPr>
-              <w:instrText xml:space="preserve"> PAGEREF _Toc243065225 \h </w:instrText>
+              <w:instrText xml:space="preserve"> PAGEREF _Toc243069360 \h </w:instrText>
             </w:r>
             <w:r>
               <w:rPr>
@@ -219,7 +219,7 @@
               <w:noProof/>
             </w:rPr>
           </w:pPr>
-          <w:hyperlink w:anchor="_Toc243065226" w:history="1">
+          <w:hyperlink w:anchor="_Toc243069361" w:history="1">
             <w:r>
               <w:rPr>
                 <w:rStyle w:val="Collegamentoipertestuale"/>
@@ -243,7 +243,7 @@
               <w:rPr>
                 <w:noProof/>
               </w:rPr>
-              <w:instrText xml:space="preserve"> PAGEREF _Toc243065226 \h </w:instrText>
+              <w:instrText xml:space="preserve"> PAGEREF _Toc243069361 \h </w:instrText>
             </w:r>
             <w:r>
               <w:rPr>
@@ -280,7 +280,7 @@
               <w:noProof/>
             </w:rPr>
           </w:pPr>
-          <w:hyperlink w:anchor="_Toc243065227" w:history="1">
+          <w:hyperlink w:anchor="_Toc243069362" w:history="1">
             <w:r>
               <w:rPr>
                 <w:rStyle w:val="Collegamentoipertestuale"/>
@@ -304,7 +304,7 @@
               <w:rPr>
                 <w:noProof/>
               </w:rPr>
-              <w:instrText xml:space="preserve"> PAGEREF _Toc243065227 \h </w:instrText>
+              <w:instrText xml:space="preserve"> PAGEREF _Toc243069362 \h </w:instrText>
             </w:r>
             <w:r>
               <w:rPr>
@@ -341,7 +341,7 @@
               <w:noProof/>
             </w:rPr>
           </w:pPr>
-          <w:hyperlink w:anchor="_Toc243065228" w:history="1">
+          <w:hyperlink w:anchor="_Toc243069363" w:history="1">
             <w:r>
               <w:rPr>
                 <w:rStyle w:val="Collegamentoipertestuale"/>
@@ -365,7 +365,7 @@
               <w:rPr>
                 <w:noProof/>
               </w:rPr>
-              <w:instrText xml:space="preserve"> PAGEREF _Toc243065228 \h </w:instrText>
+              <w:instrText xml:space="preserve"> PAGEREF _Toc243069363 \h </w:instrText>
             </w:r>
             <w:r>
               <w:rPr>
@@ -402,7 +402,7 @@
               <w:noProof/>
             </w:rPr>
           </w:pPr>
-          <w:hyperlink w:anchor="_Toc243065229" w:history="1">
+          <w:hyperlink w:anchor="_Toc243069364" w:history="1">
             <w:r>
               <w:rPr>
                 <w:rStyle w:val="Collegamentoipertestuale"/>
@@ -426,7 +426,7 @@
               <w:rPr>
                 <w:noProof/>
               </w:rPr>
-              <w:instrText xml:space="preserve"> PAGEREF _Toc243065229 \h </w:instrText>
+              <w:instrText xml:space="preserve"> PAGEREF _Toc243069364 \h </w:instrText>
             </w:r>
             <w:r>
               <w:rPr>
@@ -463,7 +463,7 @@
               <w:noProof/>
             </w:rPr>
           </w:pPr>
-          <w:hyperlink w:anchor="_Toc243065230" w:history="1">
+          <w:hyperlink w:anchor="_Toc243069365" w:history="1">
             <w:r>
               <w:rPr>
                 <w:rStyle w:val="Collegamentoipertestuale"/>
@@ -487,7 +487,7 @@
               <w:rPr>
                 <w:noProof/>
               </w:rPr>
-              <w:instrText xml:space="preserve"> PAGEREF _Toc243065230 \h </w:instrText>
+              <w:instrText xml:space="preserve"> PAGEREF _Toc243069365 \h </w:instrText>
             </w:r>
             <w:r>
               <w:rPr>
@@ -524,7 +524,7 @@
               <w:noProof/>
             </w:rPr>
           </w:pPr>
-          <w:hyperlink w:anchor="_Toc243065231" w:history="1">
+          <w:hyperlink w:anchor="_Toc243069366" w:history="1">
             <w:r>
               <w:rPr>
                 <w:rStyle w:val="Collegamentoipertestuale"/>
@@ -548,7 +548,7 @@
               <w:rPr>
                 <w:noProof/>
               </w:rPr>
-              <w:instrText xml:space="preserve"> PAGEREF _Toc243065231 \h </w:instrText>
+              <w:instrText xml:space="preserve"> PAGEREF _Toc243069366 \h </w:instrText>
             </w:r>
             <w:r>
               <w:rPr>
@@ -585,7 +585,7 @@
               <w:noProof/>
             </w:rPr>
           </w:pPr>
-          <w:hyperlink w:anchor="_Toc243065232" w:history="1">
+          <w:hyperlink w:anchor="_Toc243069367" w:history="1">
             <w:r>
               <w:rPr>
                 <w:rStyle w:val="Collegamentoipertestuale"/>
@@ -609,7 +609,7 @@
               <w:rPr>
                 <w:noProof/>
               </w:rPr>
-              <w:instrText xml:space="preserve"> PAGEREF _Toc243065232 \h </w:instrText>
+              <w:instrText xml:space="preserve"> PAGEREF _Toc243069367 \h </w:instrText>
             </w:r>
             <w:r>
               <w:rPr>
@@ -646,7 +646,7 @@
               <w:noProof/>
             </w:rPr>
           </w:pPr>
-          <w:hyperlink w:anchor="_Toc243065233" w:history="1">
+          <w:hyperlink w:anchor="_Toc243069368" w:history="1">
             <w:r>
               <w:rPr>
                 <w:rStyle w:val="Collegamentoipertestuale"/>
@@ -670,7 +670,7 @@
               <w:rPr>
                 <w:noProof/>
               </w:rPr>
-              <w:instrText xml:space="preserve"> PAGEREF _Toc243065233 \h </w:instrText>
+              <w:instrText xml:space="preserve"> PAGEREF _Toc243069368 \h </w:instrText>
             </w:r>
             <w:r>
               <w:rPr>
@@ -707,7 +707,7 @@
               <w:noProof/>
             </w:rPr>
           </w:pPr>
-          <w:hyperlink w:anchor="_Toc243065234" w:history="1">
+          <w:hyperlink w:anchor="_Toc243069369" w:history="1">
             <w:r>
               <w:rPr>
                 <w:rStyle w:val="Collegamentoipertestuale"/>
@@ -731,7 +731,7 @@
               <w:rPr>
                 <w:noProof/>
               </w:rPr>
-              <w:instrText xml:space="preserve"> PAGEREF _Toc243065234 \h </w:instrText>
+              <w:instrText xml:space="preserve"> PAGEREF _Toc243069369 \h </w:instrText>
             </w:r>
             <w:r>
               <w:rPr>
@@ -768,7 +768,7 @@
               <w:noProof/>
             </w:rPr>
           </w:pPr>
-          <w:hyperlink w:anchor="_Toc243065235" w:history="1">
+          <w:hyperlink w:anchor="_Toc243069370" w:history="1">
             <w:r>
               <w:rPr>
                 <w:rStyle w:val="Collegamentoipertestuale"/>
@@ -792,7 +792,7 @@
               <w:rPr>
                 <w:noProof/>
               </w:rPr>
-              <w:instrText xml:space="preserve"> PAGEREF _Toc243065235 \h </w:instrText>
+              <w:instrText xml:space="preserve"> PAGEREF _Toc243069370 \h </w:instrText>
             </w:r>
             <w:r>
               <w:rPr>
@@ -829,7 +829,7 @@
               <w:noProof/>
             </w:rPr>
           </w:pPr>
-          <w:hyperlink w:anchor="_Toc243065236" w:history="1">
+          <w:hyperlink w:anchor="_Toc243069371" w:history="1">
             <w:r>
               <w:rPr>
                 <w:rStyle w:val="Collegamentoipertestuale"/>
@@ -853,7 +853,7 @@
               <w:rPr>
                 <w:noProof/>
               </w:rPr>
-              <w:instrText xml:space="preserve"> PAGEREF _Toc243065236 \h </w:instrText>
+              <w:instrText xml:space="preserve"> PAGEREF _Toc243069371 \h </w:instrText>
             </w:r>
             <w:r>
               <w:rPr>
@@ -890,7 +890,7 @@
               <w:noProof/>
             </w:rPr>
           </w:pPr>
-          <w:hyperlink w:anchor="_Toc243065237" w:history="1">
+          <w:hyperlink w:anchor="_Toc243069372" w:history="1">
             <w:r>
               <w:rPr>
                 <w:rStyle w:val="Collegamentoipertestuale"/>
@@ -914,7 +914,7 @@
               <w:rPr>
                 <w:noProof/>
               </w:rPr>
-              <w:instrText xml:space="preserve"> PAGEREF _Toc243065237 \h </w:instrText>
+              <w:instrText xml:space="preserve"> PAGEREF _Toc243069372 \h </w:instrText>
             </w:r>
             <w:r>
               <w:rPr>
@@ -951,7 +951,7 @@
               <w:noProof/>
             </w:rPr>
           </w:pPr>
-          <w:hyperlink w:anchor="_Toc243065238" w:history="1">
+          <w:hyperlink w:anchor="_Toc243069373" w:history="1">
             <w:r>
               <w:rPr>
                 <w:rStyle w:val="Collegamentoipertestuale"/>
@@ -975,7 +975,7 @@
               <w:rPr>
                 <w:noProof/>
               </w:rPr>
-              <w:instrText xml:space="preserve"> PAGEREF _Toc243065238 \h </w:instrText>
+              <w:instrText xml:space="preserve"> PAGEREF _Toc243069373 \h </w:instrText>
             </w:r>
             <w:r>
               <w:rPr>
@@ -1012,7 +1012,7 @@
               <w:noProof/>
             </w:rPr>
           </w:pPr>
-          <w:hyperlink w:anchor="_Toc243065239" w:history="1">
+          <w:hyperlink w:anchor="_Toc243069374" w:history="1">
             <w:r>
               <w:rPr>
                 <w:rStyle w:val="Collegamentoipertestuale"/>
@@ -1036,7 +1036,7 @@
               <w:rPr>
                 <w:noProof/>
               </w:rPr>
-              <w:instrText xml:space="preserve"> PAGEREF _Toc243065239 \h </w:instrText>
+              <w:instrText xml:space="preserve"> PAGEREF _Toc243069374 \h </w:instrText>
             </w:r>
             <w:r>
               <w:rPr>
@@ -1073,7 +1073,7 @@
               <w:noProof/>
             </w:rPr>
           </w:pPr>
-          <w:hyperlink w:anchor="_Toc243065240" w:history="1">
+          <w:hyperlink w:anchor="_Toc243069375" w:history="1">
             <w:r>
               <w:rPr>
                 <w:rStyle w:val="Collegamentoipertestuale"/>
@@ -1097,7 +1097,7 @@
               <w:rPr>
                 <w:noProof/>
               </w:rPr>
-              <w:instrText xml:space="preserve"> PAGEREF _Toc243065240 \h </w:instrText>
+              <w:instrText xml:space="preserve"> PAGEREF _Toc243069375 \h </w:instrText>
             </w:r>
             <w:r>
               <w:rPr>
@@ -1134,7 +1134,7 @@
               <w:noProof/>
             </w:rPr>
           </w:pPr>
-          <w:hyperlink w:anchor="_Toc243065241" w:history="1">
+          <w:hyperlink w:anchor="_Toc243069376" w:history="1">
             <w:r>
               <w:rPr>
                 <w:rStyle w:val="Collegamentoipertestuale"/>
@@ -1158,7 +1158,7 @@
               <w:rPr>
                 <w:noProof/>
               </w:rPr>
-              <w:instrText xml:space="preserve"> PAGEREF _Toc243065241 \h </w:instrText>
+              <w:instrText xml:space="preserve"> PAGEREF _Toc243069376 \h </w:instrText>
             </w:r>
             <w:r>
               <w:rPr>
@@ -1195,7 +1195,7 @@
               <w:noProof/>
             </w:rPr>
           </w:pPr>
-          <w:hyperlink w:anchor="_Toc243065242" w:history="1">
+          <w:hyperlink w:anchor="_Toc243069377" w:history="1">
             <w:r>
               <w:rPr>
                 <w:rStyle w:val="Collegamentoipertestuale"/>
@@ -1219,7 +1219,7 @@
               <w:rPr>
                 <w:noProof/>
               </w:rPr>
-              <w:instrText xml:space="preserve"> PAGEREF _Toc243065242 \h </w:instrText>
+              <w:instrText xml:space="preserve"> PAGEREF _Toc243069377 \h </w:instrText>
             </w:r>
             <w:r>
               <w:rPr>
@@ -1256,7 +1256,7 @@
               <w:noProof/>
             </w:rPr>
           </w:pPr>
-          <w:hyperlink w:anchor="_Toc243065243" w:history="1">
+          <w:hyperlink w:anchor="_Toc243069378" w:history="1">
             <w:r>
               <w:rPr>
                 <w:rStyle w:val="Collegamentoipertestuale"/>
@@ -1280,7 +1280,7 @@
               <w:rPr>
                 <w:noProof/>
               </w:rPr>
-              <w:instrText xml:space="preserve"> PAGEREF _Toc243065243 \h </w:instrText>
+              <w:instrText xml:space="preserve"> PAGEREF _Toc243069378 \h </w:instrText>
             </w:r>
             <w:r>
               <w:rPr>
@@ -1317,7 +1317,7 @@
               <w:noProof/>
             </w:rPr>
           </w:pPr>
-          <w:hyperlink w:anchor="_Toc243065244" w:history="1">
+          <w:hyperlink w:anchor="_Toc243069379" w:history="1">
             <w:r>
               <w:rPr>
                 <w:rStyle w:val="Collegamentoipertestuale"/>
@@ -1341,7 +1341,7 @@
               <w:rPr>
                 <w:noProof/>
               </w:rPr>
-              <w:instrText xml:space="preserve"> PAGEREF _Toc243065244 \h </w:instrText>
+              <w:instrText xml:space="preserve"> PAGEREF _Toc243069379 \h </w:instrText>
             </w:r>
             <w:r>
               <w:rPr>
@@ -1378,7 +1378,7 @@
               <w:noProof/>
             </w:rPr>
           </w:pPr>
-          <w:hyperlink w:anchor="_Toc243065245" w:history="1">
+          <w:hyperlink w:anchor="_Toc243069380" w:history="1">
             <w:r>
               <w:rPr>
                 <w:rStyle w:val="Collegamentoipertestuale"/>
@@ -1402,7 +1402,7 @@
               <w:rPr>
                 <w:noProof/>
               </w:rPr>
-              <w:instrText xml:space="preserve"> PAGEREF _Toc243065245 \h </w:instrText>
+              <w:instrText xml:space="preserve"> PAGEREF _Toc243069380 \h </w:instrText>
             </w:r>
             <w:r>
               <w:rPr>
@@ -1439,7 +1439,7 @@
               <w:noProof/>
             </w:rPr>
           </w:pPr>
-          <w:hyperlink w:anchor="_Toc243065246" w:history="1">
+          <w:hyperlink w:anchor="_Toc243069381" w:history="1">
             <w:r>
               <w:rPr>
                 <w:rStyle w:val="Collegamentoipertestuale"/>
@@ -1463,7 +1463,7 @@
               <w:rPr>
                 <w:noProof/>
               </w:rPr>
-              <w:instrText xml:space="preserve"> PAGEREF _Toc243065246 \h </w:instrText>
+              <w:instrText xml:space="preserve"> PAGEREF _Toc243069381 \h </w:instrText>
             </w:r>
             <w:r>
               <w:rPr>
@@ -1500,13 +1500,13 @@
               <w:noProof/>
             </w:rPr>
           </w:pPr>
-          <w:hyperlink w:anchor="_Toc243065247" w:history="1">
+          <w:hyperlink w:anchor="_Toc243069382" w:history="1">
             <w:r>
               <w:rPr>
                 <w:rStyle w:val="Collegamentoipertestuale"/>
                 <w:noProof/>
               </w:rPr>
-              <w:t>6.3 Ruoli</w:t>
+              <w:t>6.3 Release 1.0.0 (pubblicata il 16 ottobre 2026)</w:t>
             </w:r>
             <w:r>
               <w:rPr>
@@ -1524,7 +1524,7 @@
               <w:rPr>
                 <w:noProof/>
               </w:rPr>
-              <w:instrText xml:space="preserve"> PAGEREF _Toc243065247 \h </w:instrText>
+              <w:instrText xml:space="preserve"> PAGEREF _Toc243069382 \h </w:instrText>
             </w:r>
             <w:r>
               <w:rPr>
@@ -1542,6 +1542,67 @@
                 <w:noProof/>
               </w:rPr>
               <w:t>11</w:t>
+            </w:r>
+            <w:r>
+              <w:rPr>
+                <w:noProof/>
+              </w:rPr>
+              <w:fldChar w:fldCharType="end"/>
+            </w:r>
+          </w:hyperlink>
+        </w:p>
+        <w:p>
+          <w:pPr>
+            <w:pStyle w:val="Sommario2"/>
+            <w:tabs>
+              <w:tab w:val="right" w:leader="dot" w:pos="9628"/>
+            </w:tabs>
+            <w:rPr>
+              <w:noProof/>
+            </w:rPr>
+          </w:pPr>
+          <w:hyperlink w:anchor="_Toc243069383" w:history="1">
+            <w:r>
+              <w:rPr>
+                <w:rStyle w:val="Collegamentoipertestuale"/>
+                <w:noProof/>
+              </w:rPr>
+              <w:t>6.4 Ruoli</w:t>
+            </w:r>
+            <w:r>
+              <w:rPr>
+                <w:noProof/>
+              </w:rPr>
+              <w:tab/>
+            </w:r>
+            <w:r>
+              <w:rPr>
+                <w:noProof/>
+              </w:rPr>
+              <w:fldChar w:fldCharType="begin"/>
+            </w:r>
+            <w:r>
+              <w:rPr>
+                <w:noProof/>
+              </w:rPr>
+              <w:instrText xml:space="preserve"> PAGEREF _Toc243069383 \h </w:instrText>
+            </w:r>
+            <w:r>
+              <w:rPr>
+                <w:noProof/>
+              </w:rPr>
+            </w:r>
+            <w:r>
+              <w:rPr>
+                <w:noProof/>
+              </w:rPr>
+              <w:fldChar w:fldCharType="separate"/>
+            </w:r>
+            <w:r>
+              <w:rPr>
+                <w:noProof/>
+              </w:rPr>
+              <w:t>12</w:t>
             </w:r>
             <w:r>
               <w:rPr>
@@ -1561,7 +1622,7 @@
               <w:noProof/>
             </w:rPr>
           </w:pPr>
-          <w:hyperlink w:anchor="_Toc243065248" w:history="1">
+          <w:hyperlink w:anchor="_Toc243069384" w:history="1">
             <w:r>
               <w:rPr>
                 <w:rStyle w:val="Collegamentoipertestuale"/>
@@ -1585,7 +1646,7 @@
               <w:rPr>
                 <w:noProof/>
               </w:rPr>
-              <w:instrText xml:space="preserve"> PAGEREF _Toc243065248 \h </w:instrText>
+              <w:instrText xml:space="preserve"> PAGEREF _Toc243069384 \h </w:instrText>
             </w:r>
             <w:r>
               <w:rPr>
@@ -1622,7 +1683,7 @@
               <w:noProof/>
             </w:rPr>
           </w:pPr>
-          <w:hyperlink w:anchor="_Toc243065249" w:history="1">
+          <w:hyperlink w:anchor="_Toc243069385" w:history="1">
             <w:r>
               <w:rPr>
                 <w:rStyle w:val="Collegamentoipertestuale"/>
@@ -1646,7 +1707,7 @@
               <w:rPr>
                 <w:noProof/>
               </w:rPr>
-              <w:instrText xml:space="preserve"> PAGEREF _Toc243065249 \h </w:instrText>
+              <w:instrText xml:space="preserve"> PAGEREF _Toc243069385 \h </w:instrText>
             </w:r>
             <w:r>
               <w:rPr>
@@ -1663,7 +1724,7 @@
               <w:rPr>
                 <w:noProof/>
               </w:rPr>
-              <w:t>12</w:t>
+              <w:t>13</w:t>
             </w:r>
             <w:r>
               <w:rPr>
@@ -1683,7 +1744,7 @@
               <w:noProof/>
             </w:rPr>
           </w:pPr>
-          <w:hyperlink w:anchor="_Toc243065250" w:history="1">
+          <w:hyperlink w:anchor="_Toc243069386" w:history="1">
             <w:r>
               <w:rPr>
                 <w:rStyle w:val="Collegamentoipertestuale"/>
@@ -1707,7 +1768,7 @@
               <w:rPr>
                 <w:noProof/>
               </w:rPr>
-              <w:instrText xml:space="preserve"> PAGEREF _Toc243065250 \h </w:instrText>
+              <w:instrText xml:space="preserve"> PAGEREF _Toc243069386 \h </w:instrText>
             </w:r>
             <w:r>
               <w:rPr>
@@ -1724,7 +1785,7 @@
               <w:rPr>
                 <w:noProof/>
               </w:rPr>
-              <w:t>12</w:t>
+              <w:t>13</w:t>
             </w:r>
             <w:r>
               <w:rPr>
@@ -1750,7 +1811,7 @@
       <w:pPr>
         <w:pStyle w:val="Titolo1"/>
       </w:pPr>
-      <w:bookmarkStart w:id="0" w:name="_Toc243065225"/>
+      <w:bookmarkStart w:id="0" w:name="_Toc243069360"/>
       <w:r>
         <w:t>1. In breve</w:t>
       </w:r>
@@ -1921,7 +1982,7 @@
       <w:pPr>
         <w:pStyle w:val="Titolo1"/>
       </w:pPr>
-      <w:bookmarkStart w:id="1" w:name="_Toc243065226"/>
+      <w:bookmarkStart w:id="1" w:name="_Toc243069361"/>
       <w:r>
         <w:t>2. Nuovo marchio</w:t>
       </w:r>
@@ -1931,7 +1992,7 @@
       <w:pPr>
         <w:pStyle w:val="Titolo2"/>
       </w:pPr>
-      <w:bookmarkStart w:id="2" w:name="_Toc243065227"/>
+      <w:bookmarkStart w:id="2" w:name="_Toc243069362"/>
       <w:r>
         <w:t>2.1 Nomi e identificativi</w:t>
       </w:r>
@@ -2432,7 +2493,7 @@
           </w:tcPr>
           <w:p>
             <w:r>
-              <w:t>pdfz-release.jks, alias pdfz (da creare, mai nel repository)</w:t>
+              <w:t>pdfz-release.jks, alias pdfz, RSA 4096, valida fino al 2054; creata il 16/10/2026 e conservata fuori dal repository (C:\Dev\PDFz-chiave-android)</w:t>
             </w:r>
           </w:p>
         </w:tc>
@@ -2477,7 +2538,7 @@
       <w:pPr>
         <w:pStyle w:val="Titolo2"/>
       </w:pPr>
-      <w:bookmarkStart w:id="3" w:name="_Toc243065228"/>
+      <w:bookmarkStart w:id="3" w:name="_Toc243069363"/>
       <w:r>
         <w:t>2.2 Colori</w:t>
       </w:r>
@@ -2872,7 +2933,7 @@
       <w:pPr>
         <w:pStyle w:val="Titolo2"/>
       </w:pPr>
-      <w:bookmarkStart w:id="4" w:name="_Toc243065229"/>
+      <w:bookmarkStart w:id="4" w:name="_Toc243069364"/>
       <w:r>
         <w:t>2.3 Icona in uso: 17 «Foglio oro» (serie 4)</w:t>
       </w:r>
@@ -2906,7 +2967,7 @@
           <w:noProof/>
         </w:rPr>
         <w:drawing>
-          <wp:inline distT="0" distB="0" distL="0" distR="0" wp14:anchorId="119740FC" wp14:editId="72A4D046">
+          <wp:inline distT="0" distB="0" distL="0" distR="0" wp14:anchorId="5551E4C6" wp14:editId="41C266A8">
             <wp:extent cx="5334000" cy="5895975"/>
             <wp:effectExtent l="0" t="0" r="0" b="0"/>
             <wp:docPr id="2" name="Immagine 2"/>
@@ -3326,7 +3387,7 @@
       <w:pPr>
         <w:pStyle w:val="Titolo2"/>
       </w:pPr>
-      <w:bookmarkStart w:id="5" w:name="_Toc243065230"/>
+      <w:bookmarkStart w:id="5" w:name="_Toc243069365"/>
       <w:r>
         <w:t>2.4 Serie 3, non scelta (la 11 è diventata la serie 4)</w:t>
       </w:r>
@@ -3350,7 +3411,7 @@
           <w:noProof/>
         </w:rPr>
         <w:drawing>
-          <wp:inline distT="0" distB="0" distL="0" distR="0" wp14:anchorId="37D6FE46" wp14:editId="4DE58C2F">
+          <wp:inline distT="0" distB="0" distL="0" distR="0" wp14:anchorId="59E915FE" wp14:editId="5DFD9EBE">
             <wp:extent cx="5905500" cy="4133850"/>
             <wp:effectExtent l="0" t="0" r="0" b="0"/>
             <wp:docPr id="3" name="Immagine 3"/>
@@ -4036,7 +4097,7 @@
       <w:pPr>
         <w:pStyle w:val="Titolo2"/>
       </w:pPr>
-      <w:bookmarkStart w:id="6" w:name="_Toc243065231"/>
+      <w:bookmarkStart w:id="6" w:name="_Toc243069366"/>
       <w:r>
         <w:t>2.5 Serie 2, non scelta</w:t>
       </w:r>
@@ -4060,7 +4121,7 @@
           <w:noProof/>
         </w:rPr>
         <w:drawing>
-          <wp:inline distT="0" distB="0" distL="0" distR="0" wp14:anchorId="7A3FCF39" wp14:editId="7CFDA9FA">
+          <wp:inline distT="0" distB="0" distL="0" distR="0" wp14:anchorId="65BFC752" wp14:editId="094E8F00">
             <wp:extent cx="5905500" cy="4133850"/>
             <wp:effectExtent l="0" t="0" r="0" b="0"/>
             <wp:docPr id="4" name="Immagine 4"/>
@@ -4780,7 +4841,7 @@
       <w:pPr>
         <w:pStyle w:val="Titolo2"/>
       </w:pPr>
-      <w:bookmarkStart w:id="7" w:name="_Toc243065232"/>
+      <w:bookmarkStart w:id="7" w:name="_Toc243069367"/>
       <w:r>
         <w:t>2.6 Serie 1, scartata</w:t>
       </w:r>
@@ -4804,7 +4865,7 @@
           <w:noProof/>
         </w:rPr>
         <w:drawing>
-          <wp:inline distT="0" distB="0" distL="0" distR="0" wp14:anchorId="2A6EC7CB" wp14:editId="76F386D7">
+          <wp:inline distT="0" distB="0" distL="0" distR="0" wp14:anchorId="25D0B04B" wp14:editId="5207F70D">
             <wp:extent cx="4000500" cy="2800350"/>
             <wp:effectExtent l="0" t="0" r="0" b="0"/>
             <wp:docPr id="5" name="Immagine 5"/>
@@ -4863,7 +4924,7 @@
       <w:pPr>
         <w:pStyle w:val="Titolo2"/>
       </w:pPr>
-      <w:bookmarkStart w:id="8" w:name="_Toc243065233"/>
+      <w:bookmarkStart w:id="8" w:name="_Toc243069368"/>
       <w:r>
         <w:t>2.7 Verifica dei marchi registrati</w:t>
       </w:r>
@@ -5115,7 +5176,7 @@
       <w:pPr>
         <w:pStyle w:val="Titolo1"/>
       </w:pPr>
-      <w:bookmarkStart w:id="9" w:name="_Toc243065234"/>
+      <w:bookmarkStart w:id="9" w:name="_Toc243069369"/>
       <w:r>
         <w:t>3. Temi colore</w:t>
       </w:r>
@@ -5149,7 +5210,7 @@
           <w:noProof/>
         </w:rPr>
         <w:drawing>
-          <wp:inline distT="0" distB="0" distL="0" distR="0" wp14:anchorId="7788ECF9" wp14:editId="5AF80ADC">
+          <wp:inline distT="0" distB="0" distL="0" distR="0" wp14:anchorId="169D8458" wp14:editId="33EAD68C">
             <wp:extent cx="4572000" cy="3429000"/>
             <wp:effectExtent l="0" t="0" r="0" b="0"/>
             <wp:docPr id="6" name="Immagine 6"/>
@@ -5859,7 +5920,7 @@
       <w:pPr>
         <w:pStyle w:val="Titolo1"/>
       </w:pPr>
-      <w:bookmarkStart w:id="10" w:name="_Toc243065235"/>
+      <w:bookmarkStart w:id="10" w:name="_Toc243069370"/>
       <w:r>
         <w:t>4. Correzione: avvisi «come JavaScript»</w:t>
       </w:r>
@@ -5869,7 +5930,7 @@
       <w:pPr>
         <w:pStyle w:val="Titolo2"/>
       </w:pPr>
-      <w:bookmarkStart w:id="11" w:name="_Toc243065236"/>
+      <w:bookmarkStart w:id="11" w:name="_Toc243069371"/>
       <w:r>
         <w:t>4.1 Il problema</w:t>
       </w:r>
@@ -6272,7 +6333,7 @@
       <w:pPr>
         <w:pStyle w:val="Titolo2"/>
       </w:pPr>
-      <w:bookmarkStart w:id="12" w:name="_Toc243065237"/>
+      <w:bookmarkStart w:id="12" w:name="_Toc243069372"/>
       <w:r>
         <w:t>4.2 La soluzione</w:t>
       </w:r>
@@ -6405,7 +6466,7 @@
           <w:noProof/>
         </w:rPr>
         <w:drawing>
-          <wp:inline distT="0" distB="0" distL="0" distR="0" wp14:anchorId="78C5843E" wp14:editId="4C6F350F">
+          <wp:inline distT="0" distB="0" distL="0" distR="0" wp14:anchorId="533583A3" wp14:editId="4707E8B2">
             <wp:extent cx="4572000" cy="3429000"/>
             <wp:effectExtent l="0" t="0" r="0" b="0"/>
             <wp:docPr id="7" name="Immagine 7"/>
@@ -6464,7 +6525,7 @@
       <w:pPr>
         <w:pStyle w:val="Titolo2"/>
       </w:pPr>
-      <w:bookmarkStart w:id="13" w:name="_Toc243065238"/>
+      <w:bookmarkStart w:id="13" w:name="_Toc243069373"/>
       <w:r>
         <w:t>4.3 Verifiche</w:t>
       </w:r>
@@ -6511,7 +6572,7 @@
       <w:pPr>
         <w:pStyle w:val="Titolo1"/>
       </w:pPr>
-      <w:bookmarkStart w:id="14" w:name="_Toc243065239"/>
+      <w:bookmarkStart w:id="14" w:name="_Toc243069374"/>
       <w:r>
         <w:t>5. Decisioni</w:t>
       </w:r>
@@ -6529,7 +6590,7 @@
       <w:pPr>
         <w:pStyle w:val="Titolo2"/>
       </w:pPr>
-      <w:bookmarkStart w:id="15" w:name="_Toc243065240"/>
+      <w:bookmarkStart w:id="15" w:name="_Toc243069375"/>
       <w:r>
         <w:t>5.1 Canale degli aggiornamenti</w:t>
       </w:r>
@@ -7036,7 +7097,7 @@
       <w:pPr>
         <w:pStyle w:val="Titolo2"/>
       </w:pPr>
-      <w:bookmarkStart w:id="16" w:name="_Toc243065241"/>
+      <w:bookmarkStart w:id="16" w:name="_Toc243069376"/>
       <w:r>
         <w:t>5.2 Storia del repository</w:t>
       </w:r>
@@ -7543,7 +7604,7 @@
       <w:pPr>
         <w:pStyle w:val="Titolo2"/>
       </w:pPr>
-      <w:bookmarkStart w:id="17" w:name="_Toc243065242"/>
+      <w:bookmarkStart w:id="17" w:name="_Toc243069377"/>
       <w:r>
         <w:t>5.3 Identificativi del prodotto</w:t>
       </w:r>
@@ -8043,7 +8104,7 @@
       <w:pPr>
         <w:pStyle w:val="Titolo2"/>
       </w:pPr>
-      <w:bookmarkStart w:id="18" w:name="_Toc243065243"/>
+      <w:bookmarkStart w:id="18" w:name="_Toc243069378"/>
       <w:r>
         <w:t>5.4 Avvisi e domande</w:t>
       </w:r>
@@ -8550,7 +8611,7 @@
       <w:pPr>
         <w:pStyle w:val="Titolo1"/>
       </w:pPr>
-      <w:bookmarkStart w:id="19" w:name="_Toc243065244"/>
+      <w:bookmarkStart w:id="19" w:name="_Toc243069379"/>
       <w:r>
         <w:t>6. Come si lavora</w:t>
       </w:r>
@@ -8560,7 +8621,7 @@
       <w:pPr>
         <w:pStyle w:val="Titolo2"/>
       </w:pPr>
-      <w:bookmarkStart w:id="20" w:name="_Toc243065245"/>
+      <w:bookmarkStart w:id="20" w:name="_Toc243069380"/>
       <w:r>
         <w:t>6.1 Comandi</w:t>
       </w:r>
@@ -8630,7 +8691,7 @@
       <w:pPr>
         <w:pStyle w:val="Titolo2"/>
       </w:pPr>
-      <w:bookmarkStart w:id="21" w:name="_Toc243065246"/>
+      <w:bookmarkStart w:id="21" w:name="_Toc243069381"/>
       <w:r>
         <w:t>6.2 Pubblicare una versione</w:t>
       </w:r>
@@ -8702,7 +8763,7 @@
           <w:sz w:val="19"/>
           <w:szCs w:val="19"/>
         </w:rPr>
-        <w:t>git tag 1.0.1</w:t>
+        <w:t>git tag v1.0.1</w:t>
       </w:r>
       <w:r>
         <w:t xml:space="preserve"> e </w:t>
@@ -8713,10 +8774,32 @@
           <w:sz w:val="19"/>
           <w:szCs w:val="19"/>
         </w:rPr>
-        <w:t>git push origin 1.0.1</w:t>
-      </w:r>
-      <w:r>
-        <w:t>.</w:t>
+        <w:t>git push origin v1.0.1</w:t>
+      </w:r>
+      <w:r>
+        <w:t xml:space="preserve"> (solo il tag nuovo: mai </w:t>
+      </w:r>
+      <w:r>
+        <w:rPr>
+          <w:rFonts w:ascii="Consolas" w:eastAsia="Consolas" w:hAnsi="Consolas" w:cs="Consolas"/>
+          <w:sz w:val="19"/>
+          <w:szCs w:val="19"/>
+        </w:rPr>
+        <w:t>git push --tags</w:t>
+      </w:r>
+      <w:r>
+        <w:t xml:space="preserve">, in locale c'è un vecchio tag </w:t>
+      </w:r>
+      <w:r>
+        <w:rPr>
+          <w:rFonts w:ascii="Consolas" w:eastAsia="Consolas" w:hAnsi="Consolas" w:cs="Consolas"/>
+          <w:sz w:val="19"/>
+          <w:szCs w:val="19"/>
+        </w:rPr>
+        <w:t>1.0.0</w:t>
+      </w:r>
+      <w:r>
+        <w:t xml:space="preserve"> della storia precedente).</w:t>
       </w:r>
     </w:p>
     <w:p>
@@ -8736,11 +8819,738 @@
       <w:pPr>
         <w:pStyle w:val="Titolo2"/>
       </w:pPr>
-      <w:bookmarkStart w:id="22" w:name="_Toc243065247"/>
-      <w:r>
-        <w:t>6.3 Ruoli</w:t>
+      <w:bookmarkStart w:id="22" w:name="_Toc243069382"/>
+      <w:r>
+        <w:t>6.3 Release 1.0.0 (pubblicata il 16 ottobre 2026)</w:t>
       </w:r>
       <w:bookmarkEnd w:id="22"/>
+    </w:p>
+    <w:p>
+      <w:pPr>
+        <w:spacing w:after="120"/>
+      </w:pPr>
+      <w:r>
+        <w:t xml:space="preserve">Tag </w:t>
+      </w:r>
+      <w:r>
+        <w:rPr>
+          <w:rFonts w:ascii="Consolas" w:eastAsia="Consolas" w:hAnsi="Consolas" w:cs="Consolas"/>
+          <w:sz w:val="19"/>
+          <w:szCs w:val="19"/>
+        </w:rPr>
+        <w:t>v1.0.0</w:t>
+      </w:r>
+      <w:r>
+        <w:t>: la pipeline ha compilato e pubblicato tutto in 12 minuti. Pagina della release: https://github.com/akito996/pdfz/releases/tag/v1.0.0 (segnata come «Latest»).</w:t>
+      </w:r>
+    </w:p>
+    <w:tbl>
+      <w:tblPr>
+        <w:tblW w:w="9638" w:type="dxa"/>
+        <w:tblBorders>
+          <w:top w:val="single" w:sz="4" w:space="0" w:color="auto"/>
+          <w:left w:val="single" w:sz="4" w:space="0" w:color="auto"/>
+          <w:bottom w:val="single" w:sz="4" w:space="0" w:color="auto"/>
+          <w:right w:val="single" w:sz="4" w:space="0" w:color="auto"/>
+          <w:insideH w:val="single" w:sz="4" w:space="0" w:color="auto"/>
+          <w:insideV w:val="single" w:sz="4" w:space="0" w:color="auto"/>
+        </w:tblBorders>
+        <w:tblLook w:val="04A0" w:firstRow="1" w:lastRow="0" w:firstColumn="1" w:lastColumn="0" w:noHBand="0" w:noVBand="1"/>
+      </w:tblPr>
+      <w:tblGrid>
+        <w:gridCol w:w="1052"/>
+        <w:gridCol w:w="1742"/>
+        <w:gridCol w:w="1240"/>
+        <w:gridCol w:w="5983"/>
+      </w:tblGrid>
+      <w:tr>
+        <w:trPr>
+          <w:tblHeader/>
+        </w:trPr>
+        <w:tc>
+          <w:tcPr>
+            <w:tcW w:w="1542" w:type="dxa"/>
+            <w:tcBorders>
+              <w:top w:val="single" w:sz="4" w:space="0" w:color="D4CEC7"/>
+              <w:left w:val="single" w:sz="4" w:space="0" w:color="D4CEC7"/>
+              <w:bottom w:val="single" w:sz="4" w:space="0" w:color="D4CEC7"/>
+              <w:right w:val="single" w:sz="4" w:space="0" w:color="D4CEC7"/>
+            </w:tcBorders>
+            <w:shd w:val="clear" w:color="auto" w:fill="B3122B"/>
+            <w:tcMar>
+              <w:top w:w="60" w:type="dxa"/>
+              <w:left w:w="100" w:type="dxa"/>
+              <w:bottom w:w="60" w:type="dxa"/>
+              <w:right w:w="100" w:type="dxa"/>
+            </w:tcMar>
+          </w:tcPr>
+          <w:p>
+            <w:r>
+              <w:rPr>
+                <w:b/>
+                <w:bCs/>
+                <w:color w:val="FFFFFF"/>
+              </w:rPr>
+              <w:t>Sistema</w:t>
+            </w:r>
+          </w:p>
+        </w:tc>
+        <w:tc>
+          <w:tcPr>
+            <w:tcW w:w="3277" w:type="dxa"/>
+            <w:tcBorders>
+              <w:top w:val="single" w:sz="4" w:space="0" w:color="D4CEC7"/>
+              <w:left w:val="single" w:sz="4" w:space="0" w:color="D4CEC7"/>
+              <w:bottom w:val="single" w:sz="4" w:space="0" w:color="D4CEC7"/>
+              <w:right w:val="single" w:sz="4" w:space="0" w:color="D4CEC7"/>
+            </w:tcBorders>
+            <w:shd w:val="clear" w:color="auto" w:fill="B3122B"/>
+            <w:tcMar>
+              <w:top w:w="60" w:type="dxa"/>
+              <w:left w:w="100" w:type="dxa"/>
+              <w:bottom w:w="60" w:type="dxa"/>
+              <w:right w:w="100" w:type="dxa"/>
+            </w:tcMar>
+          </w:tcPr>
+          <w:p>
+            <w:r>
+              <w:rPr>
+                <w:b/>
+                <w:bCs/>
+                <w:color w:val="FFFFFF"/>
+              </w:rPr>
+              <w:t>File</w:t>
+            </w:r>
+          </w:p>
+        </w:tc>
+        <w:tc>
+          <w:tcPr>
+            <w:tcW w:w="1349" w:type="dxa"/>
+            <w:tcBorders>
+              <w:top w:val="single" w:sz="4" w:space="0" w:color="D4CEC7"/>
+              <w:left w:val="single" w:sz="4" w:space="0" w:color="D4CEC7"/>
+              <w:bottom w:val="single" w:sz="4" w:space="0" w:color="D4CEC7"/>
+              <w:right w:val="single" w:sz="4" w:space="0" w:color="D4CEC7"/>
+            </w:tcBorders>
+            <w:shd w:val="clear" w:color="auto" w:fill="B3122B"/>
+            <w:tcMar>
+              <w:top w:w="60" w:type="dxa"/>
+              <w:left w:w="100" w:type="dxa"/>
+              <w:bottom w:w="60" w:type="dxa"/>
+              <w:right w:w="100" w:type="dxa"/>
+            </w:tcMar>
+          </w:tcPr>
+          <w:p>
+            <w:r>
+              <w:rPr>
+                <w:b/>
+                <w:bCs/>
+                <w:color w:val="FFFFFF"/>
+              </w:rPr>
+              <w:t>Dimensione</w:t>
+            </w:r>
+          </w:p>
+        </w:tc>
+        <w:tc>
+          <w:tcPr>
+            <w:tcW w:w="3470" w:type="dxa"/>
+            <w:tcBorders>
+              <w:top w:val="single" w:sz="4" w:space="0" w:color="D4CEC7"/>
+              <w:left w:val="single" w:sz="4" w:space="0" w:color="D4CEC7"/>
+              <w:bottom w:val="single" w:sz="4" w:space="0" w:color="D4CEC7"/>
+              <w:right w:val="single" w:sz="4" w:space="0" w:color="D4CEC7"/>
+            </w:tcBorders>
+            <w:shd w:val="clear" w:color="auto" w:fill="B3122B"/>
+            <w:tcMar>
+              <w:top w:w="60" w:type="dxa"/>
+              <w:left w:w="100" w:type="dxa"/>
+              <w:bottom w:w="60" w:type="dxa"/>
+              <w:right w:w="100" w:type="dxa"/>
+            </w:tcMar>
+          </w:tcPr>
+          <w:p>
+            <w:r>
+              <w:rPr>
+                <w:b/>
+                <w:bCs/>
+                <w:color w:val="FFFFFF"/>
+              </w:rPr>
+              <w:t>Link</w:t>
+            </w:r>
+          </w:p>
+        </w:tc>
+      </w:tr>
+      <w:tr>
+        <w:tc>
+          <w:tcPr>
+            <w:tcW w:w="1542" w:type="dxa"/>
+            <w:tcBorders>
+              <w:top w:val="single" w:sz="4" w:space="0" w:color="D4CEC7"/>
+              <w:left w:val="single" w:sz="4" w:space="0" w:color="D4CEC7"/>
+              <w:bottom w:val="single" w:sz="4" w:space="0" w:color="D4CEC7"/>
+              <w:right w:val="single" w:sz="4" w:space="0" w:color="D4CEC7"/>
+            </w:tcBorders>
+            <w:tcMar>
+              <w:top w:w="60" w:type="dxa"/>
+              <w:left w:w="100" w:type="dxa"/>
+              <w:bottom w:w="60" w:type="dxa"/>
+              <w:right w:w="100" w:type="dxa"/>
+            </w:tcMar>
+          </w:tcPr>
+          <w:p>
+            <w:r>
+              <w:t>Windows</w:t>
+            </w:r>
+          </w:p>
+        </w:tc>
+        <w:tc>
+          <w:tcPr>
+            <w:tcW w:w="3277" w:type="dxa"/>
+            <w:tcBorders>
+              <w:top w:val="single" w:sz="4" w:space="0" w:color="D4CEC7"/>
+              <w:left w:val="single" w:sz="4" w:space="0" w:color="D4CEC7"/>
+              <w:bottom w:val="single" w:sz="4" w:space="0" w:color="D4CEC7"/>
+              <w:right w:val="single" w:sz="4" w:space="0" w:color="D4CEC7"/>
+            </w:tcBorders>
+            <w:tcMar>
+              <w:top w:w="60" w:type="dxa"/>
+              <w:left w:w="100" w:type="dxa"/>
+              <w:bottom w:w="60" w:type="dxa"/>
+              <w:right w:w="100" w:type="dxa"/>
+            </w:tcMar>
+          </w:tcPr>
+          <w:p>
+            <w:r>
+              <w:t>PDFz-1.0.0-x64.msi</w:t>
+            </w:r>
+          </w:p>
+        </w:tc>
+        <w:tc>
+          <w:tcPr>
+            <w:tcW w:w="1349" w:type="dxa"/>
+            <w:tcBorders>
+              <w:top w:val="single" w:sz="4" w:space="0" w:color="D4CEC7"/>
+              <w:left w:val="single" w:sz="4" w:space="0" w:color="D4CEC7"/>
+              <w:bottom w:val="single" w:sz="4" w:space="0" w:color="D4CEC7"/>
+              <w:right w:val="single" w:sz="4" w:space="0" w:color="D4CEC7"/>
+            </w:tcBorders>
+            <w:tcMar>
+              <w:top w:w="60" w:type="dxa"/>
+              <w:left w:w="100" w:type="dxa"/>
+              <w:bottom w:w="60" w:type="dxa"/>
+              <w:right w:w="100" w:type="dxa"/>
+            </w:tcMar>
+          </w:tcPr>
+          <w:p>
+            <w:r>
+              <w:t>130 MB</w:t>
+            </w:r>
+          </w:p>
+        </w:tc>
+        <w:tc>
+          <w:tcPr>
+            <w:tcW w:w="3470" w:type="dxa"/>
+            <w:tcBorders>
+              <w:top w:val="single" w:sz="4" w:space="0" w:color="D4CEC7"/>
+              <w:left w:val="single" w:sz="4" w:space="0" w:color="D4CEC7"/>
+              <w:bottom w:val="single" w:sz="4" w:space="0" w:color="D4CEC7"/>
+              <w:right w:val="single" w:sz="4" w:space="0" w:color="D4CEC7"/>
+            </w:tcBorders>
+            <w:tcMar>
+              <w:top w:w="60" w:type="dxa"/>
+              <w:left w:w="100" w:type="dxa"/>
+              <w:bottom w:w="60" w:type="dxa"/>
+              <w:right w:w="100" w:type="dxa"/>
+            </w:tcMar>
+          </w:tcPr>
+          <w:p>
+            <w:r>
+              <w:t>https://github.com/akito996/pdfz/releases/download/v1.0.0/PDFz-1.0.0-x64.msi</w:t>
+            </w:r>
+          </w:p>
+        </w:tc>
+      </w:tr>
+      <w:tr>
+        <w:tc>
+          <w:tcPr>
+            <w:tcW w:w="1542" w:type="dxa"/>
+            <w:tcBorders>
+              <w:top w:val="single" w:sz="4" w:space="0" w:color="D4CEC7"/>
+              <w:left w:val="single" w:sz="4" w:space="0" w:color="D4CEC7"/>
+              <w:bottom w:val="single" w:sz="4" w:space="0" w:color="D4CEC7"/>
+              <w:right w:val="single" w:sz="4" w:space="0" w:color="D4CEC7"/>
+            </w:tcBorders>
+            <w:tcMar>
+              <w:top w:w="60" w:type="dxa"/>
+              <w:left w:w="100" w:type="dxa"/>
+              <w:bottom w:w="60" w:type="dxa"/>
+              <w:right w:w="100" w:type="dxa"/>
+            </w:tcMar>
+          </w:tcPr>
+          <w:p>
+            <w:r>
+              <w:t>Windows, lingue</w:t>
+            </w:r>
+          </w:p>
+        </w:tc>
+        <w:tc>
+          <w:tcPr>
+            <w:tcW w:w="3277" w:type="dxa"/>
+            <w:tcBorders>
+              <w:top w:val="single" w:sz="4" w:space="0" w:color="D4CEC7"/>
+              <w:left w:val="single" w:sz="4" w:space="0" w:color="D4CEC7"/>
+              <w:bottom w:val="single" w:sz="4" w:space="0" w:color="D4CEC7"/>
+              <w:right w:val="single" w:sz="4" w:space="0" w:color="D4CEC7"/>
+            </w:tcBorders>
+            <w:tcMar>
+              <w:top w:w="60" w:type="dxa"/>
+              <w:left w:w="100" w:type="dxa"/>
+              <w:bottom w:w="60" w:type="dxa"/>
+              <w:right w:w="100" w:type="dxa"/>
+            </w:tcMar>
+          </w:tcPr>
+          <w:p>
+            <w:r>
+              <w:t>PDFz-Lingue-it-fr-de-es-1.0.0-x64.msi · PDFz-Lingue-zh-ja-ar-ru-1.0.0-x64.msi</w:t>
+            </w:r>
+          </w:p>
+        </w:tc>
+        <w:tc>
+          <w:tcPr>
+            <w:tcW w:w="1349" w:type="dxa"/>
+            <w:tcBorders>
+              <w:top w:val="single" w:sz="4" w:space="0" w:color="D4CEC7"/>
+              <w:left w:val="single" w:sz="4" w:space="0" w:color="D4CEC7"/>
+              <w:bottom w:val="single" w:sz="4" w:space="0" w:color="D4CEC7"/>
+              <w:right w:val="single" w:sz="4" w:space="0" w:color="D4CEC7"/>
+            </w:tcBorders>
+            <w:tcMar>
+              <w:top w:w="60" w:type="dxa"/>
+              <w:left w:w="100" w:type="dxa"/>
+              <w:bottom w:w="60" w:type="dxa"/>
+              <w:right w:w="100" w:type="dxa"/>
+            </w:tcMar>
+          </w:tcPr>
+          <w:p>
+            <w:r>
+              <w:t>932 MB · 859 MB</w:t>
+            </w:r>
+          </w:p>
+        </w:tc>
+        <w:tc>
+          <w:tcPr>
+            <w:tcW w:w="3470" w:type="dxa"/>
+            <w:tcBorders>
+              <w:top w:val="single" w:sz="4" w:space="0" w:color="D4CEC7"/>
+              <w:left w:val="single" w:sz="4" w:space="0" w:color="D4CEC7"/>
+              <w:bottom w:val="single" w:sz="4" w:space="0" w:color="D4CEC7"/>
+              <w:right w:val="single" w:sz="4" w:space="0" w:color="D4CEC7"/>
+            </w:tcBorders>
+            <w:tcMar>
+              <w:top w:w="60" w:type="dxa"/>
+              <w:left w:w="100" w:type="dxa"/>
+              <w:bottom w:w="60" w:type="dxa"/>
+              <w:right w:w="100" w:type="dxa"/>
+            </w:tcMar>
+          </w:tcPr>
+          <w:p>
+            <w:r>
+              <w:t>nella pagina della release</w:t>
+            </w:r>
+          </w:p>
+        </w:tc>
+      </w:tr>
+      <w:tr>
+        <w:tc>
+          <w:tcPr>
+            <w:tcW w:w="1542" w:type="dxa"/>
+            <w:tcBorders>
+              <w:top w:val="single" w:sz="4" w:space="0" w:color="D4CEC7"/>
+              <w:left w:val="single" w:sz="4" w:space="0" w:color="D4CEC7"/>
+              <w:bottom w:val="single" w:sz="4" w:space="0" w:color="D4CEC7"/>
+              <w:right w:val="single" w:sz="4" w:space="0" w:color="D4CEC7"/>
+            </w:tcBorders>
+            <w:tcMar>
+              <w:top w:w="60" w:type="dxa"/>
+              <w:left w:w="100" w:type="dxa"/>
+              <w:bottom w:w="60" w:type="dxa"/>
+              <w:right w:w="100" w:type="dxa"/>
+            </w:tcMar>
+          </w:tcPr>
+          <w:p>
+            <w:r>
+              <w:t>macOS (Apple Silicon)</w:t>
+            </w:r>
+          </w:p>
+        </w:tc>
+        <w:tc>
+          <w:tcPr>
+            <w:tcW w:w="3277" w:type="dxa"/>
+            <w:tcBorders>
+              <w:top w:val="single" w:sz="4" w:space="0" w:color="D4CEC7"/>
+              <w:left w:val="single" w:sz="4" w:space="0" w:color="D4CEC7"/>
+              <w:bottom w:val="single" w:sz="4" w:space="0" w:color="D4CEC7"/>
+              <w:right w:val="single" w:sz="4" w:space="0" w:color="D4CEC7"/>
+            </w:tcBorders>
+            <w:tcMar>
+              <w:top w:w="60" w:type="dxa"/>
+              <w:left w:w="100" w:type="dxa"/>
+              <w:bottom w:w="60" w:type="dxa"/>
+              <w:right w:w="100" w:type="dxa"/>
+            </w:tcMar>
+          </w:tcPr>
+          <w:p>
+            <w:r>
+              <w:t>PDFz-1.0.0-macOS-arm64.dmg</w:t>
+            </w:r>
+          </w:p>
+        </w:tc>
+        <w:tc>
+          <w:tcPr>
+            <w:tcW w:w="1349" w:type="dxa"/>
+            <w:tcBorders>
+              <w:top w:val="single" w:sz="4" w:space="0" w:color="D4CEC7"/>
+              <w:left w:val="single" w:sz="4" w:space="0" w:color="D4CEC7"/>
+              <w:bottom w:val="single" w:sz="4" w:space="0" w:color="D4CEC7"/>
+              <w:right w:val="single" w:sz="4" w:space="0" w:color="D4CEC7"/>
+            </w:tcBorders>
+            <w:tcMar>
+              <w:top w:w="60" w:type="dxa"/>
+              <w:left w:w="100" w:type="dxa"/>
+              <w:bottom w:w="60" w:type="dxa"/>
+              <w:right w:w="100" w:type="dxa"/>
+            </w:tcMar>
+          </w:tcPr>
+          <w:p>
+            <w:r>
+              <w:t>133 MB</w:t>
+            </w:r>
+          </w:p>
+        </w:tc>
+        <w:tc>
+          <w:tcPr>
+            <w:tcW w:w="3470" w:type="dxa"/>
+            <w:tcBorders>
+              <w:top w:val="single" w:sz="4" w:space="0" w:color="D4CEC7"/>
+              <w:left w:val="single" w:sz="4" w:space="0" w:color="D4CEC7"/>
+              <w:bottom w:val="single" w:sz="4" w:space="0" w:color="D4CEC7"/>
+              <w:right w:val="single" w:sz="4" w:space="0" w:color="D4CEC7"/>
+            </w:tcBorders>
+            <w:tcMar>
+              <w:top w:w="60" w:type="dxa"/>
+              <w:left w:w="100" w:type="dxa"/>
+              <w:bottom w:w="60" w:type="dxa"/>
+              <w:right w:w="100" w:type="dxa"/>
+            </w:tcMar>
+          </w:tcPr>
+          <w:p>
+            <w:r>
+              <w:t>https://github.com/akito996/pdfz/releases/download/v1.0.0/PDFz-1.0.0-macOS-arm64.dmg</w:t>
+            </w:r>
+          </w:p>
+        </w:tc>
+      </w:tr>
+      <w:tr>
+        <w:tc>
+          <w:tcPr>
+            <w:tcW w:w="1542" w:type="dxa"/>
+            <w:tcBorders>
+              <w:top w:val="single" w:sz="4" w:space="0" w:color="D4CEC7"/>
+              <w:left w:val="single" w:sz="4" w:space="0" w:color="D4CEC7"/>
+              <w:bottom w:val="single" w:sz="4" w:space="0" w:color="D4CEC7"/>
+              <w:right w:val="single" w:sz="4" w:space="0" w:color="D4CEC7"/>
+            </w:tcBorders>
+            <w:tcMar>
+              <w:top w:w="60" w:type="dxa"/>
+              <w:left w:w="100" w:type="dxa"/>
+              <w:bottom w:w="60" w:type="dxa"/>
+              <w:right w:w="100" w:type="dxa"/>
+            </w:tcMar>
+          </w:tcPr>
+          <w:p>
+            <w:r>
+              <w:t>Linux</w:t>
+            </w:r>
+          </w:p>
+        </w:tc>
+        <w:tc>
+          <w:tcPr>
+            <w:tcW w:w="3277" w:type="dxa"/>
+            <w:tcBorders>
+              <w:top w:val="single" w:sz="4" w:space="0" w:color="D4CEC7"/>
+              <w:left w:val="single" w:sz="4" w:space="0" w:color="D4CEC7"/>
+              <w:bottom w:val="single" w:sz="4" w:space="0" w:color="D4CEC7"/>
+              <w:right w:val="single" w:sz="4" w:space="0" w:color="D4CEC7"/>
+            </w:tcBorders>
+            <w:tcMar>
+              <w:top w:w="60" w:type="dxa"/>
+              <w:left w:w="100" w:type="dxa"/>
+              <w:bottom w:w="60" w:type="dxa"/>
+              <w:right w:w="100" w:type="dxa"/>
+            </w:tcMar>
+          </w:tcPr>
+          <w:p>
+            <w:r>
+              <w:t>PDFz-1.0.0-x86_64.AppImage</w:t>
+            </w:r>
+          </w:p>
+        </w:tc>
+        <w:tc>
+          <w:tcPr>
+            <w:tcW w:w="1349" w:type="dxa"/>
+            <w:tcBorders>
+              <w:top w:val="single" w:sz="4" w:space="0" w:color="D4CEC7"/>
+              <w:left w:val="single" w:sz="4" w:space="0" w:color="D4CEC7"/>
+              <w:bottom w:val="single" w:sz="4" w:space="0" w:color="D4CEC7"/>
+              <w:right w:val="single" w:sz="4" w:space="0" w:color="D4CEC7"/>
+            </w:tcBorders>
+            <w:tcMar>
+              <w:top w:w="60" w:type="dxa"/>
+              <w:left w:w="100" w:type="dxa"/>
+              <w:bottom w:w="60" w:type="dxa"/>
+              <w:right w:w="100" w:type="dxa"/>
+            </w:tcMar>
+          </w:tcPr>
+          <w:p>
+            <w:r>
+              <w:t>190 MB</w:t>
+            </w:r>
+          </w:p>
+        </w:tc>
+        <w:tc>
+          <w:tcPr>
+            <w:tcW w:w="3470" w:type="dxa"/>
+            <w:tcBorders>
+              <w:top w:val="single" w:sz="4" w:space="0" w:color="D4CEC7"/>
+              <w:left w:val="single" w:sz="4" w:space="0" w:color="D4CEC7"/>
+              <w:bottom w:val="single" w:sz="4" w:space="0" w:color="D4CEC7"/>
+              <w:right w:val="single" w:sz="4" w:space="0" w:color="D4CEC7"/>
+            </w:tcBorders>
+            <w:tcMar>
+              <w:top w:w="60" w:type="dxa"/>
+              <w:left w:w="100" w:type="dxa"/>
+              <w:bottom w:w="60" w:type="dxa"/>
+              <w:right w:w="100" w:type="dxa"/>
+            </w:tcMar>
+          </w:tcPr>
+          <w:p>
+            <w:r>
+              <w:t>https://github.com/akito996/pdfz/releases/download/v1.0.0/PDFz-1.0.0-x86_64.AppImage</w:t>
+            </w:r>
+          </w:p>
+        </w:tc>
+      </w:tr>
+      <w:tr>
+        <w:tc>
+          <w:tcPr>
+            <w:tcW w:w="1542" w:type="dxa"/>
+            <w:tcBorders>
+              <w:top w:val="single" w:sz="4" w:space="0" w:color="D4CEC7"/>
+              <w:left w:val="single" w:sz="4" w:space="0" w:color="D4CEC7"/>
+              <w:bottom w:val="single" w:sz="4" w:space="0" w:color="D4CEC7"/>
+              <w:right w:val="single" w:sz="4" w:space="0" w:color="D4CEC7"/>
+            </w:tcBorders>
+            <w:tcMar>
+              <w:top w:w="60" w:type="dxa"/>
+              <w:left w:w="100" w:type="dxa"/>
+              <w:bottom w:w="60" w:type="dxa"/>
+              <w:right w:w="100" w:type="dxa"/>
+            </w:tcMar>
+          </w:tcPr>
+          <w:p>
+            <w:r>
+              <w:t>Android</w:t>
+            </w:r>
+          </w:p>
+        </w:tc>
+        <w:tc>
+          <w:tcPr>
+            <w:tcW w:w="3277" w:type="dxa"/>
+            <w:tcBorders>
+              <w:top w:val="single" w:sz="4" w:space="0" w:color="D4CEC7"/>
+              <w:left w:val="single" w:sz="4" w:space="0" w:color="D4CEC7"/>
+              <w:bottom w:val="single" w:sz="4" w:space="0" w:color="D4CEC7"/>
+              <w:right w:val="single" w:sz="4" w:space="0" w:color="D4CEC7"/>
+            </w:tcBorders>
+            <w:tcMar>
+              <w:top w:w="60" w:type="dxa"/>
+              <w:left w:w="100" w:type="dxa"/>
+              <w:bottom w:w="60" w:type="dxa"/>
+              <w:right w:w="100" w:type="dxa"/>
+            </w:tcMar>
+          </w:tcPr>
+          <w:p>
+            <w:r>
+              <w:t>PDFz-1.0.0-android.apk (firmato con la chiave di PDFz)</w:t>
+            </w:r>
+          </w:p>
+        </w:tc>
+        <w:tc>
+          <w:tcPr>
+            <w:tcW w:w="1349" w:type="dxa"/>
+            <w:tcBorders>
+              <w:top w:val="single" w:sz="4" w:space="0" w:color="D4CEC7"/>
+              <w:left w:val="single" w:sz="4" w:space="0" w:color="D4CEC7"/>
+              <w:bottom w:val="single" w:sz="4" w:space="0" w:color="D4CEC7"/>
+              <w:right w:val="single" w:sz="4" w:space="0" w:color="D4CEC7"/>
+            </w:tcBorders>
+            <w:tcMar>
+              <w:top w:w="60" w:type="dxa"/>
+              <w:left w:w="100" w:type="dxa"/>
+              <w:bottom w:w="60" w:type="dxa"/>
+              <w:right w:w="100" w:type="dxa"/>
+            </w:tcMar>
+          </w:tcPr>
+          <w:p>
+            <w:r>
+              <w:t>61,6 MB</w:t>
+            </w:r>
+          </w:p>
+        </w:tc>
+        <w:tc>
+          <w:tcPr>
+            <w:tcW w:w="3470" w:type="dxa"/>
+            <w:tcBorders>
+              <w:top w:val="single" w:sz="4" w:space="0" w:color="D4CEC7"/>
+              <w:left w:val="single" w:sz="4" w:space="0" w:color="D4CEC7"/>
+              <w:bottom w:val="single" w:sz="4" w:space="0" w:color="D4CEC7"/>
+              <w:right w:val="single" w:sz="4" w:space="0" w:color="D4CEC7"/>
+            </w:tcBorders>
+            <w:tcMar>
+              <w:top w:w="60" w:type="dxa"/>
+              <w:left w:w="100" w:type="dxa"/>
+              <w:bottom w:w="60" w:type="dxa"/>
+              <w:right w:w="100" w:type="dxa"/>
+            </w:tcMar>
+          </w:tcPr>
+          <w:p>
+            <w:r>
+              <w:t>https://github.com/akito996/pdfz/releases/download/v1.0.0/PDFz-1.0.0-android.apk</w:t>
+            </w:r>
+          </w:p>
+        </w:tc>
+      </w:tr>
+      <w:tr>
+        <w:tc>
+          <w:tcPr>
+            <w:tcW w:w="1542" w:type="dxa"/>
+            <w:tcBorders>
+              <w:top w:val="single" w:sz="4" w:space="0" w:color="D4CEC7"/>
+              <w:left w:val="single" w:sz="4" w:space="0" w:color="D4CEC7"/>
+              <w:bottom w:val="single" w:sz="4" w:space="0" w:color="D4CEC7"/>
+              <w:right w:val="single" w:sz="4" w:space="0" w:color="D4CEC7"/>
+            </w:tcBorders>
+            <w:tcMar>
+              <w:top w:w="60" w:type="dxa"/>
+              <w:left w:w="100" w:type="dxa"/>
+              <w:bottom w:w="60" w:type="dxa"/>
+              <w:right w:w="100" w:type="dxa"/>
+            </w:tcMar>
+          </w:tcPr>
+          <w:p>
+            <w:r>
+              <w:t>iPhone</w:t>
+            </w:r>
+          </w:p>
+        </w:tc>
+        <w:tc>
+          <w:tcPr>
+            <w:tcW w:w="3277" w:type="dxa"/>
+            <w:tcBorders>
+              <w:top w:val="single" w:sz="4" w:space="0" w:color="D4CEC7"/>
+              <w:left w:val="single" w:sz="4" w:space="0" w:color="D4CEC7"/>
+              <w:bottom w:val="single" w:sz="4" w:space="0" w:color="D4CEC7"/>
+              <w:right w:val="single" w:sz="4" w:space="0" w:color="D4CEC7"/>
+            </w:tcBorders>
+            <w:tcMar>
+              <w:top w:w="60" w:type="dxa"/>
+              <w:left w:w="100" w:type="dxa"/>
+              <w:bottom w:w="60" w:type="dxa"/>
+              <w:right w:w="100" w:type="dxa"/>
+            </w:tcMar>
+          </w:tcPr>
+          <w:p>
+            <w:r>
+              <w:t>–</w:t>
+            </w:r>
+          </w:p>
+        </w:tc>
+        <w:tc>
+          <w:tcPr>
+            <w:tcW w:w="1349" w:type="dxa"/>
+            <w:tcBorders>
+              <w:top w:val="single" w:sz="4" w:space="0" w:color="D4CEC7"/>
+              <w:left w:val="single" w:sz="4" w:space="0" w:color="D4CEC7"/>
+              <w:bottom w:val="single" w:sz="4" w:space="0" w:color="D4CEC7"/>
+              <w:right w:val="single" w:sz="4" w:space="0" w:color="D4CEC7"/>
+            </w:tcBorders>
+            <w:tcMar>
+              <w:top w:w="60" w:type="dxa"/>
+              <w:left w:w="100" w:type="dxa"/>
+              <w:bottom w:w="60" w:type="dxa"/>
+              <w:right w:w="100" w:type="dxa"/>
+            </w:tcMar>
+          </w:tcPr>
+          <w:p>
+            <w:r>
+              <w:t>–</w:t>
+            </w:r>
+          </w:p>
+        </w:tc>
+        <w:tc>
+          <w:tcPr>
+            <w:tcW w:w="3470" w:type="dxa"/>
+            <w:tcBorders>
+              <w:top w:val="single" w:sz="4" w:space="0" w:color="D4CEC7"/>
+              <w:left w:val="single" w:sz="4" w:space="0" w:color="D4CEC7"/>
+              <w:bottom w:val="single" w:sz="4" w:space="0" w:color="D4CEC7"/>
+              <w:right w:val="single" w:sz="4" w:space="0" w:color="D4CEC7"/>
+            </w:tcBorders>
+            <w:tcMar>
+              <w:top w:w="60" w:type="dxa"/>
+              <w:left w:w="100" w:type="dxa"/>
+              <w:bottom w:w="60" w:type="dxa"/>
+              <w:right w:w="100" w:type="dxa"/>
+            </w:tcMar>
+          </w:tcPr>
+          <w:p>
+            <w:r>
+              <w:t>nessuna build: web app da aggiungere alla Home (in preparazione)</w:t>
+            </w:r>
+          </w:p>
+        </w:tc>
+      </w:tr>
+    </w:tbl>
+    <w:p>
+      <w:pPr>
+        <w:spacing w:after="120"/>
+      </w:pPr>
+    </w:p>
+    <w:p>
+      <w:pPr>
+        <w:pBdr>
+          <w:left w:val="single" w:sz="18" w:space="6" w:color="C9A227"/>
+        </w:pBdr>
+        <w:shd w:val="clear" w:color="auto" w:fill="FBF3DA"/>
+        <w:spacing w:before="80" w:after="160"/>
+        <w:ind w:left="120" w:right="120"/>
+      </w:pPr>
+      <w:r>
+        <w:rPr>
+          <w:color w:val="3B3632"/>
+        </w:rPr>
+        <w:t>Il repository è privato: i link si aprono solo con l'accesso a GitHub e l'avviso di nuova versione dentro l'app non trova i file. Per condividerli serve un repository pubblico. Android è stato aggiunto dopo: creata la chiave di firma e i 3 secrets, poi Actions › corsa del tag v1.0.0 › Re-run all jobs (10 minuti); le note della release sono state corrette di conseguenza e la pipeline ora le riscrive a ogni rilancio. Gli installer non sono ancora stati provati su macchine vere.</w:t>
+      </w:r>
+    </w:p>
+    <w:p>
+      <w:pPr>
+        <w:pStyle w:val="Titolo2"/>
+      </w:pPr>
+      <w:bookmarkStart w:id="23" w:name="_Toc243069383"/>
+      <w:r>
+        <w:t>6.4 Ruoli</w:t>
+      </w:r>
+      <w:bookmarkEnd w:id="23"/>
     </w:p>
     <w:tbl>
       <w:tblPr>
@@ -9009,11 +9819,11 @@
       <w:pPr>
         <w:pStyle w:val="Titolo1"/>
       </w:pPr>
-      <w:bookmarkStart w:id="23" w:name="_Toc243065248"/>
+      <w:bookmarkStart w:id="24" w:name="_Toc243069384"/>
       <w:r>
         <w:t>7. Sicurezza</w:t>
       </w:r>
-      <w:bookmarkEnd w:id="23"/>
+      <w:bookmarkEnd w:id="24"/>
     </w:p>
     <w:p>
       <w:pPr>
@@ -9308,11 +10118,11 @@
       <w:pPr>
         <w:pStyle w:val="Titolo1"/>
       </w:pPr>
-      <w:bookmarkStart w:id="24" w:name="_Toc243065249"/>
+      <w:bookmarkStart w:id="25" w:name="_Toc243069385"/>
       <w:r>
         <w:t>8. Punti aperti</w:t>
       </w:r>
-      <w:bookmarkEnd w:id="24"/>
+      <w:bookmarkEnd w:id="25"/>
     </w:p>
     <w:p>
       <w:pPr>
@@ -9328,10 +10138,10 @@
           <w:b/>
           <w:bCs/>
         </w:rPr>
-        <w:t>Chiave Android</w:t>
-      </w:r>
-      <w:r>
-        <w:t xml:space="preserve"> pdfz-release.jks da creare e secrets GitHub da impostare (ANDROID_KEYSTORE_BASE64, ANDROID_KEYSTORE_PASSWORD, ANDROID_KEY_ALIAS = pdfz). Conservarla al sicuro: se si perde, i telefoni non accettano gli aggiornamenti.</w:t>
+        <w:t>Copia di riserva della chiave Android</w:t>
+      </w:r>
+      <w:r>
+        <w:t xml:space="preserve"> (C:\Dev\PDFz-chiave-android: pdfz-release.jks e password.txt) in un posto sicuro; i secrets su GitHub sono già impostati. Se la chiave si perde, i telefoni non accettano più gli aggiornamenti.</w:t>
       </w:r>
     </w:p>
     <w:p>
@@ -9351,7 +10161,7 @@
         <w:t>Repository pubblico o privato</w:t>
       </w:r>
       <w:r>
-        <w:t>: l'avviso di nuova versione funziona solo con release pubbliche.</w:t>
+        <w:t>: con il repository privato i link delle release si aprono solo con l'accesso a GitHub e l'avviso di nuova versione non funziona.</w:t>
       </w:r>
     </w:p>
     <w:p>
@@ -9368,10 +10178,10 @@
           <w:b/>
           <w:bCs/>
         </w:rPr>
-        <w:t>Primo rilascio</w:t>
-      </w:r>
-      <w:r>
-        <w:t xml:space="preserve"> (tag 1.0.0) da lanciare e controllare: la pipeline non è ancora stata verificata fino in fondo su questo repository.</w:t>
+        <w:t>Web app per iPhone</w:t>
+      </w:r>
+      <w:r>
+        <w:t xml:space="preserve"> pronta su un ramo separato (sessione dedicata): da unire e pubblicare quando si decide dove ospitarla (con repository privato niente GitHub Pages).</w:t>
       </w:r>
     </w:p>
     <w:p>
@@ -9431,11 +10241,11 @@
       <w:pPr>
         <w:pStyle w:val="Titolo1"/>
       </w:pPr>
-      <w:bookmarkStart w:id="25" w:name="_Toc243065250"/>
+      <w:bookmarkStart w:id="26" w:name="_Toc243069386"/>
       <w:r>
         <w:t>9. Pensato per i prossimi 10 anni</w:t>
       </w:r>
-      <w:bookmarkEnd w:id="25"/>
+      <w:bookmarkEnd w:id="26"/>
     </w:p>
     <w:p>
       <w:pPr>
@@ -9678,204 +10488,150 @@
 <file path=word/numbering.xml><?xml version="1.0" encoding="utf-8"?>
 <w:numbering xmlns:wpc="http://schemas.microsoft.com/office/word/2010/wordprocessingCanvas" xmlns:cx="http://schemas.microsoft.com/office/drawing/2014/chartex" xmlns:cx1="http://schemas.microsoft.com/office/drawing/2015/9/8/chartex" xmlns:cx2="http://schemas.microsoft.com/office/drawing/2015/10/21/chartex" xmlns:cx3="http://schemas.microsoft.com/office/drawing/2016/5/9/chartex" xmlns:cx4="http://schemas.microsoft.com/office/drawing/2016/5/10/chartex" xmlns:cx5="http://schemas.microsoft.com/office/drawing/2016/5/11/chartex" xmlns:cx6="http://schemas.microsoft.com/office/drawing/2016/5/12/chartex" xmlns:cx7="http://schemas.microsoft.com/office/drawing/2016/5/13/chartex" xmlns:cx8="http://schemas.microsoft.com/office/drawing/2016/5/14/chartex" xmlns:mc="http://schemas.openxmlformats.org/markup-compatibility/2006" xmlns:aink="http://schemas.microsoft.com/office/drawing/2016/ink" xmlns:am3d="http://schemas.microsoft.com/office/drawing/2017/model3d" xmlns:o="urn:schemas-microsoft-com:office:office" xmlns:oel="http://schemas.microsoft.com/office/2019/extlst" xmlns:r="http://schemas.openxmlformats.org/officeDocument/2006/relationships" xmlns:m="http://schemas.openxmlformats.org/officeDocument/2006/math" xmlns:v="urn:schemas-microsoft-com:vml" xmlns:wp14="http://schemas.microsoft.com/office/word/2010/wordprocessingDrawing" xmlns:wp="http://schemas.openxmlformats.org/drawingml/2006/wordprocessingDrawing" xmlns:w10="urn:schemas-microsoft-com:office:word" xmlns:w="http://schemas.openxmlformats.org/wordprocessingml/2006/main" xmlns:w14="http://schemas.microsoft.com/office/word/2010/wordml" xmlns:w15="http://schemas.microsoft.com/office/word/2012/wordml" xmlns:w16cex="http://schemas.microsoft.com/office/word/2018/wordml/cex" xmlns:w16cid="http://schemas.microsoft.com/office/word/2016/wordml/cid" xmlns:w16="http://schemas.microsoft.com/office/word/2018/wordml" xmlns:w16du="http://schemas.microsoft.com/office/word/2023/wordml/word16du" xmlns:w16sdtdh="http://schemas.microsoft.com/office/word/2020/wordml/sdtdatahash" xmlns:w16sdtfl="http://schemas.microsoft.com/office/word/2024/wordml/sdtformatlock" xmlns:w16se="http://schemas.microsoft.com/office/word/2015/wordml/symex" xmlns:wpg="http://schemas.microsoft.com/office/word/2010/wordprocessingGroup" xmlns:wpi="http://schemas.microsoft.com/office/word/2010/wordprocessingInk" xmlns:wne="http://schemas.microsoft.com/office/word/2006/wordml" xmlns:wps="http://schemas.microsoft.com/office/word/2010/wordprocessingShape" mc:Ignorable="w14 w15 w16se w16cid w16 w16cex w16sdtdh w16sdtfl w16du wp14">
   <w:abstractNum w:abstractNumId="0" w15:restartNumberingAfterBreak="0">
-    <w:nsid w:val="522F209B"/>
+    <w:nsid w:val="09BD584C"/>
     <w:multiLevelType w:val="hybridMultilevel"/>
-    <w:tmpl w:val="069A9752"/>
-    <w:lvl w:ilvl="0" w:tplc="B77C88F0">
+    <w:tmpl w:val="BA108058"/>
+    <w:lvl w:ilvl="0" w:tplc="434AFD4A" w:tentative="1">
       <w:start w:val="1"/>
       <w:numFmt w:val="bullet"/>
-      <w:lvlText w:val="•"/>
+      <w:lvlText w:val="●"/>
       <w:lvlJc w:val="left"/>
       <w:pPr>
-        <w:ind w:left="540" w:hanging="270"/>
+        <w:ind w:left="720" w:hanging="360"/>
       </w:pPr>
     </w:lvl>
-    <w:lvl w:ilvl="1" w:tplc="D4DCA6EA">
+    <w:lvl w:ilvl="1" w:tplc="BE5C576A" w:tentative="1">
+      <w:start w:val="1"/>
+      <w:numFmt w:val="bullet"/>
+      <w:lvlText w:val="○"/>
+      <w:lvlJc w:val="left"/>
+      <w:pPr>
+        <w:ind w:left="1440" w:hanging="360"/>
+      </w:pPr>
+    </w:lvl>
+    <w:lvl w:ilvl="2" w:tplc="171602DA" w:tentative="1">
+      <w:start w:val="1"/>
+      <w:numFmt w:val="bullet"/>
+      <w:lvlText w:val="■"/>
+      <w:lvlJc w:val="left"/>
+      <w:pPr>
+        <w:ind w:left="2160" w:hanging="360"/>
+      </w:pPr>
+    </w:lvl>
+    <w:lvl w:ilvl="3" w:tplc="B18CD468" w:tentative="1">
+      <w:start w:val="1"/>
+      <w:numFmt w:val="bullet"/>
+      <w:lvlText w:val="●"/>
+      <w:lvlJc w:val="left"/>
+      <w:pPr>
+        <w:ind w:left="2880" w:hanging="360"/>
+      </w:pPr>
+    </w:lvl>
+    <w:lvl w:ilvl="4" w:tplc="3BF0C972" w:tentative="1">
+      <w:start w:val="1"/>
+      <w:numFmt w:val="bullet"/>
+      <w:lvlText w:val="○"/>
+      <w:lvlJc w:val="left"/>
+      <w:pPr>
+        <w:ind w:left="3600" w:hanging="360"/>
+      </w:pPr>
+    </w:lvl>
+    <w:lvl w:ilvl="5" w:tplc="B8845446" w:tentative="1">
+      <w:start w:val="1"/>
+      <w:numFmt w:val="bullet"/>
+      <w:lvlText w:val="■"/>
+      <w:lvlJc w:val="left"/>
+      <w:pPr>
+        <w:ind w:left="4320" w:hanging="360"/>
+      </w:pPr>
+    </w:lvl>
+    <w:lvl w:ilvl="6" w:tplc="89E8089A" w:tentative="1">
+      <w:start w:val="1"/>
+      <w:numFmt w:val="bullet"/>
+      <w:lvlText w:val="●"/>
+      <w:lvlJc w:val="left"/>
+      <w:pPr>
+        <w:ind w:left="5040" w:hanging="360"/>
+      </w:pPr>
+    </w:lvl>
+    <w:lvl w:ilvl="7" w:tplc="5DDC2E94" w:tentative="1">
+      <w:start w:val="1"/>
+      <w:numFmt w:val="bullet"/>
+      <w:lvlText w:val="●"/>
+      <w:lvlJc w:val="left"/>
+      <w:pPr>
+        <w:ind w:left="5760" w:hanging="360"/>
+      </w:pPr>
+    </w:lvl>
+    <w:lvl w:ilvl="8" w:tplc="2B9EAB9A" w:tentative="1">
+      <w:start w:val="1"/>
+      <w:numFmt w:val="bullet"/>
+      <w:lvlText w:val="●"/>
+      <w:lvlJc w:val="left"/>
+      <w:pPr>
+        <w:ind w:left="6480" w:hanging="360"/>
+      </w:pPr>
+    </w:lvl>
+  </w:abstractNum>
+  <w:abstractNum w:abstractNumId="1" w15:restartNumberingAfterBreak="0">
+    <w:nsid w:val="34597C83"/>
+    <w:multiLevelType w:val="hybridMultilevel"/>
+    <w:tmpl w:val="21A288F2"/>
+    <w:lvl w:ilvl="0" w:tplc="468A988A">
+      <w:start w:val="1"/>
+      <w:numFmt w:val="decimal"/>
+      <w:lvlText w:val="%1."/>
+      <w:lvlJc w:val="left"/>
+      <w:pPr>
+        <w:ind w:left="540" w:hanging="300"/>
+      </w:pPr>
+    </w:lvl>
+    <w:lvl w:ilvl="1" w:tplc="6AD4D27E">
       <w:numFmt w:val="decimal"/>
       <w:lvlText w:val=""/>
       <w:lvlJc w:val="left"/>
     </w:lvl>
-    <w:lvl w:ilvl="2" w:tplc="0CBE1AD4">
+    <w:lvl w:ilvl="2" w:tplc="C5F00606">
       <w:numFmt w:val="decimal"/>
       <w:lvlText w:val=""/>
       <w:lvlJc w:val="left"/>
     </w:lvl>
-    <w:lvl w:ilvl="3" w:tplc="ADCE504A">
+    <w:lvl w:ilvl="3" w:tplc="634CDA70">
       <w:numFmt w:val="decimal"/>
       <w:lvlText w:val=""/>
       <w:lvlJc w:val="left"/>
     </w:lvl>
-    <w:lvl w:ilvl="4" w:tplc="8F8C7426">
+    <w:lvl w:ilvl="4" w:tplc="79145910">
       <w:numFmt w:val="decimal"/>
       <w:lvlText w:val=""/>
       <w:lvlJc w:val="left"/>
     </w:lvl>
-    <w:lvl w:ilvl="5" w:tplc="78A035A2">
+    <w:lvl w:ilvl="5" w:tplc="381CD278">
       <w:numFmt w:val="decimal"/>
       <w:lvlText w:val=""/>
       <w:lvlJc w:val="left"/>
     </w:lvl>
-    <w:lvl w:ilvl="6" w:tplc="1A14C074">
+    <w:lvl w:ilvl="6" w:tplc="E1F6545A">
       <w:numFmt w:val="decimal"/>
       <w:lvlText w:val=""/>
       <w:lvlJc w:val="left"/>
     </w:lvl>
-    <w:lvl w:ilvl="7" w:tplc="9A58BE16">
+    <w:lvl w:ilvl="7" w:tplc="961AE1D4">
       <w:numFmt w:val="decimal"/>
       <w:lvlText w:val=""/>
       <w:lvlJc w:val="left"/>
     </w:lvl>
-    <w:lvl w:ilvl="8" w:tplc="E1F65088">
-      <w:numFmt w:val="decimal"/>
-      <w:lvlText w:val=""/>
-      <w:lvlJc w:val="left"/>
-    </w:lvl>
-  </w:abstractNum>
-  <w:abstractNum w:abstractNumId="1" w15:restartNumberingAfterBreak="0">
-    <w:nsid w:val="738B6676"/>
-    <w:multiLevelType w:val="hybridMultilevel"/>
-    <w:tmpl w:val="006CB16A"/>
-    <w:lvl w:ilvl="0" w:tplc="B3101638">
-      <w:start w:val="1"/>
-      <w:numFmt w:val="decimal"/>
-      <w:lvlText w:val="%1."/>
-      <w:lvlJc w:val="left"/>
-      <w:pPr>
-        <w:ind w:left="540" w:hanging="300"/>
-      </w:pPr>
-    </w:lvl>
-    <w:lvl w:ilvl="1" w:tplc="E9945194">
-      <w:numFmt w:val="decimal"/>
-      <w:lvlText w:val=""/>
-      <w:lvlJc w:val="left"/>
-    </w:lvl>
-    <w:lvl w:ilvl="2" w:tplc="0B9EFBA4">
-      <w:numFmt w:val="decimal"/>
-      <w:lvlText w:val=""/>
-      <w:lvlJc w:val="left"/>
-    </w:lvl>
-    <w:lvl w:ilvl="3" w:tplc="708AF714">
-      <w:numFmt w:val="decimal"/>
-      <w:lvlText w:val=""/>
-      <w:lvlJc w:val="left"/>
-    </w:lvl>
-    <w:lvl w:ilvl="4" w:tplc="839C8E42">
-      <w:numFmt w:val="decimal"/>
-      <w:lvlText w:val=""/>
-      <w:lvlJc w:val="left"/>
-    </w:lvl>
-    <w:lvl w:ilvl="5" w:tplc="21E4AB70">
-      <w:numFmt w:val="decimal"/>
-      <w:lvlText w:val=""/>
-      <w:lvlJc w:val="left"/>
-    </w:lvl>
-    <w:lvl w:ilvl="6" w:tplc="796C9030">
-      <w:numFmt w:val="decimal"/>
-      <w:lvlText w:val=""/>
-      <w:lvlJc w:val="left"/>
-    </w:lvl>
-    <w:lvl w:ilvl="7" w:tplc="E3D2B1D8">
-      <w:numFmt w:val="decimal"/>
-      <w:lvlText w:val=""/>
-      <w:lvlJc w:val="left"/>
-    </w:lvl>
-    <w:lvl w:ilvl="8" w:tplc="5F222570">
+    <w:lvl w:ilvl="8" w:tplc="0A32A1A8">
       <w:numFmt w:val="decimal"/>
       <w:lvlText w:val=""/>
       <w:lvlJc w:val="left"/>
     </w:lvl>
   </w:abstractNum>
   <w:abstractNum w:abstractNumId="2" w15:restartNumberingAfterBreak="0">
-    <w:nsid w:val="74F403E6"/>
+    <w:nsid w:val="393F5686"/>
     <w:multiLevelType w:val="hybridMultilevel"/>
-    <w:tmpl w:val="70B2B9B4"/>
-    <w:lvl w:ilvl="0" w:tplc="DF508BA4" w:tentative="1">
-      <w:start w:val="1"/>
-      <w:numFmt w:val="bullet"/>
-      <w:lvlText w:val="●"/>
-      <w:lvlJc w:val="left"/>
-      <w:pPr>
-        <w:ind w:left="720" w:hanging="360"/>
-      </w:pPr>
-    </w:lvl>
-    <w:lvl w:ilvl="1" w:tplc="9A94A4F0" w:tentative="1">
-      <w:start w:val="1"/>
-      <w:numFmt w:val="bullet"/>
-      <w:lvlText w:val="○"/>
-      <w:lvlJc w:val="left"/>
-      <w:pPr>
-        <w:ind w:left="1440" w:hanging="360"/>
-      </w:pPr>
-    </w:lvl>
-    <w:lvl w:ilvl="2" w:tplc="F8EAE096" w:tentative="1">
-      <w:start w:val="1"/>
-      <w:numFmt w:val="bullet"/>
-      <w:lvlText w:val="■"/>
-      <w:lvlJc w:val="left"/>
-      <w:pPr>
-        <w:ind w:left="2160" w:hanging="360"/>
-      </w:pPr>
-    </w:lvl>
-    <w:lvl w:ilvl="3" w:tplc="9F8C5BA6" w:tentative="1">
-      <w:start w:val="1"/>
-      <w:numFmt w:val="bullet"/>
-      <w:lvlText w:val="●"/>
-      <w:lvlJc w:val="left"/>
-      <w:pPr>
-        <w:ind w:left="2880" w:hanging="360"/>
-      </w:pPr>
-    </w:lvl>
-    <w:lvl w:ilvl="4" w:tplc="73865A54" w:tentative="1">
-      <w:start w:val="1"/>
-      <w:numFmt w:val="bullet"/>
-      <w:lvlText w:val="○"/>
-      <w:lvlJc w:val="left"/>
-      <w:pPr>
-        <w:ind w:left="3600" w:hanging="360"/>
-      </w:pPr>
-    </w:lvl>
-    <w:lvl w:ilvl="5" w:tplc="C204D01E" w:tentative="1">
-      <w:start w:val="1"/>
-      <w:numFmt w:val="bullet"/>
-      <w:lvlText w:val="■"/>
-      <w:lvlJc w:val="left"/>
-      <w:pPr>
-        <w:ind w:left="4320" w:hanging="360"/>
-      </w:pPr>
-    </w:lvl>
-    <w:lvl w:ilvl="6" w:tplc="A8AAF756" w:tentative="1">
-      <w:start w:val="1"/>
-      <w:numFmt w:val="bullet"/>
-      <w:lvlText w:val="●"/>
-      <w:lvlJc w:val="left"/>
-      <w:pPr>
-        <w:ind w:left="5040" w:hanging="360"/>
-      </w:pPr>
-    </w:lvl>
-    <w:lvl w:ilvl="7" w:tplc="37201D9E" w:tentative="1">
-      <w:start w:val="1"/>
-      <w:numFmt w:val="bullet"/>
-      <w:lvlText w:val="●"/>
-      <w:lvlJc w:val="left"/>
-      <w:pPr>
-        <w:ind w:left="5760" w:hanging="360"/>
-      </w:pPr>
-    </w:lvl>
-    <w:lvl w:ilvl="8" w:tplc="A70AC8BA" w:tentative="1">
-      <w:start w:val="1"/>
-      <w:numFmt w:val="bullet"/>
-      <w:lvlText w:val="●"/>
-      <w:lvlJc w:val="left"/>
-      <w:pPr>
-        <w:ind w:left="6480" w:hanging="360"/>
-      </w:pPr>
-    </w:lvl>
-  </w:abstractNum>
-  <w:abstractNum w:abstractNumId="3" w15:restartNumberingAfterBreak="0">
-    <w:nsid w:val="7B64016F"/>
-    <w:multiLevelType w:val="hybridMultilevel"/>
-    <w:tmpl w:val="58427910"/>
-    <w:lvl w:ilvl="0" w:tplc="C29431E4">
+    <w:tmpl w:val="5AF270AA"/>
+    <w:lvl w:ilvl="0" w:tplc="A50C656C">
       <w:start w:val="1"/>
       <w:numFmt w:val="decimal"/>
       <w:lvlText w:val="%1."/>
@@ -9884,67 +10640,121 @@
         <w:ind w:left="540" w:hanging="300"/>
       </w:pPr>
     </w:lvl>
-    <w:lvl w:ilvl="1" w:tplc="5E7EA2CE">
+    <w:lvl w:ilvl="1" w:tplc="63CAD46E">
       <w:numFmt w:val="decimal"/>
       <w:lvlText w:val=""/>
       <w:lvlJc w:val="left"/>
     </w:lvl>
-    <w:lvl w:ilvl="2" w:tplc="66449506">
+    <w:lvl w:ilvl="2" w:tplc="0414C0BA">
       <w:numFmt w:val="decimal"/>
       <w:lvlText w:val=""/>
       <w:lvlJc w:val="left"/>
     </w:lvl>
-    <w:lvl w:ilvl="3" w:tplc="798C5618">
+    <w:lvl w:ilvl="3" w:tplc="2FAA0506">
       <w:numFmt w:val="decimal"/>
       <w:lvlText w:val=""/>
       <w:lvlJc w:val="left"/>
     </w:lvl>
-    <w:lvl w:ilvl="4" w:tplc="42B0C35A">
+    <w:lvl w:ilvl="4" w:tplc="F4E46D70">
       <w:numFmt w:val="decimal"/>
       <w:lvlText w:val=""/>
       <w:lvlJc w:val="left"/>
     </w:lvl>
-    <w:lvl w:ilvl="5" w:tplc="D444DBFC">
+    <w:lvl w:ilvl="5" w:tplc="C912407E">
       <w:numFmt w:val="decimal"/>
       <w:lvlText w:val=""/>
       <w:lvlJc w:val="left"/>
     </w:lvl>
-    <w:lvl w:ilvl="6" w:tplc="CC1CE254">
+    <w:lvl w:ilvl="6" w:tplc="9E7EDB60">
       <w:numFmt w:val="decimal"/>
       <w:lvlText w:val=""/>
       <w:lvlJc w:val="left"/>
     </w:lvl>
-    <w:lvl w:ilvl="7" w:tplc="48A41060">
+    <w:lvl w:ilvl="7" w:tplc="AD4A74C4">
       <w:numFmt w:val="decimal"/>
       <w:lvlText w:val=""/>
       <w:lvlJc w:val="left"/>
     </w:lvl>
-    <w:lvl w:ilvl="8" w:tplc="A14A0FD4">
+    <w:lvl w:ilvl="8" w:tplc="EF867A54">
       <w:numFmt w:val="decimal"/>
       <w:lvlText w:val=""/>
       <w:lvlJc w:val="left"/>
     </w:lvl>
   </w:abstractNum>
-  <w:num w:numId="1" w16cid:durableId="1759712411">
-    <w:abstractNumId w:val="2"/>
-    <w:lvlOverride w:ilvl="0">
-      <w:startOverride w:val="1"/>
-    </w:lvlOverride>
-  </w:num>
-  <w:num w:numId="2" w16cid:durableId="259142045">
+  <w:abstractNum w:abstractNumId="3" w15:restartNumberingAfterBreak="0">
+    <w:nsid w:val="3FC34EA1"/>
+    <w:multiLevelType w:val="hybridMultilevel"/>
+    <w:tmpl w:val="7A42A7C4"/>
+    <w:lvl w:ilvl="0" w:tplc="B4663B26">
+      <w:start w:val="1"/>
+      <w:numFmt w:val="bullet"/>
+      <w:lvlText w:val="•"/>
+      <w:lvlJc w:val="left"/>
+      <w:pPr>
+        <w:ind w:left="540" w:hanging="270"/>
+      </w:pPr>
+    </w:lvl>
+    <w:lvl w:ilvl="1" w:tplc="8DFC7E7C">
+      <w:numFmt w:val="decimal"/>
+      <w:lvlText w:val=""/>
+      <w:lvlJc w:val="left"/>
+    </w:lvl>
+    <w:lvl w:ilvl="2" w:tplc="CBD2D19C">
+      <w:numFmt w:val="decimal"/>
+      <w:lvlText w:val=""/>
+      <w:lvlJc w:val="left"/>
+    </w:lvl>
+    <w:lvl w:ilvl="3" w:tplc="D122C5E4">
+      <w:numFmt w:val="decimal"/>
+      <w:lvlText w:val=""/>
+      <w:lvlJc w:val="left"/>
+    </w:lvl>
+    <w:lvl w:ilvl="4" w:tplc="570A735A">
+      <w:numFmt w:val="decimal"/>
+      <w:lvlText w:val=""/>
+      <w:lvlJc w:val="left"/>
+    </w:lvl>
+    <w:lvl w:ilvl="5" w:tplc="E37A835C">
+      <w:numFmt w:val="decimal"/>
+      <w:lvlText w:val=""/>
+      <w:lvlJc w:val="left"/>
+    </w:lvl>
+    <w:lvl w:ilvl="6" w:tplc="E3B652A4">
+      <w:numFmt w:val="decimal"/>
+      <w:lvlText w:val=""/>
+      <w:lvlJc w:val="left"/>
+    </w:lvl>
+    <w:lvl w:ilvl="7" w:tplc="B106B798">
+      <w:numFmt w:val="decimal"/>
+      <w:lvlText w:val=""/>
+      <w:lvlJc w:val="left"/>
+    </w:lvl>
+    <w:lvl w:ilvl="8" w:tplc="EC5C41CE">
+      <w:numFmt w:val="decimal"/>
+      <w:lvlText w:val=""/>
+      <w:lvlJc w:val="left"/>
+    </w:lvl>
+  </w:abstractNum>
+  <w:num w:numId="1" w16cid:durableId="2140950733">
     <w:abstractNumId w:val="0"/>
     <w:lvlOverride w:ilvl="0">
       <w:startOverride w:val="1"/>
     </w:lvlOverride>
   </w:num>
-  <w:num w:numId="3" w16cid:durableId="1925528817">
+  <w:num w:numId="2" w16cid:durableId="959262046">
     <w:abstractNumId w:val="3"/>
     <w:lvlOverride w:ilvl="0">
       <w:startOverride w:val="1"/>
     </w:lvlOverride>
   </w:num>
-  <w:num w:numId="4" w16cid:durableId="789589149">
+  <w:num w:numId="3" w16cid:durableId="1649046334">
     <w:abstractNumId w:val="1"/>
+    <w:lvlOverride w:ilvl="0">
+      <w:startOverride w:val="1"/>
+    </w:lvlOverride>
+  </w:num>
+  <w:num w:numId="4" w16cid:durableId="1008755586">
+    <w:abstractNumId w:val="2"/>
     <w:lvlOverride w:ilvl="0">
       <w:startOverride w:val="1"/>
     </w:lvlOverride>
@@ -10585,7 +11395,7 @@
     <w:autoRedefine/>
     <w:uiPriority w:val="39"/>
     <w:unhideWhenUsed/>
-    <w:rsid w:val="00ED2EC8"/>
+    <w:rsid w:val="0046242C"/>
     <w:pPr>
       <w:spacing w:after="100"/>
     </w:pPr>
@@ -10597,7 +11407,7 @@
     <w:autoRedefine/>
     <w:uiPriority w:val="39"/>
     <w:unhideWhenUsed/>
-    <w:rsid w:val="00ED2EC8"/>
+    <w:rsid w:val="0046242C"/>
     <w:pPr>
       <w:spacing w:after="100"/>
       <w:ind w:left="210"/>

</xml_diff>

<commit_message>
PDFz 1.0.1: menu Tema e notifiche corretti su telefono e tablet
- menu Tema, campanella e Download si aprono in un Popover disegnato fuori dalla barra in alto
  (components/Popover.tsx): sul telefono la barra scorre e tagliava i menu, che restavano nascosti
- campanella: resta aperta finche' la chiude l'utente, segna le novita' come lette all'apertura
  (niente pallino rosso che resta), mostra tutte le voci e i messaggi recenti della sessione (messaggi.ts)
- messaggi in basso piu' lunghi (6 s, errori 10 s)
- versione 1.0.1 (MSI 101.0.1, versionCode Android 1001000001), CHANGELOG, novita.json, docs, Word e CLAUDE.md

Co-Authored-By: Claude Opus 5.5 <noreply@anthropic.com>
</commit_message>
<xml_diff>
--- a/docs/PDFz_20261016.docx
+++ b/docs/PDFz_20261016.docx
@@ -16,7 +16,7 @@
           <w:noProof/>
         </w:rPr>
         <w:drawing>
-          <wp:inline distT="0" distB="0" distL="0" distR="0" wp14:anchorId="1568B848" wp14:editId="6D724F1C">
+          <wp:inline distT="0" distB="0" distL="0" distR="0" wp14:anchorId="399A68E5" wp14:editId="73B6F31A">
             <wp:extent cx="3619500" cy="1285875"/>
             <wp:effectExtent l="0" t="0" r="0" b="0"/>
             <wp:docPr id="1" name="Immagine 1"/>
@@ -95,7 +95,7 @@
           <w:sz w:val="22"/>
           <w:szCs w:val="22"/>
         </w:rPr>
-        <w:t>Versione 1.0.0  ·  16 ottobre 2026  ·  autore: agjin</w:t>
+        <w:t>Versione 1.0.1  ·  16 ottobre 2026  ·  autore: agjin</w:t>
       </w:r>
     </w:p>
     <w:p>
@@ -135,7 +135,7 @@
     <w:sdt>
       <w:sdtPr>
         <w:alias w:val="Indice"/>
-        <w:id w:val="568697442"/>
+        <w:id w:val="-399285314"/>
       </w:sdtPr>
       <w:sdtEndPr/>
       <w:sdtContent>
@@ -158,7 +158,7 @@
           <w:r>
             <w:fldChar w:fldCharType="separate"/>
           </w:r>
-          <w:hyperlink w:anchor="_Toc243069360" w:history="1">
+          <w:hyperlink w:anchor="_Toc243073585" w:history="1">
             <w:r>
               <w:rPr>
                 <w:rStyle w:val="Collegamentoipertestuale"/>
@@ -182,7 +182,7 @@
               <w:rPr>
                 <w:noProof/>
               </w:rPr>
-              <w:instrText xml:space="preserve"> PAGEREF _Toc243069360 \h </w:instrText>
+              <w:instrText xml:space="preserve"> PAGEREF _Toc243073585 \h </w:instrText>
             </w:r>
             <w:r>
               <w:rPr>
@@ -219,7 +219,7 @@
               <w:noProof/>
             </w:rPr>
           </w:pPr>
-          <w:hyperlink w:anchor="_Toc243069361" w:history="1">
+          <w:hyperlink w:anchor="_Toc243073586" w:history="1">
             <w:r>
               <w:rPr>
                 <w:rStyle w:val="Collegamentoipertestuale"/>
@@ -243,7 +243,7 @@
               <w:rPr>
                 <w:noProof/>
               </w:rPr>
-              <w:instrText xml:space="preserve"> PAGEREF _Toc243069361 \h </w:instrText>
+              <w:instrText xml:space="preserve"> PAGEREF _Toc243073586 \h </w:instrText>
             </w:r>
             <w:r>
               <w:rPr>
@@ -280,7 +280,7 @@
               <w:noProof/>
             </w:rPr>
           </w:pPr>
-          <w:hyperlink w:anchor="_Toc243069362" w:history="1">
+          <w:hyperlink w:anchor="_Toc243073587" w:history="1">
             <w:r>
               <w:rPr>
                 <w:rStyle w:val="Collegamentoipertestuale"/>
@@ -304,7 +304,7 @@
               <w:rPr>
                 <w:noProof/>
               </w:rPr>
-              <w:instrText xml:space="preserve"> PAGEREF _Toc243069362 \h </w:instrText>
+              <w:instrText xml:space="preserve"> PAGEREF _Toc243073587 \h </w:instrText>
             </w:r>
             <w:r>
               <w:rPr>
@@ -341,7 +341,7 @@
               <w:noProof/>
             </w:rPr>
           </w:pPr>
-          <w:hyperlink w:anchor="_Toc243069363" w:history="1">
+          <w:hyperlink w:anchor="_Toc243073588" w:history="1">
             <w:r>
               <w:rPr>
                 <w:rStyle w:val="Collegamentoipertestuale"/>
@@ -365,7 +365,7 @@
               <w:rPr>
                 <w:noProof/>
               </w:rPr>
-              <w:instrText xml:space="preserve"> PAGEREF _Toc243069363 \h </w:instrText>
+              <w:instrText xml:space="preserve"> PAGEREF _Toc243073588 \h </w:instrText>
             </w:r>
             <w:r>
               <w:rPr>
@@ -402,7 +402,7 @@
               <w:noProof/>
             </w:rPr>
           </w:pPr>
-          <w:hyperlink w:anchor="_Toc243069364" w:history="1">
+          <w:hyperlink w:anchor="_Toc243073589" w:history="1">
             <w:r>
               <w:rPr>
                 <w:rStyle w:val="Collegamentoipertestuale"/>
@@ -426,7 +426,7 @@
               <w:rPr>
                 <w:noProof/>
               </w:rPr>
-              <w:instrText xml:space="preserve"> PAGEREF _Toc243069364 \h </w:instrText>
+              <w:instrText xml:space="preserve"> PAGEREF _Toc243073589 \h </w:instrText>
             </w:r>
             <w:r>
               <w:rPr>
@@ -463,7 +463,7 @@
               <w:noProof/>
             </w:rPr>
           </w:pPr>
-          <w:hyperlink w:anchor="_Toc243069365" w:history="1">
+          <w:hyperlink w:anchor="_Toc243073590" w:history="1">
             <w:r>
               <w:rPr>
                 <w:rStyle w:val="Collegamentoipertestuale"/>
@@ -487,7 +487,7 @@
               <w:rPr>
                 <w:noProof/>
               </w:rPr>
-              <w:instrText xml:space="preserve"> PAGEREF _Toc243069365 \h </w:instrText>
+              <w:instrText xml:space="preserve"> PAGEREF _Toc243073590 \h </w:instrText>
             </w:r>
             <w:r>
               <w:rPr>
@@ -524,7 +524,7 @@
               <w:noProof/>
             </w:rPr>
           </w:pPr>
-          <w:hyperlink w:anchor="_Toc243069366" w:history="1">
+          <w:hyperlink w:anchor="_Toc243073591" w:history="1">
             <w:r>
               <w:rPr>
                 <w:rStyle w:val="Collegamentoipertestuale"/>
@@ -548,7 +548,7 @@
               <w:rPr>
                 <w:noProof/>
               </w:rPr>
-              <w:instrText xml:space="preserve"> PAGEREF _Toc243069366 \h </w:instrText>
+              <w:instrText xml:space="preserve"> PAGEREF _Toc243073591 \h </w:instrText>
             </w:r>
             <w:r>
               <w:rPr>
@@ -585,7 +585,7 @@
               <w:noProof/>
             </w:rPr>
           </w:pPr>
-          <w:hyperlink w:anchor="_Toc243069367" w:history="1">
+          <w:hyperlink w:anchor="_Toc243073592" w:history="1">
             <w:r>
               <w:rPr>
                 <w:rStyle w:val="Collegamentoipertestuale"/>
@@ -609,7 +609,7 @@
               <w:rPr>
                 <w:noProof/>
               </w:rPr>
-              <w:instrText xml:space="preserve"> PAGEREF _Toc243069367 \h </w:instrText>
+              <w:instrText xml:space="preserve"> PAGEREF _Toc243073592 \h </w:instrText>
             </w:r>
             <w:r>
               <w:rPr>
@@ -646,7 +646,7 @@
               <w:noProof/>
             </w:rPr>
           </w:pPr>
-          <w:hyperlink w:anchor="_Toc243069368" w:history="1">
+          <w:hyperlink w:anchor="_Toc243073593" w:history="1">
             <w:r>
               <w:rPr>
                 <w:rStyle w:val="Collegamentoipertestuale"/>
@@ -670,7 +670,7 @@
               <w:rPr>
                 <w:noProof/>
               </w:rPr>
-              <w:instrText xml:space="preserve"> PAGEREF _Toc243069368 \h </w:instrText>
+              <w:instrText xml:space="preserve"> PAGEREF _Toc243073593 \h </w:instrText>
             </w:r>
             <w:r>
               <w:rPr>
@@ -707,7 +707,7 @@
               <w:noProof/>
             </w:rPr>
           </w:pPr>
-          <w:hyperlink w:anchor="_Toc243069369" w:history="1">
+          <w:hyperlink w:anchor="_Toc243073594" w:history="1">
             <w:r>
               <w:rPr>
                 <w:rStyle w:val="Collegamentoipertestuale"/>
@@ -731,7 +731,7 @@
               <w:rPr>
                 <w:noProof/>
               </w:rPr>
-              <w:instrText xml:space="preserve"> PAGEREF _Toc243069369 \h </w:instrText>
+              <w:instrText xml:space="preserve"> PAGEREF _Toc243073594 \h </w:instrText>
             </w:r>
             <w:r>
               <w:rPr>
@@ -768,7 +768,7 @@
               <w:noProof/>
             </w:rPr>
           </w:pPr>
-          <w:hyperlink w:anchor="_Toc243069370" w:history="1">
+          <w:hyperlink w:anchor="_Toc243073595" w:history="1">
             <w:r>
               <w:rPr>
                 <w:rStyle w:val="Collegamentoipertestuale"/>
@@ -792,7 +792,7 @@
               <w:rPr>
                 <w:noProof/>
               </w:rPr>
-              <w:instrText xml:space="preserve"> PAGEREF _Toc243069370 \h </w:instrText>
+              <w:instrText xml:space="preserve"> PAGEREF _Toc243073595 \h </w:instrText>
             </w:r>
             <w:r>
               <w:rPr>
@@ -829,7 +829,7 @@
               <w:noProof/>
             </w:rPr>
           </w:pPr>
-          <w:hyperlink w:anchor="_Toc243069371" w:history="1">
+          <w:hyperlink w:anchor="_Toc243073596" w:history="1">
             <w:r>
               <w:rPr>
                 <w:rStyle w:val="Collegamentoipertestuale"/>
@@ -853,7 +853,7 @@
               <w:rPr>
                 <w:noProof/>
               </w:rPr>
-              <w:instrText xml:space="preserve"> PAGEREF _Toc243069371 \h </w:instrText>
+              <w:instrText xml:space="preserve"> PAGEREF _Toc243073596 \h </w:instrText>
             </w:r>
             <w:r>
               <w:rPr>
@@ -890,7 +890,7 @@
               <w:noProof/>
             </w:rPr>
           </w:pPr>
-          <w:hyperlink w:anchor="_Toc243069372" w:history="1">
+          <w:hyperlink w:anchor="_Toc243073597" w:history="1">
             <w:r>
               <w:rPr>
                 <w:rStyle w:val="Collegamentoipertestuale"/>
@@ -914,7 +914,7 @@
               <w:rPr>
                 <w:noProof/>
               </w:rPr>
-              <w:instrText xml:space="preserve"> PAGEREF _Toc243069372 \h </w:instrText>
+              <w:instrText xml:space="preserve"> PAGEREF _Toc243073597 \h </w:instrText>
             </w:r>
             <w:r>
               <w:rPr>
@@ -951,7 +951,7 @@
               <w:noProof/>
             </w:rPr>
           </w:pPr>
-          <w:hyperlink w:anchor="_Toc243069373" w:history="1">
+          <w:hyperlink w:anchor="_Toc243073598" w:history="1">
             <w:r>
               <w:rPr>
                 <w:rStyle w:val="Collegamentoipertestuale"/>
@@ -975,7 +975,68 @@
               <w:rPr>
                 <w:noProof/>
               </w:rPr>
-              <w:instrText xml:space="preserve"> PAGEREF _Toc243069373 \h </w:instrText>
+              <w:instrText xml:space="preserve"> PAGEREF _Toc243073598 \h </w:instrText>
+            </w:r>
+            <w:r>
+              <w:rPr>
+                <w:noProof/>
+              </w:rPr>
+            </w:r>
+            <w:r>
+              <w:rPr>
+                <w:noProof/>
+              </w:rPr>
+              <w:fldChar w:fldCharType="separate"/>
+            </w:r>
+            <w:r>
+              <w:rPr>
+                <w:noProof/>
+              </w:rPr>
+              <w:t>9</w:t>
+            </w:r>
+            <w:r>
+              <w:rPr>
+                <w:noProof/>
+              </w:rPr>
+              <w:fldChar w:fldCharType="end"/>
+            </w:r>
+          </w:hyperlink>
+        </w:p>
+        <w:p>
+          <w:pPr>
+            <w:pStyle w:val="Sommario2"/>
+            <w:tabs>
+              <w:tab w:val="right" w:leader="dot" w:pos="9628"/>
+            </w:tabs>
+            <w:rPr>
+              <w:noProof/>
+            </w:rPr>
+          </w:pPr>
+          <w:hyperlink w:anchor="_Toc243073599" w:history="1">
+            <w:r>
+              <w:rPr>
+                <w:rStyle w:val="Collegamentoipertestuale"/>
+                <w:noProof/>
+              </w:rPr>
+              <w:t>4.4 Android: menu Tema e notifiche (versione 1.0.1)</w:t>
+            </w:r>
+            <w:r>
+              <w:rPr>
+                <w:noProof/>
+              </w:rPr>
+              <w:tab/>
+            </w:r>
+            <w:r>
+              <w:rPr>
+                <w:noProof/>
+              </w:rPr>
+              <w:fldChar w:fldCharType="begin"/>
+            </w:r>
+            <w:r>
+              <w:rPr>
+                <w:noProof/>
+              </w:rPr>
+              <w:instrText xml:space="preserve"> PAGEREF _Toc243073599 \h </w:instrText>
             </w:r>
             <w:r>
               <w:rPr>
@@ -1012,7 +1073,7 @@
               <w:noProof/>
             </w:rPr>
           </w:pPr>
-          <w:hyperlink w:anchor="_Toc243069374" w:history="1">
+          <w:hyperlink w:anchor="_Toc243073600" w:history="1">
             <w:r>
               <w:rPr>
                 <w:rStyle w:val="Collegamentoipertestuale"/>
@@ -1036,7 +1097,7 @@
               <w:rPr>
                 <w:noProof/>
               </w:rPr>
-              <w:instrText xml:space="preserve"> PAGEREF _Toc243069374 \h </w:instrText>
+              <w:instrText xml:space="preserve"> PAGEREF _Toc243073600 \h </w:instrText>
             </w:r>
             <w:r>
               <w:rPr>
@@ -1053,7 +1114,7 @@
               <w:rPr>
                 <w:noProof/>
               </w:rPr>
-              <w:t>9</w:t>
+              <w:t>10</w:t>
             </w:r>
             <w:r>
               <w:rPr>
@@ -1073,7 +1134,7 @@
               <w:noProof/>
             </w:rPr>
           </w:pPr>
-          <w:hyperlink w:anchor="_Toc243069375" w:history="1">
+          <w:hyperlink w:anchor="_Toc243073601" w:history="1">
             <w:r>
               <w:rPr>
                 <w:rStyle w:val="Collegamentoipertestuale"/>
@@ -1097,7 +1158,7 @@
               <w:rPr>
                 <w:noProof/>
               </w:rPr>
-              <w:instrText xml:space="preserve"> PAGEREF _Toc243069375 \h </w:instrText>
+              <w:instrText xml:space="preserve"> PAGEREF _Toc243073601 \h </w:instrText>
             </w:r>
             <w:r>
               <w:rPr>
@@ -1114,7 +1175,7 @@
               <w:rPr>
                 <w:noProof/>
               </w:rPr>
-              <w:t>9</w:t>
+              <w:t>10</w:t>
             </w:r>
             <w:r>
               <w:rPr>
@@ -1134,7 +1195,7 @@
               <w:noProof/>
             </w:rPr>
           </w:pPr>
-          <w:hyperlink w:anchor="_Toc243069376" w:history="1">
+          <w:hyperlink w:anchor="_Toc243073602" w:history="1">
             <w:r>
               <w:rPr>
                 <w:rStyle w:val="Collegamentoipertestuale"/>
@@ -1158,7 +1219,7 @@
               <w:rPr>
                 <w:noProof/>
               </w:rPr>
-              <w:instrText xml:space="preserve"> PAGEREF _Toc243069376 \h </w:instrText>
+              <w:instrText xml:space="preserve"> PAGEREF _Toc243073602 \h </w:instrText>
             </w:r>
             <w:r>
               <w:rPr>
@@ -1195,7 +1256,7 @@
               <w:noProof/>
             </w:rPr>
           </w:pPr>
-          <w:hyperlink w:anchor="_Toc243069377" w:history="1">
+          <w:hyperlink w:anchor="_Toc243073603" w:history="1">
             <w:r>
               <w:rPr>
                 <w:rStyle w:val="Collegamentoipertestuale"/>
@@ -1219,7 +1280,7 @@
               <w:rPr>
                 <w:noProof/>
               </w:rPr>
-              <w:instrText xml:space="preserve"> PAGEREF _Toc243069377 \h </w:instrText>
+              <w:instrText xml:space="preserve"> PAGEREF _Toc243073603 \h </w:instrText>
             </w:r>
             <w:r>
               <w:rPr>
@@ -1236,7 +1297,7 @@
               <w:rPr>
                 <w:noProof/>
               </w:rPr>
-              <w:t>10</w:t>
+              <w:t>11</w:t>
             </w:r>
             <w:r>
               <w:rPr>
@@ -1256,7 +1317,7 @@
               <w:noProof/>
             </w:rPr>
           </w:pPr>
-          <w:hyperlink w:anchor="_Toc243069378" w:history="1">
+          <w:hyperlink w:anchor="_Toc243073604" w:history="1">
             <w:r>
               <w:rPr>
                 <w:rStyle w:val="Collegamentoipertestuale"/>
@@ -1280,7 +1341,7 @@
               <w:rPr>
                 <w:noProof/>
               </w:rPr>
-              <w:instrText xml:space="preserve"> PAGEREF _Toc243069378 \h </w:instrText>
+              <w:instrText xml:space="preserve"> PAGEREF _Toc243073604 \h </w:instrText>
             </w:r>
             <w:r>
               <w:rPr>
@@ -1317,7 +1378,7 @@
               <w:noProof/>
             </w:rPr>
           </w:pPr>
-          <w:hyperlink w:anchor="_Toc243069379" w:history="1">
+          <w:hyperlink w:anchor="_Toc243073605" w:history="1">
             <w:r>
               <w:rPr>
                 <w:rStyle w:val="Collegamentoipertestuale"/>
@@ -1341,7 +1402,7 @@
               <w:rPr>
                 <w:noProof/>
               </w:rPr>
-              <w:instrText xml:space="preserve"> PAGEREF _Toc243069379 \h </w:instrText>
+              <w:instrText xml:space="preserve"> PAGEREF _Toc243073605 \h </w:instrText>
             </w:r>
             <w:r>
               <w:rPr>
@@ -1358,7 +1419,7 @@
               <w:rPr>
                 <w:noProof/>
               </w:rPr>
-              <w:t>11</w:t>
+              <w:t>12</w:t>
             </w:r>
             <w:r>
               <w:rPr>
@@ -1378,7 +1439,7 @@
               <w:noProof/>
             </w:rPr>
           </w:pPr>
-          <w:hyperlink w:anchor="_Toc243069380" w:history="1">
+          <w:hyperlink w:anchor="_Toc243073606" w:history="1">
             <w:r>
               <w:rPr>
                 <w:rStyle w:val="Collegamentoipertestuale"/>
@@ -1402,7 +1463,7 @@
               <w:rPr>
                 <w:noProof/>
               </w:rPr>
-              <w:instrText xml:space="preserve"> PAGEREF _Toc243069380 \h </w:instrText>
+              <w:instrText xml:space="preserve"> PAGEREF _Toc243073606 \h </w:instrText>
             </w:r>
             <w:r>
               <w:rPr>
@@ -1419,7 +1480,7 @@
               <w:rPr>
                 <w:noProof/>
               </w:rPr>
-              <w:t>11</w:t>
+              <w:t>12</w:t>
             </w:r>
             <w:r>
               <w:rPr>
@@ -1439,7 +1500,7 @@
               <w:noProof/>
             </w:rPr>
           </w:pPr>
-          <w:hyperlink w:anchor="_Toc243069381" w:history="1">
+          <w:hyperlink w:anchor="_Toc243073607" w:history="1">
             <w:r>
               <w:rPr>
                 <w:rStyle w:val="Collegamentoipertestuale"/>
@@ -1463,7 +1524,7 @@
               <w:rPr>
                 <w:noProof/>
               </w:rPr>
-              <w:instrText xml:space="preserve"> PAGEREF _Toc243069381 \h </w:instrText>
+              <w:instrText xml:space="preserve"> PAGEREF _Toc243073607 \h </w:instrText>
             </w:r>
             <w:r>
               <w:rPr>
@@ -1480,7 +1541,7 @@
               <w:rPr>
                 <w:noProof/>
               </w:rPr>
-              <w:t>11</w:t>
+              <w:t>12</w:t>
             </w:r>
             <w:r>
               <w:rPr>
@@ -1500,7 +1561,7 @@
               <w:noProof/>
             </w:rPr>
           </w:pPr>
-          <w:hyperlink w:anchor="_Toc243069382" w:history="1">
+          <w:hyperlink w:anchor="_Toc243073608" w:history="1">
             <w:r>
               <w:rPr>
                 <w:rStyle w:val="Collegamentoipertestuale"/>
@@ -1524,7 +1585,7 @@
               <w:rPr>
                 <w:noProof/>
               </w:rPr>
-              <w:instrText xml:space="preserve"> PAGEREF _Toc243069382 \h </w:instrText>
+              <w:instrText xml:space="preserve"> PAGEREF _Toc243073608 \h </w:instrText>
             </w:r>
             <w:r>
               <w:rPr>
@@ -1541,7 +1602,7 @@
               <w:rPr>
                 <w:noProof/>
               </w:rPr>
-              <w:t>11</w:t>
+              <w:t>12</w:t>
             </w:r>
             <w:r>
               <w:rPr>
@@ -1561,13 +1622,13 @@
               <w:noProof/>
             </w:rPr>
           </w:pPr>
-          <w:hyperlink w:anchor="_Toc243069383" w:history="1">
+          <w:hyperlink w:anchor="_Toc243073609" w:history="1">
             <w:r>
               <w:rPr>
                 <w:rStyle w:val="Collegamentoipertestuale"/>
                 <w:noProof/>
               </w:rPr>
-              <w:t>6.4 Ruoli</w:t>
+              <w:t>6.4 Release 1.0.1</w:t>
             </w:r>
             <w:r>
               <w:rPr>
@@ -1585,7 +1646,7 @@
               <w:rPr>
                 <w:noProof/>
               </w:rPr>
-              <w:instrText xml:space="preserve"> PAGEREF _Toc243069383 \h </w:instrText>
+              <w:instrText xml:space="preserve"> PAGEREF _Toc243073609 \h </w:instrText>
             </w:r>
             <w:r>
               <w:rPr>
@@ -1602,7 +1663,68 @@
               <w:rPr>
                 <w:noProof/>
               </w:rPr>
-              <w:t>12</w:t>
+              <w:t>13</w:t>
+            </w:r>
+            <w:r>
+              <w:rPr>
+                <w:noProof/>
+              </w:rPr>
+              <w:fldChar w:fldCharType="end"/>
+            </w:r>
+          </w:hyperlink>
+        </w:p>
+        <w:p>
+          <w:pPr>
+            <w:pStyle w:val="Sommario2"/>
+            <w:tabs>
+              <w:tab w:val="right" w:leader="dot" w:pos="9628"/>
+            </w:tabs>
+            <w:rPr>
+              <w:noProof/>
+            </w:rPr>
+          </w:pPr>
+          <w:hyperlink w:anchor="_Toc243073610" w:history="1">
+            <w:r>
+              <w:rPr>
+                <w:rStyle w:val="Collegamentoipertestuale"/>
+                <w:noProof/>
+              </w:rPr>
+              <w:t>6.5 Ruoli</w:t>
+            </w:r>
+            <w:r>
+              <w:rPr>
+                <w:noProof/>
+              </w:rPr>
+              <w:tab/>
+            </w:r>
+            <w:r>
+              <w:rPr>
+                <w:noProof/>
+              </w:rPr>
+              <w:fldChar w:fldCharType="begin"/>
+            </w:r>
+            <w:r>
+              <w:rPr>
+                <w:noProof/>
+              </w:rPr>
+              <w:instrText xml:space="preserve"> PAGEREF _Toc243073610 \h </w:instrText>
+            </w:r>
+            <w:r>
+              <w:rPr>
+                <w:noProof/>
+              </w:rPr>
+            </w:r>
+            <w:r>
+              <w:rPr>
+                <w:noProof/>
+              </w:rPr>
+              <w:fldChar w:fldCharType="separate"/>
+            </w:r>
+            <w:r>
+              <w:rPr>
+                <w:noProof/>
+              </w:rPr>
+              <w:t>13</w:t>
             </w:r>
             <w:r>
               <w:rPr>
@@ -1622,7 +1744,7 @@
               <w:noProof/>
             </w:rPr>
           </w:pPr>
-          <w:hyperlink w:anchor="_Toc243069384" w:history="1">
+          <w:hyperlink w:anchor="_Toc243073611" w:history="1">
             <w:r>
               <w:rPr>
                 <w:rStyle w:val="Collegamentoipertestuale"/>
@@ -1646,7 +1768,7 @@
               <w:rPr>
                 <w:noProof/>
               </w:rPr>
-              <w:instrText xml:space="preserve"> PAGEREF _Toc243069384 \h </w:instrText>
+              <w:instrText xml:space="preserve"> PAGEREF _Toc243073611 \h </w:instrText>
             </w:r>
             <w:r>
               <w:rPr>
@@ -1663,7 +1785,7 @@
               <w:rPr>
                 <w:noProof/>
               </w:rPr>
-              <w:t>12</w:t>
+              <w:t>13</w:t>
             </w:r>
             <w:r>
               <w:rPr>
@@ -1683,7 +1805,7 @@
               <w:noProof/>
             </w:rPr>
           </w:pPr>
-          <w:hyperlink w:anchor="_Toc243069385" w:history="1">
+          <w:hyperlink w:anchor="_Toc243073612" w:history="1">
             <w:r>
               <w:rPr>
                 <w:rStyle w:val="Collegamentoipertestuale"/>
@@ -1707,7 +1829,7 @@
               <w:rPr>
                 <w:noProof/>
               </w:rPr>
-              <w:instrText xml:space="preserve"> PAGEREF _Toc243069385 \h </w:instrText>
+              <w:instrText xml:space="preserve"> PAGEREF _Toc243073612 \h </w:instrText>
             </w:r>
             <w:r>
               <w:rPr>
@@ -1744,7 +1866,7 @@
               <w:noProof/>
             </w:rPr>
           </w:pPr>
-          <w:hyperlink w:anchor="_Toc243069386" w:history="1">
+          <w:hyperlink w:anchor="_Toc243073613" w:history="1">
             <w:r>
               <w:rPr>
                 <w:rStyle w:val="Collegamentoipertestuale"/>
@@ -1768,7 +1890,7 @@
               <w:rPr>
                 <w:noProof/>
               </w:rPr>
-              <w:instrText xml:space="preserve"> PAGEREF _Toc243069386 \h </w:instrText>
+              <w:instrText xml:space="preserve"> PAGEREF _Toc243073613 \h </w:instrText>
             </w:r>
             <w:r>
               <w:rPr>
@@ -1785,7 +1907,7 @@
               <w:rPr>
                 <w:noProof/>
               </w:rPr>
-              <w:t>13</w:t>
+              <w:t>14</w:t>
             </w:r>
             <w:r>
               <w:rPr>
@@ -1811,7 +1933,7 @@
       <w:pPr>
         <w:pStyle w:val="Titolo1"/>
       </w:pPr>
-      <w:bookmarkStart w:id="0" w:name="_Toc243069360"/>
+      <w:bookmarkStart w:id="0" w:name="_Toc243073585"/>
       <w:r>
         <w:t>1. In breve</w:t>
       </w:r>
@@ -1959,7 +2081,27 @@
         <w:t>nuovo repository GitHub</w:t>
       </w:r>
       <w:r>
-        <w:t xml:space="preserve"> akito996/pdfz con la storia ripartita da zero.</w:t>
+        <w:t xml:space="preserve"> akito996/pdfz con la storia ripartita da zero;</w:t>
+      </w:r>
+    </w:p>
+    <w:p>
+      <w:pPr>
+        <w:pStyle w:val="Paragrafoelenco"/>
+        <w:numPr>
+          <w:ilvl w:val="0"/>
+          <w:numId w:val="2"/>
+        </w:numPr>
+        <w:spacing w:after="60"/>
+      </w:pPr>
+      <w:r>
+        <w:rPr>
+          <w:b/>
+          <w:bCs/>
+        </w:rPr>
+        <w:t>versione 1.0.1</w:t>
+      </w:r>
+      <w:r>
+        <w:t>: menu Tema e campanella delle notifiche corretti su telefono e tablet (vedi 4.4).</w:t>
       </w:r>
     </w:p>
     <w:p>
@@ -1982,7 +2124,7 @@
       <w:pPr>
         <w:pStyle w:val="Titolo1"/>
       </w:pPr>
-      <w:bookmarkStart w:id="1" w:name="_Toc243069361"/>
+      <w:bookmarkStart w:id="1" w:name="_Toc243073586"/>
       <w:r>
         <w:t>2. Nuovo marchio</w:t>
       </w:r>
@@ -1992,7 +2134,7 @@
       <w:pPr>
         <w:pStyle w:val="Titolo2"/>
       </w:pPr>
-      <w:bookmarkStart w:id="2" w:name="_Toc243069362"/>
+      <w:bookmarkStart w:id="2" w:name="_Toc243073587"/>
       <w:r>
         <w:t>2.1 Nomi e identificativi</w:t>
       </w:r>
@@ -2538,7 +2680,7 @@
       <w:pPr>
         <w:pStyle w:val="Titolo2"/>
       </w:pPr>
-      <w:bookmarkStart w:id="3" w:name="_Toc243069363"/>
+      <w:bookmarkStart w:id="3" w:name="_Toc243073588"/>
       <w:r>
         <w:t>2.2 Colori</w:t>
       </w:r>
@@ -2933,7 +3075,7 @@
       <w:pPr>
         <w:pStyle w:val="Titolo2"/>
       </w:pPr>
-      <w:bookmarkStart w:id="4" w:name="_Toc243069364"/>
+      <w:bookmarkStart w:id="4" w:name="_Toc243073589"/>
       <w:r>
         <w:t>2.3 Icona in uso: 17 «Foglio oro» (serie 4)</w:t>
       </w:r>
@@ -2967,7 +3109,7 @@
           <w:noProof/>
         </w:rPr>
         <w:drawing>
-          <wp:inline distT="0" distB="0" distL="0" distR="0" wp14:anchorId="5551E4C6" wp14:editId="41C266A8">
+          <wp:inline distT="0" distB="0" distL="0" distR="0" wp14:anchorId="4C992B73" wp14:editId="2B24B01F">
             <wp:extent cx="5334000" cy="5895975"/>
             <wp:effectExtent l="0" t="0" r="0" b="0"/>
             <wp:docPr id="2" name="Immagine 2"/>
@@ -3387,7 +3529,7 @@
       <w:pPr>
         <w:pStyle w:val="Titolo2"/>
       </w:pPr>
-      <w:bookmarkStart w:id="5" w:name="_Toc243069365"/>
+      <w:bookmarkStart w:id="5" w:name="_Toc243073590"/>
       <w:r>
         <w:t>2.4 Serie 3, non scelta (la 11 è diventata la serie 4)</w:t>
       </w:r>
@@ -3411,7 +3553,7 @@
           <w:noProof/>
         </w:rPr>
         <w:drawing>
-          <wp:inline distT="0" distB="0" distL="0" distR="0" wp14:anchorId="59E915FE" wp14:editId="5DFD9EBE">
+          <wp:inline distT="0" distB="0" distL="0" distR="0" wp14:anchorId="39856AD5" wp14:editId="4E60317D">
             <wp:extent cx="5905500" cy="4133850"/>
             <wp:effectExtent l="0" t="0" r="0" b="0"/>
             <wp:docPr id="3" name="Immagine 3"/>
@@ -4097,7 +4239,7 @@
       <w:pPr>
         <w:pStyle w:val="Titolo2"/>
       </w:pPr>
-      <w:bookmarkStart w:id="6" w:name="_Toc243069366"/>
+      <w:bookmarkStart w:id="6" w:name="_Toc243073591"/>
       <w:r>
         <w:t>2.5 Serie 2, non scelta</w:t>
       </w:r>
@@ -4121,7 +4263,7 @@
           <w:noProof/>
         </w:rPr>
         <w:drawing>
-          <wp:inline distT="0" distB="0" distL="0" distR="0" wp14:anchorId="65BFC752" wp14:editId="094E8F00">
+          <wp:inline distT="0" distB="0" distL="0" distR="0" wp14:anchorId="5B576685" wp14:editId="4304DB8D">
             <wp:extent cx="5905500" cy="4133850"/>
             <wp:effectExtent l="0" t="0" r="0" b="0"/>
             <wp:docPr id="4" name="Immagine 4"/>
@@ -4841,7 +4983,7 @@
       <w:pPr>
         <w:pStyle w:val="Titolo2"/>
       </w:pPr>
-      <w:bookmarkStart w:id="7" w:name="_Toc243069367"/>
+      <w:bookmarkStart w:id="7" w:name="_Toc243073592"/>
       <w:r>
         <w:t>2.6 Serie 1, scartata</w:t>
       </w:r>
@@ -4865,7 +5007,7 @@
           <w:noProof/>
         </w:rPr>
         <w:drawing>
-          <wp:inline distT="0" distB="0" distL="0" distR="0" wp14:anchorId="25D0B04B" wp14:editId="5207F70D">
+          <wp:inline distT="0" distB="0" distL="0" distR="0" wp14:anchorId="2C6784E5" wp14:editId="1A620269">
             <wp:extent cx="4000500" cy="2800350"/>
             <wp:effectExtent l="0" t="0" r="0" b="0"/>
             <wp:docPr id="5" name="Immagine 5"/>
@@ -4924,7 +5066,7 @@
       <w:pPr>
         <w:pStyle w:val="Titolo2"/>
       </w:pPr>
-      <w:bookmarkStart w:id="8" w:name="_Toc243069368"/>
+      <w:bookmarkStart w:id="8" w:name="_Toc243073593"/>
       <w:r>
         <w:t>2.7 Verifica dei marchi registrati</w:t>
       </w:r>
@@ -5176,7 +5318,7 @@
       <w:pPr>
         <w:pStyle w:val="Titolo1"/>
       </w:pPr>
-      <w:bookmarkStart w:id="9" w:name="_Toc243069369"/>
+      <w:bookmarkStart w:id="9" w:name="_Toc243073594"/>
       <w:r>
         <w:t>3. Temi colore</w:t>
       </w:r>
@@ -5210,7 +5352,7 @@
           <w:noProof/>
         </w:rPr>
         <w:drawing>
-          <wp:inline distT="0" distB="0" distL="0" distR="0" wp14:anchorId="169D8458" wp14:editId="33EAD68C">
+          <wp:inline distT="0" distB="0" distL="0" distR="0" wp14:anchorId="3D0338FB" wp14:editId="3FADCFEC">
             <wp:extent cx="4572000" cy="3429000"/>
             <wp:effectExtent l="0" t="0" r="0" b="0"/>
             <wp:docPr id="6" name="Immagine 6"/>
@@ -5920,7 +6062,7 @@
       <w:pPr>
         <w:pStyle w:val="Titolo1"/>
       </w:pPr>
-      <w:bookmarkStart w:id="10" w:name="_Toc243069370"/>
+      <w:bookmarkStart w:id="10" w:name="_Toc243073595"/>
       <w:r>
         <w:t>4. Correzione: avvisi «come JavaScript»</w:t>
       </w:r>
@@ -5930,7 +6072,7 @@
       <w:pPr>
         <w:pStyle w:val="Titolo2"/>
       </w:pPr>
-      <w:bookmarkStart w:id="11" w:name="_Toc243069371"/>
+      <w:bookmarkStart w:id="11" w:name="_Toc243073596"/>
       <w:r>
         <w:t>4.1 Il problema</w:t>
       </w:r>
@@ -6333,7 +6475,7 @@
       <w:pPr>
         <w:pStyle w:val="Titolo2"/>
       </w:pPr>
-      <w:bookmarkStart w:id="12" w:name="_Toc243069372"/>
+      <w:bookmarkStart w:id="12" w:name="_Toc243073597"/>
       <w:r>
         <w:t>4.2 La soluzione</w:t>
       </w:r>
@@ -6466,7 +6608,7 @@
           <w:noProof/>
         </w:rPr>
         <w:drawing>
-          <wp:inline distT="0" distB="0" distL="0" distR="0" wp14:anchorId="533583A3" wp14:editId="4707E8B2">
+          <wp:inline distT="0" distB="0" distL="0" distR="0" wp14:anchorId="0A0E694E" wp14:editId="65EA7D45">
             <wp:extent cx="4572000" cy="3429000"/>
             <wp:effectExtent l="0" t="0" r="0" b="0"/>
             <wp:docPr id="7" name="Immagine 7"/>
@@ -6525,7 +6667,7 @@
       <w:pPr>
         <w:pStyle w:val="Titolo2"/>
       </w:pPr>
-      <w:bookmarkStart w:id="13" w:name="_Toc243069373"/>
+      <w:bookmarkStart w:id="13" w:name="_Toc243073598"/>
       <w:r>
         <w:t>4.3 Verifiche</w:t>
       </w:r>
@@ -6570,13 +6712,348 @@
     </w:p>
     <w:p>
       <w:pPr>
+        <w:pStyle w:val="Titolo2"/>
+      </w:pPr>
+      <w:bookmarkStart w:id="14" w:name="_Toc243073599"/>
+      <w:r>
+        <w:t>4.4 Android: menu Tema e notifiche (versione 1.0.1)</w:t>
+      </w:r>
+      <w:bookmarkEnd w:id="14"/>
+    </w:p>
+    <w:tbl>
+      <w:tblPr>
+        <w:tblW w:w="9638" w:type="dxa"/>
+        <w:tblBorders>
+          <w:top w:val="single" w:sz="4" w:space="0" w:color="auto"/>
+          <w:left w:val="single" w:sz="4" w:space="0" w:color="auto"/>
+          <w:bottom w:val="single" w:sz="4" w:space="0" w:color="auto"/>
+          <w:right w:val="single" w:sz="4" w:space="0" w:color="auto"/>
+          <w:insideH w:val="single" w:sz="4" w:space="0" w:color="auto"/>
+          <w:insideV w:val="single" w:sz="4" w:space="0" w:color="auto"/>
+        </w:tblBorders>
+        <w:tblLook w:val="04A0" w:firstRow="1" w:lastRow="0" w:firstColumn="1" w:lastColumn="0" w:noHBand="0" w:noVBand="1"/>
+      </w:tblPr>
+      <w:tblGrid>
+        <w:gridCol w:w="2313"/>
+        <w:gridCol w:w="3662"/>
+        <w:gridCol w:w="3663"/>
+      </w:tblGrid>
+      <w:tr>
+        <w:trPr>
+          <w:tblHeader/>
+        </w:trPr>
+        <w:tc>
+          <w:tcPr>
+            <w:tcW w:w="2313" w:type="dxa"/>
+            <w:tcBorders>
+              <w:top w:val="single" w:sz="4" w:space="0" w:color="D4CEC7"/>
+              <w:left w:val="single" w:sz="4" w:space="0" w:color="D4CEC7"/>
+              <w:bottom w:val="single" w:sz="4" w:space="0" w:color="D4CEC7"/>
+              <w:right w:val="single" w:sz="4" w:space="0" w:color="D4CEC7"/>
+            </w:tcBorders>
+            <w:shd w:val="clear" w:color="auto" w:fill="B3122B"/>
+            <w:tcMar>
+              <w:top w:w="60" w:type="dxa"/>
+              <w:left w:w="100" w:type="dxa"/>
+              <w:bottom w:w="60" w:type="dxa"/>
+              <w:right w:w="100" w:type="dxa"/>
+            </w:tcMar>
+          </w:tcPr>
+          <w:p>
+            <w:r>
+              <w:rPr>
+                <w:b/>
+                <w:bCs/>
+                <w:color w:val="FFFFFF"/>
+              </w:rPr>
+              <w:t>Problema</w:t>
+            </w:r>
+          </w:p>
+        </w:tc>
+        <w:tc>
+          <w:tcPr>
+            <w:tcW w:w="3662" w:type="dxa"/>
+            <w:tcBorders>
+              <w:top w:val="single" w:sz="4" w:space="0" w:color="D4CEC7"/>
+              <w:left w:val="single" w:sz="4" w:space="0" w:color="D4CEC7"/>
+              <w:bottom w:val="single" w:sz="4" w:space="0" w:color="D4CEC7"/>
+              <w:right w:val="single" w:sz="4" w:space="0" w:color="D4CEC7"/>
+            </w:tcBorders>
+            <w:shd w:val="clear" w:color="auto" w:fill="B3122B"/>
+            <w:tcMar>
+              <w:top w:w="60" w:type="dxa"/>
+              <w:left w:w="100" w:type="dxa"/>
+              <w:bottom w:w="60" w:type="dxa"/>
+              <w:right w:w="100" w:type="dxa"/>
+            </w:tcMar>
+          </w:tcPr>
+          <w:p>
+            <w:r>
+              <w:rPr>
+                <w:b/>
+                <w:bCs/>
+                <w:color w:val="FFFFFF"/>
+              </w:rPr>
+              <w:t>Causa</w:t>
+            </w:r>
+          </w:p>
+        </w:tc>
+        <w:tc>
+          <w:tcPr>
+            <w:tcW w:w="3663" w:type="dxa"/>
+            <w:tcBorders>
+              <w:top w:val="single" w:sz="4" w:space="0" w:color="D4CEC7"/>
+              <w:left w:val="single" w:sz="4" w:space="0" w:color="D4CEC7"/>
+              <w:bottom w:val="single" w:sz="4" w:space="0" w:color="D4CEC7"/>
+              <w:right w:val="single" w:sz="4" w:space="0" w:color="D4CEC7"/>
+            </w:tcBorders>
+            <w:shd w:val="clear" w:color="auto" w:fill="B3122B"/>
+            <w:tcMar>
+              <w:top w:w="60" w:type="dxa"/>
+              <w:left w:w="100" w:type="dxa"/>
+              <w:bottom w:w="60" w:type="dxa"/>
+              <w:right w:w="100" w:type="dxa"/>
+            </w:tcMar>
+          </w:tcPr>
+          <w:p>
+            <w:r>
+              <w:rPr>
+                <w:b/>
+                <w:bCs/>
+                <w:color w:val="FFFFFF"/>
+              </w:rPr>
+              <w:t>Soluzione</w:t>
+            </w:r>
+          </w:p>
+        </w:tc>
+      </w:tr>
+      <w:tr>
+        <w:tc>
+          <w:tcPr>
+            <w:tcW w:w="2313" w:type="dxa"/>
+            <w:tcBorders>
+              <w:top w:val="single" w:sz="4" w:space="0" w:color="D4CEC7"/>
+              <w:left w:val="single" w:sz="4" w:space="0" w:color="D4CEC7"/>
+              <w:bottom w:val="single" w:sz="4" w:space="0" w:color="D4CEC7"/>
+              <w:right w:val="single" w:sz="4" w:space="0" w:color="D4CEC7"/>
+            </w:tcBorders>
+            <w:tcMar>
+              <w:top w:w="60" w:type="dxa"/>
+              <w:left w:w="100" w:type="dxa"/>
+              <w:bottom w:w="60" w:type="dxa"/>
+              <w:right w:w="100" w:type="dxa"/>
+            </w:tcMar>
+          </w:tcPr>
+          <w:p>
+            <w:r>
+              <w:t>Il menu Tema «non si apre»</w:t>
+            </w:r>
+          </w:p>
+        </w:tc>
+        <w:tc>
+          <w:tcPr>
+            <w:tcW w:w="3662" w:type="dxa"/>
+            <w:tcBorders>
+              <w:top w:val="single" w:sz="4" w:space="0" w:color="D4CEC7"/>
+              <w:left w:val="single" w:sz="4" w:space="0" w:color="D4CEC7"/>
+              <w:bottom w:val="single" w:sz="4" w:space="0" w:color="D4CEC7"/>
+              <w:right w:val="single" w:sz="4" w:space="0" w:color="D4CEC7"/>
+            </w:tcBorders>
+            <w:tcMar>
+              <w:top w:w="60" w:type="dxa"/>
+              <w:left w:w="100" w:type="dxa"/>
+              <w:bottom w:w="60" w:type="dxa"/>
+              <w:right w:w="100" w:type="dxa"/>
+            </w:tcMar>
+          </w:tcPr>
+          <w:p>
+            <w:r>
+              <w:t>sul telefono la barra in alto scorre in orizzontale e taglia ciò che sporge: il menu si apriva ma restava nascosto</w:t>
+            </w:r>
+          </w:p>
+        </w:tc>
+        <w:tc>
+          <w:tcPr>
+            <w:tcW w:w="3663" w:type="dxa"/>
+            <w:tcBorders>
+              <w:top w:val="single" w:sz="4" w:space="0" w:color="D4CEC7"/>
+              <w:left w:val="single" w:sz="4" w:space="0" w:color="D4CEC7"/>
+              <w:bottom w:val="single" w:sz="4" w:space="0" w:color="D4CEC7"/>
+              <w:right w:val="single" w:sz="4" w:space="0" w:color="D4CEC7"/>
+            </w:tcBorders>
+            <w:tcMar>
+              <w:top w:w="60" w:type="dxa"/>
+              <w:left w:w="100" w:type="dxa"/>
+              <w:bottom w:w="60" w:type="dxa"/>
+              <w:right w:w="100" w:type="dxa"/>
+            </w:tcMar>
+          </w:tcPr>
+          <w:p>
+            <w:r>
+              <w:t>nuovo componente Popover: i menu della barra si disegnano fuori dalla barra, sotto il pulsante (vale anche per Notifiche e Download)</w:t>
+            </w:r>
+          </w:p>
+        </w:tc>
+      </w:tr>
+      <w:tr>
+        <w:tc>
+          <w:tcPr>
+            <w:tcW w:w="2313" w:type="dxa"/>
+            <w:tcBorders>
+              <w:top w:val="single" w:sz="4" w:space="0" w:color="D4CEC7"/>
+              <w:left w:val="single" w:sz="4" w:space="0" w:color="D4CEC7"/>
+              <w:bottom w:val="single" w:sz="4" w:space="0" w:color="D4CEC7"/>
+              <w:right w:val="single" w:sz="4" w:space="0" w:color="D4CEC7"/>
+            </w:tcBorders>
+            <w:tcMar>
+              <w:top w:w="60" w:type="dxa"/>
+              <w:left w:w="100" w:type="dxa"/>
+              <w:bottom w:w="60" w:type="dxa"/>
+              <w:right w:w="100" w:type="dxa"/>
+            </w:tcMar>
+          </w:tcPr>
+          <w:p>
+            <w:r>
+              <w:t>Le notifiche spariscono e resta il pallino rosso</w:t>
+            </w:r>
+          </w:p>
+        </w:tc>
+        <w:tc>
+          <w:tcPr>
+            <w:tcW w:w="3662" w:type="dxa"/>
+            <w:tcBorders>
+              <w:top w:val="single" w:sz="4" w:space="0" w:color="D4CEC7"/>
+              <w:left w:val="single" w:sz="4" w:space="0" w:color="D4CEC7"/>
+              <w:bottom w:val="single" w:sz="4" w:space="0" w:color="D4CEC7"/>
+              <w:right w:val="single" w:sz="4" w:space="0" w:color="D4CEC7"/>
+            </w:tcBorders>
+            <w:tcMar>
+              <w:top w:w="60" w:type="dxa"/>
+              <w:left w:w="100" w:type="dxa"/>
+              <w:bottom w:w="60" w:type="dxa"/>
+              <w:right w:w="100" w:type="dxa"/>
+            </w:tcMar>
+          </w:tcPr>
+          <w:p>
+            <w:r>
+              <w:t>le novità si segnavano come lette solo con «Chiudi»; se la finestra spariva, il pallino restava</w:t>
+            </w:r>
+          </w:p>
+        </w:tc>
+        <w:tc>
+          <w:tcPr>
+            <w:tcW w:w="3663" w:type="dxa"/>
+            <w:tcBorders>
+              <w:top w:val="single" w:sz="4" w:space="0" w:color="D4CEC7"/>
+              <w:left w:val="single" w:sz="4" w:space="0" w:color="D4CEC7"/>
+              <w:bottom w:val="single" w:sz="4" w:space="0" w:color="D4CEC7"/>
+              <w:right w:val="single" w:sz="4" w:space="0" w:color="D4CEC7"/>
+            </w:tcBorders>
+            <w:tcMar>
+              <w:top w:w="60" w:type="dxa"/>
+              <w:left w:w="100" w:type="dxa"/>
+              <w:bottom w:w="60" w:type="dxa"/>
+              <w:right w:w="100" w:type="dxa"/>
+            </w:tcMar>
+          </w:tcPr>
+          <w:p>
+            <w:r>
+              <w:t>la finestra resta aperta finché la chiudi; le novità contano come lette appena la apri</w:t>
+            </w:r>
+          </w:p>
+        </w:tc>
+      </w:tr>
+      <w:tr>
+        <w:tc>
+          <w:tcPr>
+            <w:tcW w:w="2313" w:type="dxa"/>
+            <w:tcBorders>
+              <w:top w:val="single" w:sz="4" w:space="0" w:color="D4CEC7"/>
+              <w:left w:val="single" w:sz="4" w:space="0" w:color="D4CEC7"/>
+              <w:bottom w:val="single" w:sz="4" w:space="0" w:color="D4CEC7"/>
+              <w:right w:val="single" w:sz="4" w:space="0" w:color="D4CEC7"/>
+            </w:tcBorders>
+            <w:tcMar>
+              <w:top w:w="60" w:type="dxa"/>
+              <w:left w:w="100" w:type="dxa"/>
+              <w:bottom w:w="60" w:type="dxa"/>
+              <w:right w:w="100" w:type="dxa"/>
+            </w:tcMar>
+          </w:tcPr>
+          <w:p>
+            <w:r>
+              <w:t>Non si leggono tutte le notifiche</w:t>
+            </w:r>
+          </w:p>
+        </w:tc>
+        <w:tc>
+          <w:tcPr>
+            <w:tcW w:w="3662" w:type="dxa"/>
+            <w:tcBorders>
+              <w:top w:val="single" w:sz="4" w:space="0" w:color="D4CEC7"/>
+              <w:left w:val="single" w:sz="4" w:space="0" w:color="D4CEC7"/>
+              <w:bottom w:val="single" w:sz="4" w:space="0" w:color="D4CEC7"/>
+              <w:right w:val="single" w:sz="4" w:space="0" w:color="D4CEC7"/>
+            </w:tcBorders>
+            <w:tcMar>
+              <w:top w:w="60" w:type="dxa"/>
+              <w:left w:w="100" w:type="dxa"/>
+              <w:bottom w:w="60" w:type="dxa"/>
+              <w:right w:w="100" w:type="dxa"/>
+            </w:tcMar>
+          </w:tcPr>
+          <w:p>
+            <w:r>
+              <w:t>si vedevano solo 3 novità; i messaggi brevi in basso sparivano</w:t>
+            </w:r>
+          </w:p>
+        </w:tc>
+        <w:tc>
+          <w:tcPr>
+            <w:tcW w:w="3663" w:type="dxa"/>
+            <w:tcBorders>
+              <w:top w:val="single" w:sz="4" w:space="0" w:color="D4CEC7"/>
+              <w:left w:val="single" w:sz="4" w:space="0" w:color="D4CEC7"/>
+              <w:bottom w:val="single" w:sz="4" w:space="0" w:color="D4CEC7"/>
+              <w:right w:val="single" w:sz="4" w:space="0" w:color="D4CEC7"/>
+            </w:tcBorders>
+            <w:tcMar>
+              <w:top w:w="60" w:type="dxa"/>
+              <w:left w:w="100" w:type="dxa"/>
+              <w:bottom w:w="60" w:type="dxa"/>
+              <w:right w:w="100" w:type="dxa"/>
+            </w:tcMar>
+          </w:tcPr>
+          <w:p>
+            <w:r>
+              <w:t>elenco completo delle novità e «Messaggi recenti» della sessione nella campanella; i messaggi restano più a lungo sullo schermo (6 s, errori 10 s)</w:t>
+            </w:r>
+          </w:p>
+        </w:tc>
+      </w:tr>
+    </w:tbl>
+    <w:p>
+      <w:pPr>
+        <w:spacing w:after="120"/>
+      </w:pPr>
+    </w:p>
+    <w:p>
+      <w:pPr>
+        <w:spacing w:after="120"/>
+      </w:pPr>
+      <w:r>
+        <w:t>Provato nel browser in vista telefono: menu Tema visibile, campanella aperta per oltre 20 secondi con tutte le 8 voci, messaggio rileggibile. La chiusura dopo pochi secondi sul telefono vero non è stata riprodotta nel browser: la nuova struttura toglie le cause possibili. Pubblicate con la versione 1.0.1 (tag v1.0.1).</w:t>
+      </w:r>
+    </w:p>
+    <w:p>
+      <w:pPr>
         <w:pStyle w:val="Titolo1"/>
       </w:pPr>
-      <w:bookmarkStart w:id="14" w:name="_Toc243069374"/>
+      <w:bookmarkStart w:id="15" w:name="_Toc243073600"/>
       <w:r>
         <w:t>5. Decisioni</w:t>
       </w:r>
-      <w:bookmarkEnd w:id="14"/>
+      <w:bookmarkEnd w:id="15"/>
     </w:p>
     <w:p>
       <w:pPr>
@@ -6590,11 +7067,11 @@
       <w:pPr>
         <w:pStyle w:val="Titolo2"/>
       </w:pPr>
-      <w:bookmarkStart w:id="15" w:name="_Toc243069375"/>
+      <w:bookmarkStart w:id="16" w:name="_Toc243073601"/>
       <w:r>
         <w:t>5.1 Canale degli aggiornamenti</w:t>
       </w:r>
-      <w:bookmarkEnd w:id="15"/>
+      <w:bookmarkEnd w:id="16"/>
     </w:p>
     <w:p>
       <w:pPr>
@@ -7097,11 +7574,11 @@
       <w:pPr>
         <w:pStyle w:val="Titolo2"/>
       </w:pPr>
-      <w:bookmarkStart w:id="16" w:name="_Toc243069376"/>
+      <w:bookmarkStart w:id="17" w:name="_Toc243073602"/>
       <w:r>
         <w:t>5.2 Storia del repository</w:t>
       </w:r>
-      <w:bookmarkEnd w:id="16"/>
+      <w:bookmarkEnd w:id="17"/>
     </w:p>
     <w:p>
       <w:pPr>
@@ -7604,11 +8081,11 @@
       <w:pPr>
         <w:pStyle w:val="Titolo2"/>
       </w:pPr>
-      <w:bookmarkStart w:id="17" w:name="_Toc243069377"/>
+      <w:bookmarkStart w:id="18" w:name="_Toc243073603"/>
       <w:r>
         <w:t>5.3 Identificativi del prodotto</w:t>
       </w:r>
-      <w:bookmarkEnd w:id="17"/>
+      <w:bookmarkEnd w:id="18"/>
     </w:p>
     <w:p>
       <w:pPr>
@@ -8104,11 +8581,11 @@
       <w:pPr>
         <w:pStyle w:val="Titolo2"/>
       </w:pPr>
-      <w:bookmarkStart w:id="18" w:name="_Toc243069378"/>
+      <w:bookmarkStart w:id="19" w:name="_Toc243073604"/>
       <w:r>
         <w:t>5.4 Avvisi e domande</w:t>
       </w:r>
-      <w:bookmarkEnd w:id="18"/>
+      <w:bookmarkEnd w:id="19"/>
     </w:p>
     <w:p>
       <w:pPr>
@@ -8611,21 +9088,21 @@
       <w:pPr>
         <w:pStyle w:val="Titolo1"/>
       </w:pPr>
-      <w:bookmarkStart w:id="19" w:name="_Toc243069379"/>
+      <w:bookmarkStart w:id="20" w:name="_Toc243073605"/>
       <w:r>
         <w:t>6. Come si lavora</w:t>
       </w:r>
-      <w:bookmarkEnd w:id="19"/>
+      <w:bookmarkEnd w:id="20"/>
     </w:p>
     <w:p>
       <w:pPr>
         <w:pStyle w:val="Titolo2"/>
       </w:pPr>
-      <w:bookmarkStart w:id="20" w:name="_Toc243069380"/>
+      <w:bookmarkStart w:id="21" w:name="_Toc243073606"/>
       <w:r>
         <w:t>6.1 Comandi</w:t>
       </w:r>
-      <w:bookmarkEnd w:id="20"/>
+      <w:bookmarkEnd w:id="21"/>
     </w:p>
     <w:p>
       <w:pPr>
@@ -8691,11 +9168,11 @@
       <w:pPr>
         <w:pStyle w:val="Titolo2"/>
       </w:pPr>
-      <w:bookmarkStart w:id="21" w:name="_Toc243069381"/>
+      <w:bookmarkStart w:id="22" w:name="_Toc243073607"/>
       <w:r>
         <w:t>6.2 Pubblicare una versione</w:t>
       </w:r>
-      <w:bookmarkEnd w:id="21"/>
+      <w:bookmarkEnd w:id="22"/>
     </w:p>
     <w:p>
       <w:pPr>
@@ -8819,11 +9296,11 @@
       <w:pPr>
         <w:pStyle w:val="Titolo2"/>
       </w:pPr>
-      <w:bookmarkStart w:id="22" w:name="_Toc243069382"/>
+      <w:bookmarkStart w:id="23" w:name="_Toc243073608"/>
       <w:r>
         <w:t>6.3 Release 1.0.0 (pubblicata il 16 ottobre 2026)</w:t>
       </w:r>
-      <w:bookmarkEnd w:id="22"/>
+      <w:bookmarkEnd w:id="23"/>
     </w:p>
     <w:p>
       <w:pPr>
@@ -9546,11 +10023,308 @@
       <w:pPr>
         <w:pStyle w:val="Titolo2"/>
       </w:pPr>
-      <w:bookmarkStart w:id="23" w:name="_Toc243069383"/>
-      <w:r>
-        <w:t>6.4 Ruoli</w:t>
-      </w:r>
-      <w:bookmarkEnd w:id="23"/>
+      <w:bookmarkStart w:id="24" w:name="_Toc243073609"/>
+      <w:r>
+        <w:t>6.4 Release 1.0.1</w:t>
+      </w:r>
+      <w:bookmarkEnd w:id="24"/>
+    </w:p>
+    <w:p>
+      <w:pPr>
+        <w:spacing w:after="120"/>
+      </w:pPr>
+      <w:r>
+        <w:t xml:space="preserve">Tag </w:t>
+      </w:r>
+      <w:r>
+        <w:rPr>
+          <w:rFonts w:ascii="Consolas" w:eastAsia="Consolas" w:hAnsi="Consolas" w:cs="Consolas"/>
+          <w:sz w:val="19"/>
+          <w:szCs w:val="19"/>
+        </w:rPr>
+        <w:t>v1.0.1</w:t>
+      </w:r>
+      <w:r>
+        <w:t>: stessa pipeline, con Android firmato. Pagina: https://github.com/akito996/pdfz/releases/tag/v1.0.1. Il telefono con la 1.0.0 la installa sopra (versionCode 1001000001), Windows aggiorna l'MSI (101.0.1).</w:t>
+      </w:r>
+    </w:p>
+    <w:tbl>
+      <w:tblPr>
+        <w:tblW w:w="9638" w:type="dxa"/>
+        <w:tblBorders>
+          <w:top w:val="single" w:sz="4" w:space="0" w:color="auto"/>
+          <w:left w:val="single" w:sz="4" w:space="0" w:color="auto"/>
+          <w:bottom w:val="single" w:sz="4" w:space="0" w:color="auto"/>
+          <w:right w:val="single" w:sz="4" w:space="0" w:color="auto"/>
+          <w:insideH w:val="single" w:sz="4" w:space="0" w:color="auto"/>
+          <w:insideV w:val="single" w:sz="4" w:space="0" w:color="auto"/>
+        </w:tblBorders>
+        <w:tblLook w:val="04A0" w:firstRow="1" w:lastRow="0" w:firstColumn="1" w:lastColumn="0" w:noHBand="0" w:noVBand="1"/>
+      </w:tblPr>
+      <w:tblGrid>
+        <w:gridCol w:w="2313"/>
+        <w:gridCol w:w="7325"/>
+      </w:tblGrid>
+      <w:tr>
+        <w:trPr>
+          <w:tblHeader/>
+        </w:trPr>
+        <w:tc>
+          <w:tcPr>
+            <w:tcW w:w="2313" w:type="dxa"/>
+            <w:tcBorders>
+              <w:top w:val="single" w:sz="4" w:space="0" w:color="D4CEC7"/>
+              <w:left w:val="single" w:sz="4" w:space="0" w:color="D4CEC7"/>
+              <w:bottom w:val="single" w:sz="4" w:space="0" w:color="D4CEC7"/>
+              <w:right w:val="single" w:sz="4" w:space="0" w:color="D4CEC7"/>
+            </w:tcBorders>
+            <w:shd w:val="clear" w:color="auto" w:fill="B3122B"/>
+            <w:tcMar>
+              <w:top w:w="60" w:type="dxa"/>
+              <w:left w:w="100" w:type="dxa"/>
+              <w:bottom w:w="60" w:type="dxa"/>
+              <w:right w:w="100" w:type="dxa"/>
+            </w:tcMar>
+          </w:tcPr>
+          <w:p>
+            <w:r>
+              <w:rPr>
+                <w:b/>
+                <w:bCs/>
+                <w:color w:val="FFFFFF"/>
+              </w:rPr>
+              <w:t>Sistema</w:t>
+            </w:r>
+          </w:p>
+        </w:tc>
+        <w:tc>
+          <w:tcPr>
+            <w:tcW w:w="7325" w:type="dxa"/>
+            <w:tcBorders>
+              <w:top w:val="single" w:sz="4" w:space="0" w:color="D4CEC7"/>
+              <w:left w:val="single" w:sz="4" w:space="0" w:color="D4CEC7"/>
+              <w:bottom w:val="single" w:sz="4" w:space="0" w:color="D4CEC7"/>
+              <w:right w:val="single" w:sz="4" w:space="0" w:color="D4CEC7"/>
+            </w:tcBorders>
+            <w:shd w:val="clear" w:color="auto" w:fill="B3122B"/>
+            <w:tcMar>
+              <w:top w:w="60" w:type="dxa"/>
+              <w:left w:w="100" w:type="dxa"/>
+              <w:bottom w:w="60" w:type="dxa"/>
+              <w:right w:w="100" w:type="dxa"/>
+            </w:tcMar>
+          </w:tcPr>
+          <w:p>
+            <w:r>
+              <w:rPr>
+                <w:b/>
+                <w:bCs/>
+                <w:color w:val="FFFFFF"/>
+              </w:rPr>
+              <w:t>Link</w:t>
+            </w:r>
+          </w:p>
+        </w:tc>
+      </w:tr>
+      <w:tr>
+        <w:tc>
+          <w:tcPr>
+            <w:tcW w:w="2313" w:type="dxa"/>
+            <w:tcBorders>
+              <w:top w:val="single" w:sz="4" w:space="0" w:color="D4CEC7"/>
+              <w:left w:val="single" w:sz="4" w:space="0" w:color="D4CEC7"/>
+              <w:bottom w:val="single" w:sz="4" w:space="0" w:color="D4CEC7"/>
+              <w:right w:val="single" w:sz="4" w:space="0" w:color="D4CEC7"/>
+            </w:tcBorders>
+            <w:tcMar>
+              <w:top w:w="60" w:type="dxa"/>
+              <w:left w:w="100" w:type="dxa"/>
+              <w:bottom w:w="60" w:type="dxa"/>
+              <w:right w:w="100" w:type="dxa"/>
+            </w:tcMar>
+          </w:tcPr>
+          <w:p>
+            <w:r>
+              <w:t>Windows</w:t>
+            </w:r>
+          </w:p>
+        </w:tc>
+        <w:tc>
+          <w:tcPr>
+            <w:tcW w:w="7325" w:type="dxa"/>
+            <w:tcBorders>
+              <w:top w:val="single" w:sz="4" w:space="0" w:color="D4CEC7"/>
+              <w:left w:val="single" w:sz="4" w:space="0" w:color="D4CEC7"/>
+              <w:bottom w:val="single" w:sz="4" w:space="0" w:color="D4CEC7"/>
+              <w:right w:val="single" w:sz="4" w:space="0" w:color="D4CEC7"/>
+            </w:tcBorders>
+            <w:tcMar>
+              <w:top w:w="60" w:type="dxa"/>
+              <w:left w:w="100" w:type="dxa"/>
+              <w:bottom w:w="60" w:type="dxa"/>
+              <w:right w:w="100" w:type="dxa"/>
+            </w:tcMar>
+          </w:tcPr>
+          <w:p>
+            <w:r>
+              <w:t>https://github.com/akito996/pdfz/releases/download/v1.0.1/PDFz-1.0.1-x64.msi</w:t>
+            </w:r>
+          </w:p>
+        </w:tc>
+      </w:tr>
+      <w:tr>
+        <w:tc>
+          <w:tcPr>
+            <w:tcW w:w="2313" w:type="dxa"/>
+            <w:tcBorders>
+              <w:top w:val="single" w:sz="4" w:space="0" w:color="D4CEC7"/>
+              <w:left w:val="single" w:sz="4" w:space="0" w:color="D4CEC7"/>
+              <w:bottom w:val="single" w:sz="4" w:space="0" w:color="D4CEC7"/>
+              <w:right w:val="single" w:sz="4" w:space="0" w:color="D4CEC7"/>
+            </w:tcBorders>
+            <w:tcMar>
+              <w:top w:w="60" w:type="dxa"/>
+              <w:left w:w="100" w:type="dxa"/>
+              <w:bottom w:w="60" w:type="dxa"/>
+              <w:right w:w="100" w:type="dxa"/>
+            </w:tcMar>
+          </w:tcPr>
+          <w:p>
+            <w:r>
+              <w:t>macOS (Apple Silicon)</w:t>
+            </w:r>
+          </w:p>
+        </w:tc>
+        <w:tc>
+          <w:tcPr>
+            <w:tcW w:w="7325" w:type="dxa"/>
+            <w:tcBorders>
+              <w:top w:val="single" w:sz="4" w:space="0" w:color="D4CEC7"/>
+              <w:left w:val="single" w:sz="4" w:space="0" w:color="D4CEC7"/>
+              <w:bottom w:val="single" w:sz="4" w:space="0" w:color="D4CEC7"/>
+              <w:right w:val="single" w:sz="4" w:space="0" w:color="D4CEC7"/>
+            </w:tcBorders>
+            <w:tcMar>
+              <w:top w:w="60" w:type="dxa"/>
+              <w:left w:w="100" w:type="dxa"/>
+              <w:bottom w:w="60" w:type="dxa"/>
+              <w:right w:w="100" w:type="dxa"/>
+            </w:tcMar>
+          </w:tcPr>
+          <w:p>
+            <w:r>
+              <w:t>https://github.com/akito996/pdfz/releases/download/v1.0.1/PDFz-1.0.1-macOS-arm64.dmg</w:t>
+            </w:r>
+          </w:p>
+        </w:tc>
+      </w:tr>
+      <w:tr>
+        <w:tc>
+          <w:tcPr>
+            <w:tcW w:w="2313" w:type="dxa"/>
+            <w:tcBorders>
+              <w:top w:val="single" w:sz="4" w:space="0" w:color="D4CEC7"/>
+              <w:left w:val="single" w:sz="4" w:space="0" w:color="D4CEC7"/>
+              <w:bottom w:val="single" w:sz="4" w:space="0" w:color="D4CEC7"/>
+              <w:right w:val="single" w:sz="4" w:space="0" w:color="D4CEC7"/>
+            </w:tcBorders>
+            <w:tcMar>
+              <w:top w:w="60" w:type="dxa"/>
+              <w:left w:w="100" w:type="dxa"/>
+              <w:bottom w:w="60" w:type="dxa"/>
+              <w:right w:w="100" w:type="dxa"/>
+            </w:tcMar>
+          </w:tcPr>
+          <w:p>
+            <w:r>
+              <w:t>Linux</w:t>
+            </w:r>
+          </w:p>
+        </w:tc>
+        <w:tc>
+          <w:tcPr>
+            <w:tcW w:w="7325" w:type="dxa"/>
+            <w:tcBorders>
+              <w:top w:val="single" w:sz="4" w:space="0" w:color="D4CEC7"/>
+              <w:left w:val="single" w:sz="4" w:space="0" w:color="D4CEC7"/>
+              <w:bottom w:val="single" w:sz="4" w:space="0" w:color="D4CEC7"/>
+              <w:right w:val="single" w:sz="4" w:space="0" w:color="D4CEC7"/>
+            </w:tcBorders>
+            <w:tcMar>
+              <w:top w:w="60" w:type="dxa"/>
+              <w:left w:w="100" w:type="dxa"/>
+              <w:bottom w:w="60" w:type="dxa"/>
+              <w:right w:w="100" w:type="dxa"/>
+            </w:tcMar>
+          </w:tcPr>
+          <w:p>
+            <w:r>
+              <w:t>https://github.com/akito996/pdfz/releases/download/v1.0.1/PDFz-1.0.1-x86_64.AppImage</w:t>
+            </w:r>
+          </w:p>
+        </w:tc>
+      </w:tr>
+      <w:tr>
+        <w:tc>
+          <w:tcPr>
+            <w:tcW w:w="2313" w:type="dxa"/>
+            <w:tcBorders>
+              <w:top w:val="single" w:sz="4" w:space="0" w:color="D4CEC7"/>
+              <w:left w:val="single" w:sz="4" w:space="0" w:color="D4CEC7"/>
+              <w:bottom w:val="single" w:sz="4" w:space="0" w:color="D4CEC7"/>
+              <w:right w:val="single" w:sz="4" w:space="0" w:color="D4CEC7"/>
+            </w:tcBorders>
+            <w:tcMar>
+              <w:top w:w="60" w:type="dxa"/>
+              <w:left w:w="100" w:type="dxa"/>
+              <w:bottom w:w="60" w:type="dxa"/>
+              <w:right w:w="100" w:type="dxa"/>
+            </w:tcMar>
+          </w:tcPr>
+          <w:p>
+            <w:r>
+              <w:t>Android</w:t>
+            </w:r>
+          </w:p>
+        </w:tc>
+        <w:tc>
+          <w:tcPr>
+            <w:tcW w:w="7325" w:type="dxa"/>
+            <w:tcBorders>
+              <w:top w:val="single" w:sz="4" w:space="0" w:color="D4CEC7"/>
+              <w:left w:val="single" w:sz="4" w:space="0" w:color="D4CEC7"/>
+              <w:bottom w:val="single" w:sz="4" w:space="0" w:color="D4CEC7"/>
+              <w:right w:val="single" w:sz="4" w:space="0" w:color="D4CEC7"/>
+            </w:tcBorders>
+            <w:tcMar>
+              <w:top w:w="60" w:type="dxa"/>
+              <w:left w:w="100" w:type="dxa"/>
+              <w:bottom w:w="60" w:type="dxa"/>
+              <w:right w:w="100" w:type="dxa"/>
+            </w:tcMar>
+          </w:tcPr>
+          <w:p>
+            <w:r>
+              <w:t>https://github.com/akito996/pdfz/releases/download/v1.0.1/PDFz-1.0.1-android.apk</w:t>
+            </w:r>
+          </w:p>
+        </w:tc>
+      </w:tr>
+    </w:tbl>
+    <w:p>
+      <w:pPr>
+        <w:spacing w:after="120"/>
+      </w:pPr>
+    </w:p>
+    <w:p>
+      <w:pPr>
+        <w:pStyle w:val="Titolo2"/>
+      </w:pPr>
+      <w:bookmarkStart w:id="25" w:name="_Toc243073610"/>
+      <w:r>
+        <w:t>6.5 Ruoli</w:t>
+      </w:r>
+      <w:bookmarkEnd w:id="25"/>
     </w:p>
     <w:tbl>
       <w:tblPr>
@@ -9819,11 +10593,11 @@
       <w:pPr>
         <w:pStyle w:val="Titolo1"/>
       </w:pPr>
-      <w:bookmarkStart w:id="24" w:name="_Toc243069384"/>
+      <w:bookmarkStart w:id="26" w:name="_Toc243073611"/>
       <w:r>
         <w:t>7. Sicurezza</w:t>
       </w:r>
-      <w:bookmarkEnd w:id="24"/>
+      <w:bookmarkEnd w:id="26"/>
     </w:p>
     <w:p>
       <w:pPr>
@@ -10118,11 +10892,11 @@
       <w:pPr>
         <w:pStyle w:val="Titolo1"/>
       </w:pPr>
-      <w:bookmarkStart w:id="25" w:name="_Toc243069385"/>
+      <w:bookmarkStart w:id="27" w:name="_Toc243073612"/>
       <w:r>
         <w:t>8. Punti aperti</w:t>
       </w:r>
-      <w:bookmarkEnd w:id="25"/>
+      <w:bookmarkEnd w:id="27"/>
     </w:p>
     <w:p>
       <w:pPr>
@@ -10241,11 +11015,11 @@
       <w:pPr>
         <w:pStyle w:val="Titolo1"/>
       </w:pPr>
-      <w:bookmarkStart w:id="26" w:name="_Toc243069386"/>
+      <w:bookmarkStart w:id="28" w:name="_Toc243073613"/>
       <w:r>
         <w:t>9. Pensato per i prossimi 10 anni</w:t>
       </w:r>
-      <w:bookmarkEnd w:id="26"/>
+      <w:bookmarkEnd w:id="28"/>
     </w:p>
     <w:p>
       <w:pPr>
@@ -10488,96 +11262,64 @@
 <file path=word/numbering.xml><?xml version="1.0" encoding="utf-8"?>
 <w:numbering xmlns:wpc="http://schemas.microsoft.com/office/word/2010/wordprocessingCanvas" xmlns:cx="http://schemas.microsoft.com/office/drawing/2014/chartex" xmlns:cx1="http://schemas.microsoft.com/office/drawing/2015/9/8/chartex" xmlns:cx2="http://schemas.microsoft.com/office/drawing/2015/10/21/chartex" xmlns:cx3="http://schemas.microsoft.com/office/drawing/2016/5/9/chartex" xmlns:cx4="http://schemas.microsoft.com/office/drawing/2016/5/10/chartex" xmlns:cx5="http://schemas.microsoft.com/office/drawing/2016/5/11/chartex" xmlns:cx6="http://schemas.microsoft.com/office/drawing/2016/5/12/chartex" xmlns:cx7="http://schemas.microsoft.com/office/drawing/2016/5/13/chartex" xmlns:cx8="http://schemas.microsoft.com/office/drawing/2016/5/14/chartex" xmlns:mc="http://schemas.openxmlformats.org/markup-compatibility/2006" xmlns:aink="http://schemas.microsoft.com/office/drawing/2016/ink" xmlns:am3d="http://schemas.microsoft.com/office/drawing/2017/model3d" xmlns:o="urn:schemas-microsoft-com:office:office" xmlns:oel="http://schemas.microsoft.com/office/2019/extlst" xmlns:r="http://schemas.openxmlformats.org/officeDocument/2006/relationships" xmlns:m="http://schemas.openxmlformats.org/officeDocument/2006/math" xmlns:v="urn:schemas-microsoft-com:vml" xmlns:wp14="http://schemas.microsoft.com/office/word/2010/wordprocessingDrawing" xmlns:wp="http://schemas.openxmlformats.org/drawingml/2006/wordprocessingDrawing" xmlns:w10="urn:schemas-microsoft-com:office:word" xmlns:w="http://schemas.openxmlformats.org/wordprocessingml/2006/main" xmlns:w14="http://schemas.microsoft.com/office/word/2010/wordml" xmlns:w15="http://schemas.microsoft.com/office/word/2012/wordml" xmlns:w16cex="http://schemas.microsoft.com/office/word/2018/wordml/cex" xmlns:w16cid="http://schemas.microsoft.com/office/word/2016/wordml/cid" xmlns:w16="http://schemas.microsoft.com/office/word/2018/wordml" xmlns:w16du="http://schemas.microsoft.com/office/word/2023/wordml/word16du" xmlns:w16sdtdh="http://schemas.microsoft.com/office/word/2020/wordml/sdtdatahash" xmlns:w16sdtfl="http://schemas.microsoft.com/office/word/2024/wordml/sdtformatlock" xmlns:w16se="http://schemas.microsoft.com/office/word/2015/wordml/symex" xmlns:wpg="http://schemas.microsoft.com/office/word/2010/wordprocessingGroup" xmlns:wpi="http://schemas.microsoft.com/office/word/2010/wordprocessingInk" xmlns:wne="http://schemas.microsoft.com/office/word/2006/wordml" xmlns:wps="http://schemas.microsoft.com/office/word/2010/wordprocessingShape" mc:Ignorable="w14 w15 w16se w16cid w16 w16cex w16sdtdh w16sdtfl w16du wp14">
   <w:abstractNum w:abstractNumId="0" w15:restartNumberingAfterBreak="0">
-    <w:nsid w:val="09BD584C"/>
+    <w:nsid w:val="03284B65"/>
     <w:multiLevelType w:val="hybridMultilevel"/>
-    <w:tmpl w:val="BA108058"/>
-    <w:lvl w:ilvl="0" w:tplc="434AFD4A" w:tentative="1">
+    <w:tmpl w:val="34FC2DA0"/>
+    <w:lvl w:ilvl="0" w:tplc="A3F0CD9A">
       <w:start w:val="1"/>
       <w:numFmt w:val="bullet"/>
-      <w:lvlText w:val="●"/>
+      <w:lvlText w:val="•"/>
       <w:lvlJc w:val="left"/>
       <w:pPr>
-        <w:ind w:left="720" w:hanging="360"/>
+        <w:ind w:left="540" w:hanging="270"/>
       </w:pPr>
     </w:lvl>
-    <w:lvl w:ilvl="1" w:tplc="BE5C576A" w:tentative="1">
-      <w:start w:val="1"/>
-      <w:numFmt w:val="bullet"/>
-      <w:lvlText w:val="○"/>
+    <w:lvl w:ilvl="1" w:tplc="3B2A1FD6">
+      <w:numFmt w:val="decimal"/>
+      <w:lvlText w:val=""/>
       <w:lvlJc w:val="left"/>
-      <w:pPr>
-        <w:ind w:left="1440" w:hanging="360"/>
-      </w:pPr>
     </w:lvl>
-    <w:lvl w:ilvl="2" w:tplc="171602DA" w:tentative="1">
-      <w:start w:val="1"/>
-      <w:numFmt w:val="bullet"/>
-      <w:lvlText w:val="■"/>
+    <w:lvl w:ilvl="2" w:tplc="BA283D8A">
+      <w:numFmt w:val="decimal"/>
+      <w:lvlText w:val=""/>
       <w:lvlJc w:val="left"/>
-      <w:pPr>
-        <w:ind w:left="2160" w:hanging="360"/>
-      </w:pPr>
     </w:lvl>
-    <w:lvl w:ilvl="3" w:tplc="B18CD468" w:tentative="1">
-      <w:start w:val="1"/>
-      <w:numFmt w:val="bullet"/>
-      <w:lvlText w:val="●"/>
+    <w:lvl w:ilvl="3" w:tplc="250A778E">
+      <w:numFmt w:val="decimal"/>
+      <w:lvlText w:val=""/>
       <w:lvlJc w:val="left"/>
-      <w:pPr>
-        <w:ind w:left="2880" w:hanging="360"/>
-      </w:pPr>
     </w:lvl>
-    <w:lvl w:ilvl="4" w:tplc="3BF0C972" w:tentative="1">
-      <w:start w:val="1"/>
-      <w:numFmt w:val="bullet"/>
-      <w:lvlText w:val="○"/>
+    <w:lvl w:ilvl="4" w:tplc="26ECB52E">
+      <w:numFmt w:val="decimal"/>
+      <w:lvlText w:val=""/>
       <w:lvlJc w:val="left"/>
-      <w:pPr>
-        <w:ind w:left="3600" w:hanging="360"/>
-      </w:pPr>
     </w:lvl>
-    <w:lvl w:ilvl="5" w:tplc="B8845446" w:tentative="1">
-      <w:start w:val="1"/>
-      <w:numFmt w:val="bullet"/>
-      <w:lvlText w:val="■"/>
+    <w:lvl w:ilvl="5" w:tplc="4A98F874">
+      <w:numFmt w:val="decimal"/>
+      <w:lvlText w:val=""/>
       <w:lvlJc w:val="left"/>
-      <w:pPr>
-        <w:ind w:left="4320" w:hanging="360"/>
-      </w:pPr>
     </w:lvl>
-    <w:lvl w:ilvl="6" w:tplc="89E8089A" w:tentative="1">
-      <w:start w:val="1"/>
-      <w:numFmt w:val="bullet"/>
-      <w:lvlText w:val="●"/>
+    <w:lvl w:ilvl="6" w:tplc="316A368C">
+      <w:numFmt w:val="decimal"/>
+      <w:lvlText w:val=""/>
       <w:lvlJc w:val="left"/>
-      <w:pPr>
-        <w:ind w:left="5040" w:hanging="360"/>
-      </w:pPr>
     </w:lvl>
-    <w:lvl w:ilvl="7" w:tplc="5DDC2E94" w:tentative="1">
-      <w:start w:val="1"/>
-      <w:numFmt w:val="bullet"/>
-      <w:lvlText w:val="●"/>
+    <w:lvl w:ilvl="7" w:tplc="29EEFF78">
+      <w:numFmt w:val="decimal"/>
+      <w:lvlText w:val=""/>
       <w:lvlJc w:val="left"/>
-      <w:pPr>
-        <w:ind w:left="5760" w:hanging="360"/>
-      </w:pPr>
     </w:lvl>
-    <w:lvl w:ilvl="8" w:tplc="2B9EAB9A" w:tentative="1">
-      <w:start w:val="1"/>
-      <w:numFmt w:val="bullet"/>
-      <w:lvlText w:val="●"/>
+    <w:lvl w:ilvl="8" w:tplc="69F65948">
+      <w:numFmt w:val="decimal"/>
+      <w:lvlText w:val=""/>
       <w:lvlJc w:val="left"/>
-      <w:pPr>
-        <w:ind w:left="6480" w:hanging="360"/>
-      </w:pPr>
     </w:lvl>
   </w:abstractNum>
   <w:abstractNum w:abstractNumId="1" w15:restartNumberingAfterBreak="0">
-    <w:nsid w:val="34597C83"/>
+    <w:nsid w:val="03B42CDC"/>
     <w:multiLevelType w:val="hybridMultilevel"/>
-    <w:tmpl w:val="21A288F2"/>
-    <w:lvl w:ilvl="0" w:tplc="468A988A">
+    <w:tmpl w:val="6308AE70"/>
+    <w:lvl w:ilvl="0" w:tplc="814486F6">
       <w:start w:val="1"/>
       <w:numFmt w:val="decimal"/>
       <w:lvlText w:val="%1."/>
@@ -10586,52 +11328,138 @@
         <w:ind w:left="540" w:hanging="300"/>
       </w:pPr>
     </w:lvl>
-    <w:lvl w:ilvl="1" w:tplc="6AD4D27E">
+    <w:lvl w:ilvl="1" w:tplc="1E367684">
       <w:numFmt w:val="decimal"/>
       <w:lvlText w:val=""/>
       <w:lvlJc w:val="left"/>
     </w:lvl>
-    <w:lvl w:ilvl="2" w:tplc="C5F00606">
+    <w:lvl w:ilvl="2" w:tplc="4AE471B0">
       <w:numFmt w:val="decimal"/>
       <w:lvlText w:val=""/>
       <w:lvlJc w:val="left"/>
     </w:lvl>
-    <w:lvl w:ilvl="3" w:tplc="634CDA70">
+    <w:lvl w:ilvl="3" w:tplc="0232B28E">
       <w:numFmt w:val="decimal"/>
       <w:lvlText w:val=""/>
       <w:lvlJc w:val="left"/>
     </w:lvl>
-    <w:lvl w:ilvl="4" w:tplc="79145910">
+    <w:lvl w:ilvl="4" w:tplc="A0CAF892">
       <w:numFmt w:val="decimal"/>
       <w:lvlText w:val=""/>
       <w:lvlJc w:val="left"/>
     </w:lvl>
-    <w:lvl w:ilvl="5" w:tplc="381CD278">
+    <w:lvl w:ilvl="5" w:tplc="B816B412">
       <w:numFmt w:val="decimal"/>
       <w:lvlText w:val=""/>
       <w:lvlJc w:val="left"/>
     </w:lvl>
-    <w:lvl w:ilvl="6" w:tplc="E1F6545A">
+    <w:lvl w:ilvl="6" w:tplc="C8B2DA18">
       <w:numFmt w:val="decimal"/>
       <w:lvlText w:val=""/>
       <w:lvlJc w:val="left"/>
     </w:lvl>
-    <w:lvl w:ilvl="7" w:tplc="961AE1D4">
+    <w:lvl w:ilvl="7" w:tplc="43D81980">
       <w:numFmt w:val="decimal"/>
       <w:lvlText w:val=""/>
       <w:lvlJc w:val="left"/>
     </w:lvl>
-    <w:lvl w:ilvl="8" w:tplc="0A32A1A8">
+    <w:lvl w:ilvl="8" w:tplc="8466D28A">
       <w:numFmt w:val="decimal"/>
       <w:lvlText w:val=""/>
       <w:lvlJc w:val="left"/>
     </w:lvl>
   </w:abstractNum>
   <w:abstractNum w:abstractNumId="2" w15:restartNumberingAfterBreak="0">
-    <w:nsid w:val="393F5686"/>
+    <w:nsid w:val="29F00CF4"/>
     <w:multiLevelType w:val="hybridMultilevel"/>
-    <w:tmpl w:val="5AF270AA"/>
-    <w:lvl w:ilvl="0" w:tplc="A50C656C">
+    <w:tmpl w:val="3C1453C6"/>
+    <w:lvl w:ilvl="0" w:tplc="32BCB2D6" w:tentative="1">
+      <w:start w:val="1"/>
+      <w:numFmt w:val="bullet"/>
+      <w:lvlText w:val="●"/>
+      <w:lvlJc w:val="left"/>
+      <w:pPr>
+        <w:ind w:left="720" w:hanging="360"/>
+      </w:pPr>
+    </w:lvl>
+    <w:lvl w:ilvl="1" w:tplc="48EC12AE" w:tentative="1">
+      <w:start w:val="1"/>
+      <w:numFmt w:val="bullet"/>
+      <w:lvlText w:val="○"/>
+      <w:lvlJc w:val="left"/>
+      <w:pPr>
+        <w:ind w:left="1440" w:hanging="360"/>
+      </w:pPr>
+    </w:lvl>
+    <w:lvl w:ilvl="2" w:tplc="E3D61B12" w:tentative="1">
+      <w:start w:val="1"/>
+      <w:numFmt w:val="bullet"/>
+      <w:lvlText w:val="■"/>
+      <w:lvlJc w:val="left"/>
+      <w:pPr>
+        <w:ind w:left="2160" w:hanging="360"/>
+      </w:pPr>
+    </w:lvl>
+    <w:lvl w:ilvl="3" w:tplc="CF441324" w:tentative="1">
+      <w:start w:val="1"/>
+      <w:numFmt w:val="bullet"/>
+      <w:lvlText w:val="●"/>
+      <w:lvlJc w:val="left"/>
+      <w:pPr>
+        <w:ind w:left="2880" w:hanging="360"/>
+      </w:pPr>
+    </w:lvl>
+    <w:lvl w:ilvl="4" w:tplc="A680FE5A" w:tentative="1">
+      <w:start w:val="1"/>
+      <w:numFmt w:val="bullet"/>
+      <w:lvlText w:val="○"/>
+      <w:lvlJc w:val="left"/>
+      <w:pPr>
+        <w:ind w:left="3600" w:hanging="360"/>
+      </w:pPr>
+    </w:lvl>
+    <w:lvl w:ilvl="5" w:tplc="6C5EDF80" w:tentative="1">
+      <w:start w:val="1"/>
+      <w:numFmt w:val="bullet"/>
+      <w:lvlText w:val="■"/>
+      <w:lvlJc w:val="left"/>
+      <w:pPr>
+        <w:ind w:left="4320" w:hanging="360"/>
+      </w:pPr>
+    </w:lvl>
+    <w:lvl w:ilvl="6" w:tplc="DACC4F0A" w:tentative="1">
+      <w:start w:val="1"/>
+      <w:numFmt w:val="bullet"/>
+      <w:lvlText w:val="●"/>
+      <w:lvlJc w:val="left"/>
+      <w:pPr>
+        <w:ind w:left="5040" w:hanging="360"/>
+      </w:pPr>
+    </w:lvl>
+    <w:lvl w:ilvl="7" w:tplc="9154E0A0" w:tentative="1">
+      <w:start w:val="1"/>
+      <w:numFmt w:val="bullet"/>
+      <w:lvlText w:val="●"/>
+      <w:lvlJc w:val="left"/>
+      <w:pPr>
+        <w:ind w:left="5760" w:hanging="360"/>
+      </w:pPr>
+    </w:lvl>
+    <w:lvl w:ilvl="8" w:tplc="DEC6E5D2" w:tentative="1">
+      <w:start w:val="1"/>
+      <w:numFmt w:val="bullet"/>
+      <w:lvlText w:val="●"/>
+      <w:lvlJc w:val="left"/>
+      <w:pPr>
+        <w:ind w:left="6480" w:hanging="360"/>
+      </w:pPr>
+    </w:lvl>
+  </w:abstractNum>
+  <w:abstractNum w:abstractNumId="3" w15:restartNumberingAfterBreak="0">
+    <w:nsid w:val="4A043DE5"/>
+    <w:multiLevelType w:val="hybridMultilevel"/>
+    <w:tmpl w:val="551EE02E"/>
+    <w:lvl w:ilvl="0" w:tplc="CC545820">
       <w:start w:val="1"/>
       <w:numFmt w:val="decimal"/>
       <w:lvlText w:val="%1."/>
@@ -10640,121 +11468,67 @@
         <w:ind w:left="540" w:hanging="300"/>
       </w:pPr>
     </w:lvl>
-    <w:lvl w:ilvl="1" w:tplc="63CAD46E">
+    <w:lvl w:ilvl="1" w:tplc="2F08B80A">
       <w:numFmt w:val="decimal"/>
       <w:lvlText w:val=""/>
       <w:lvlJc w:val="left"/>
     </w:lvl>
-    <w:lvl w:ilvl="2" w:tplc="0414C0BA">
+    <w:lvl w:ilvl="2" w:tplc="D4685436">
       <w:numFmt w:val="decimal"/>
       <w:lvlText w:val=""/>
       <w:lvlJc w:val="left"/>
     </w:lvl>
-    <w:lvl w:ilvl="3" w:tplc="2FAA0506">
+    <w:lvl w:ilvl="3" w:tplc="2A82298C">
       <w:numFmt w:val="decimal"/>
       <w:lvlText w:val=""/>
       <w:lvlJc w:val="left"/>
     </w:lvl>
-    <w:lvl w:ilvl="4" w:tplc="F4E46D70">
+    <w:lvl w:ilvl="4" w:tplc="68EA62AC">
       <w:numFmt w:val="decimal"/>
       <w:lvlText w:val=""/>
       <w:lvlJc w:val="left"/>
     </w:lvl>
-    <w:lvl w:ilvl="5" w:tplc="C912407E">
+    <w:lvl w:ilvl="5" w:tplc="BC28CF02">
       <w:numFmt w:val="decimal"/>
       <w:lvlText w:val=""/>
       <w:lvlJc w:val="left"/>
     </w:lvl>
-    <w:lvl w:ilvl="6" w:tplc="9E7EDB60">
+    <w:lvl w:ilvl="6" w:tplc="356CE448">
       <w:numFmt w:val="decimal"/>
       <w:lvlText w:val=""/>
       <w:lvlJc w:val="left"/>
     </w:lvl>
-    <w:lvl w:ilvl="7" w:tplc="AD4A74C4">
+    <w:lvl w:ilvl="7" w:tplc="2BA0E0EA">
       <w:numFmt w:val="decimal"/>
       <w:lvlText w:val=""/>
       <w:lvlJc w:val="left"/>
     </w:lvl>
-    <w:lvl w:ilvl="8" w:tplc="EF867A54">
+    <w:lvl w:ilvl="8" w:tplc="F67EF644">
       <w:numFmt w:val="decimal"/>
       <w:lvlText w:val=""/>
       <w:lvlJc w:val="left"/>
     </w:lvl>
   </w:abstractNum>
-  <w:abstractNum w:abstractNumId="3" w15:restartNumberingAfterBreak="0">
-    <w:nsid w:val="3FC34EA1"/>
-    <w:multiLevelType w:val="hybridMultilevel"/>
-    <w:tmpl w:val="7A42A7C4"/>
-    <w:lvl w:ilvl="0" w:tplc="B4663B26">
-      <w:start w:val="1"/>
-      <w:numFmt w:val="bullet"/>
-      <w:lvlText w:val="•"/>
-      <w:lvlJc w:val="left"/>
-      <w:pPr>
-        <w:ind w:left="540" w:hanging="270"/>
-      </w:pPr>
-    </w:lvl>
-    <w:lvl w:ilvl="1" w:tplc="8DFC7E7C">
-      <w:numFmt w:val="decimal"/>
-      <w:lvlText w:val=""/>
-      <w:lvlJc w:val="left"/>
-    </w:lvl>
-    <w:lvl w:ilvl="2" w:tplc="CBD2D19C">
-      <w:numFmt w:val="decimal"/>
-      <w:lvlText w:val=""/>
-      <w:lvlJc w:val="left"/>
-    </w:lvl>
-    <w:lvl w:ilvl="3" w:tplc="D122C5E4">
-      <w:numFmt w:val="decimal"/>
-      <w:lvlText w:val=""/>
-      <w:lvlJc w:val="left"/>
-    </w:lvl>
-    <w:lvl w:ilvl="4" w:tplc="570A735A">
-      <w:numFmt w:val="decimal"/>
-      <w:lvlText w:val=""/>
-      <w:lvlJc w:val="left"/>
-    </w:lvl>
-    <w:lvl w:ilvl="5" w:tplc="E37A835C">
-      <w:numFmt w:val="decimal"/>
-      <w:lvlText w:val=""/>
-      <w:lvlJc w:val="left"/>
-    </w:lvl>
-    <w:lvl w:ilvl="6" w:tplc="E3B652A4">
-      <w:numFmt w:val="decimal"/>
-      <w:lvlText w:val=""/>
-      <w:lvlJc w:val="left"/>
-    </w:lvl>
-    <w:lvl w:ilvl="7" w:tplc="B106B798">
-      <w:numFmt w:val="decimal"/>
-      <w:lvlText w:val=""/>
-      <w:lvlJc w:val="left"/>
-    </w:lvl>
-    <w:lvl w:ilvl="8" w:tplc="EC5C41CE">
-      <w:numFmt w:val="decimal"/>
-      <w:lvlText w:val=""/>
-      <w:lvlJc w:val="left"/>
-    </w:lvl>
-  </w:abstractNum>
-  <w:num w:numId="1" w16cid:durableId="2140950733">
+  <w:num w:numId="1" w16cid:durableId="558327196">
+    <w:abstractNumId w:val="2"/>
+    <w:lvlOverride w:ilvl="0">
+      <w:startOverride w:val="1"/>
+    </w:lvlOverride>
+  </w:num>
+  <w:num w:numId="2" w16cid:durableId="1066956913">
     <w:abstractNumId w:val="0"/>
     <w:lvlOverride w:ilvl="0">
       <w:startOverride w:val="1"/>
     </w:lvlOverride>
   </w:num>
-  <w:num w:numId="2" w16cid:durableId="959262046">
-    <w:abstractNumId w:val="3"/>
-    <w:lvlOverride w:ilvl="0">
-      <w:startOverride w:val="1"/>
-    </w:lvlOverride>
-  </w:num>
-  <w:num w:numId="3" w16cid:durableId="1649046334">
+  <w:num w:numId="3" w16cid:durableId="1653410525">
     <w:abstractNumId w:val="1"/>
     <w:lvlOverride w:ilvl="0">
       <w:startOverride w:val="1"/>
     </w:lvlOverride>
   </w:num>
-  <w:num w:numId="4" w16cid:durableId="1008755586">
-    <w:abstractNumId w:val="2"/>
+  <w:num w:numId="4" w16cid:durableId="875776952">
+    <w:abstractNumId w:val="3"/>
     <w:lvlOverride w:ilvl="0">
       <w:startOverride w:val="1"/>
     </w:lvlOverride>
@@ -11395,7 +12169,7 @@
     <w:autoRedefine/>
     <w:uiPriority w:val="39"/>
     <w:unhideWhenUsed/>
-    <w:rsid w:val="0046242C"/>
+    <w:rsid w:val="00D87003"/>
     <w:pPr>
       <w:spacing w:after="100"/>
     </w:pPr>
@@ -11407,7 +12181,7 @@
     <w:autoRedefine/>
     <w:uiPriority w:val="39"/>
     <w:unhideWhenUsed/>
-    <w:rsid w:val="0046242C"/>
+    <w:rsid w:val="00D87003"/>
     <w:pPr>
       <w:spacing w:after="100"/>
       <w:ind w:left="210"/>

</xml_diff>

<commit_message>
PDFz 1.0.2: link diretto al download per ogni sistema
- versione-<sistema>.json con "url" (link diretto all'installer di quella versione: Windows MSI, macOS DMG,
  Linux AppImage, Android APK), "size" e "pagina" (packaging/scrivi_versione.py, scrivi-versione.ps1, release.yml)
- aggiornamenti.py passa all'interfaccia file, dimensione e pagina; le app vecchie usano gia' "url"
- campanella: riquadro del download con sistema, file e dimensione, Scarica, link da copiare, pagina della
  versione e come installare
- test del link per le 4 piattaforme e del file della versione
- versione 1.0.2 (MSI 101.0.2, versionCode Android 1001000002), CHANGELOG, novita.json, docs, Word e CLAUDE.md

Co-Authored-By: Claude Opus 5.5 <noreply@anthropic.com>
</commit_message>
<xml_diff>
--- a/docs/PDFz_20261016.docx
+++ b/docs/PDFz_20261016.docx
@@ -16,7 +16,7 @@
           <w:noProof/>
         </w:rPr>
         <w:drawing>
-          <wp:inline distT="0" distB="0" distL="0" distR="0" wp14:anchorId="399A68E5" wp14:editId="73B6F31A">
+          <wp:inline distT="0" distB="0" distL="0" distR="0" wp14:anchorId="4DD2BFCF" wp14:editId="29155838">
             <wp:extent cx="3619500" cy="1285875"/>
             <wp:effectExtent l="0" t="0" r="0" b="0"/>
             <wp:docPr id="1" name="Immagine 1"/>
@@ -95,7 +95,7 @@
           <w:sz w:val="22"/>
           <w:szCs w:val="22"/>
         </w:rPr>
-        <w:t>Versione 1.0.1  ·  16 ottobre 2026  ·  autore: agjin</w:t>
+        <w:t>Versione 1.0.2  ·  16 ottobre 2026  ·  autore: agjin</w:t>
       </w:r>
     </w:p>
     <w:p>
@@ -135,7 +135,7 @@
     <w:sdt>
       <w:sdtPr>
         <w:alias w:val="Indice"/>
-        <w:id w:val="-399285314"/>
+        <w:id w:val="2097592959"/>
       </w:sdtPr>
       <w:sdtEndPr/>
       <w:sdtContent>
@@ -158,7 +158,7 @@
           <w:r>
             <w:fldChar w:fldCharType="separate"/>
           </w:r>
-          <w:hyperlink w:anchor="_Toc243073585" w:history="1">
+          <w:hyperlink w:anchor="_Toc243077437" w:history="1">
             <w:r>
               <w:rPr>
                 <w:rStyle w:val="Collegamentoipertestuale"/>
@@ -182,7 +182,7 @@
               <w:rPr>
                 <w:noProof/>
               </w:rPr>
-              <w:instrText xml:space="preserve"> PAGEREF _Toc243073585 \h </w:instrText>
+              <w:instrText xml:space="preserve"> PAGEREF _Toc243077437 \h </w:instrText>
             </w:r>
             <w:r>
               <w:rPr>
@@ -219,7 +219,7 @@
               <w:noProof/>
             </w:rPr>
           </w:pPr>
-          <w:hyperlink w:anchor="_Toc243073586" w:history="1">
+          <w:hyperlink w:anchor="_Toc243077438" w:history="1">
             <w:r>
               <w:rPr>
                 <w:rStyle w:val="Collegamentoipertestuale"/>
@@ -243,7 +243,7 @@
               <w:rPr>
                 <w:noProof/>
               </w:rPr>
-              <w:instrText xml:space="preserve"> PAGEREF _Toc243073586 \h </w:instrText>
+              <w:instrText xml:space="preserve"> PAGEREF _Toc243077438 \h </w:instrText>
             </w:r>
             <w:r>
               <w:rPr>
@@ -280,7 +280,7 @@
               <w:noProof/>
             </w:rPr>
           </w:pPr>
-          <w:hyperlink w:anchor="_Toc243073587" w:history="1">
+          <w:hyperlink w:anchor="_Toc243077439" w:history="1">
             <w:r>
               <w:rPr>
                 <w:rStyle w:val="Collegamentoipertestuale"/>
@@ -304,7 +304,7 @@
               <w:rPr>
                 <w:noProof/>
               </w:rPr>
-              <w:instrText xml:space="preserve"> PAGEREF _Toc243073587 \h </w:instrText>
+              <w:instrText xml:space="preserve"> PAGEREF _Toc243077439 \h </w:instrText>
             </w:r>
             <w:r>
               <w:rPr>
@@ -341,7 +341,7 @@
               <w:noProof/>
             </w:rPr>
           </w:pPr>
-          <w:hyperlink w:anchor="_Toc243073588" w:history="1">
+          <w:hyperlink w:anchor="_Toc243077440" w:history="1">
             <w:r>
               <w:rPr>
                 <w:rStyle w:val="Collegamentoipertestuale"/>
@@ -365,7 +365,7 @@
               <w:rPr>
                 <w:noProof/>
               </w:rPr>
-              <w:instrText xml:space="preserve"> PAGEREF _Toc243073588 \h </w:instrText>
+              <w:instrText xml:space="preserve"> PAGEREF _Toc243077440 \h </w:instrText>
             </w:r>
             <w:r>
               <w:rPr>
@@ -402,7 +402,7 @@
               <w:noProof/>
             </w:rPr>
           </w:pPr>
-          <w:hyperlink w:anchor="_Toc243073589" w:history="1">
+          <w:hyperlink w:anchor="_Toc243077441" w:history="1">
             <w:r>
               <w:rPr>
                 <w:rStyle w:val="Collegamentoipertestuale"/>
@@ -426,7 +426,7 @@
               <w:rPr>
                 <w:noProof/>
               </w:rPr>
-              <w:instrText xml:space="preserve"> PAGEREF _Toc243073589 \h </w:instrText>
+              <w:instrText xml:space="preserve"> PAGEREF _Toc243077441 \h </w:instrText>
             </w:r>
             <w:r>
               <w:rPr>
@@ -463,7 +463,7 @@
               <w:noProof/>
             </w:rPr>
           </w:pPr>
-          <w:hyperlink w:anchor="_Toc243073590" w:history="1">
+          <w:hyperlink w:anchor="_Toc243077442" w:history="1">
             <w:r>
               <w:rPr>
                 <w:rStyle w:val="Collegamentoipertestuale"/>
@@ -487,7 +487,7 @@
               <w:rPr>
                 <w:noProof/>
               </w:rPr>
-              <w:instrText xml:space="preserve"> PAGEREF _Toc243073590 \h </w:instrText>
+              <w:instrText xml:space="preserve"> PAGEREF _Toc243077442 \h </w:instrText>
             </w:r>
             <w:r>
               <w:rPr>
@@ -524,7 +524,7 @@
               <w:noProof/>
             </w:rPr>
           </w:pPr>
-          <w:hyperlink w:anchor="_Toc243073591" w:history="1">
+          <w:hyperlink w:anchor="_Toc243077443" w:history="1">
             <w:r>
               <w:rPr>
                 <w:rStyle w:val="Collegamentoipertestuale"/>
@@ -548,7 +548,7 @@
               <w:rPr>
                 <w:noProof/>
               </w:rPr>
-              <w:instrText xml:space="preserve"> PAGEREF _Toc243073591 \h </w:instrText>
+              <w:instrText xml:space="preserve"> PAGEREF _Toc243077443 \h </w:instrText>
             </w:r>
             <w:r>
               <w:rPr>
@@ -585,7 +585,7 @@
               <w:noProof/>
             </w:rPr>
           </w:pPr>
-          <w:hyperlink w:anchor="_Toc243073592" w:history="1">
+          <w:hyperlink w:anchor="_Toc243077444" w:history="1">
             <w:r>
               <w:rPr>
                 <w:rStyle w:val="Collegamentoipertestuale"/>
@@ -609,7 +609,7 @@
               <w:rPr>
                 <w:noProof/>
               </w:rPr>
-              <w:instrText xml:space="preserve"> PAGEREF _Toc243073592 \h </w:instrText>
+              <w:instrText xml:space="preserve"> PAGEREF _Toc243077444 \h </w:instrText>
             </w:r>
             <w:r>
               <w:rPr>
@@ -646,7 +646,7 @@
               <w:noProof/>
             </w:rPr>
           </w:pPr>
-          <w:hyperlink w:anchor="_Toc243073593" w:history="1">
+          <w:hyperlink w:anchor="_Toc243077445" w:history="1">
             <w:r>
               <w:rPr>
                 <w:rStyle w:val="Collegamentoipertestuale"/>
@@ -670,7 +670,7 @@
               <w:rPr>
                 <w:noProof/>
               </w:rPr>
-              <w:instrText xml:space="preserve"> PAGEREF _Toc243073593 \h </w:instrText>
+              <w:instrText xml:space="preserve"> PAGEREF _Toc243077445 \h </w:instrText>
             </w:r>
             <w:r>
               <w:rPr>
@@ -707,7 +707,7 @@
               <w:noProof/>
             </w:rPr>
           </w:pPr>
-          <w:hyperlink w:anchor="_Toc243073594" w:history="1">
+          <w:hyperlink w:anchor="_Toc243077446" w:history="1">
             <w:r>
               <w:rPr>
                 <w:rStyle w:val="Collegamentoipertestuale"/>
@@ -731,7 +731,7 @@
               <w:rPr>
                 <w:noProof/>
               </w:rPr>
-              <w:instrText xml:space="preserve"> PAGEREF _Toc243073594 \h </w:instrText>
+              <w:instrText xml:space="preserve"> PAGEREF _Toc243077446 \h </w:instrText>
             </w:r>
             <w:r>
               <w:rPr>
@@ -768,7 +768,7 @@
               <w:noProof/>
             </w:rPr>
           </w:pPr>
-          <w:hyperlink w:anchor="_Toc243073595" w:history="1">
+          <w:hyperlink w:anchor="_Toc243077447" w:history="1">
             <w:r>
               <w:rPr>
                 <w:rStyle w:val="Collegamentoipertestuale"/>
@@ -792,7 +792,7 @@
               <w:rPr>
                 <w:noProof/>
               </w:rPr>
-              <w:instrText xml:space="preserve"> PAGEREF _Toc243073595 \h </w:instrText>
+              <w:instrText xml:space="preserve"> PAGEREF _Toc243077447 \h </w:instrText>
             </w:r>
             <w:r>
               <w:rPr>
@@ -829,7 +829,7 @@
               <w:noProof/>
             </w:rPr>
           </w:pPr>
-          <w:hyperlink w:anchor="_Toc243073596" w:history="1">
+          <w:hyperlink w:anchor="_Toc243077448" w:history="1">
             <w:r>
               <w:rPr>
                 <w:rStyle w:val="Collegamentoipertestuale"/>
@@ -853,7 +853,7 @@
               <w:rPr>
                 <w:noProof/>
               </w:rPr>
-              <w:instrText xml:space="preserve"> PAGEREF _Toc243073596 \h </w:instrText>
+              <w:instrText xml:space="preserve"> PAGEREF _Toc243077448 \h </w:instrText>
             </w:r>
             <w:r>
               <w:rPr>
@@ -890,7 +890,7 @@
               <w:noProof/>
             </w:rPr>
           </w:pPr>
-          <w:hyperlink w:anchor="_Toc243073597" w:history="1">
+          <w:hyperlink w:anchor="_Toc243077449" w:history="1">
             <w:r>
               <w:rPr>
                 <w:rStyle w:val="Collegamentoipertestuale"/>
@@ -914,7 +914,7 @@
               <w:rPr>
                 <w:noProof/>
               </w:rPr>
-              <w:instrText xml:space="preserve"> PAGEREF _Toc243073597 \h </w:instrText>
+              <w:instrText xml:space="preserve"> PAGEREF _Toc243077449 \h </w:instrText>
             </w:r>
             <w:r>
               <w:rPr>
@@ -951,7 +951,7 @@
               <w:noProof/>
             </w:rPr>
           </w:pPr>
-          <w:hyperlink w:anchor="_Toc243073598" w:history="1">
+          <w:hyperlink w:anchor="_Toc243077450" w:history="1">
             <w:r>
               <w:rPr>
                 <w:rStyle w:val="Collegamentoipertestuale"/>
@@ -975,7 +975,7 @@
               <w:rPr>
                 <w:noProof/>
               </w:rPr>
-              <w:instrText xml:space="preserve"> PAGEREF _Toc243073598 \h </w:instrText>
+              <w:instrText xml:space="preserve"> PAGEREF _Toc243077450 \h </w:instrText>
             </w:r>
             <w:r>
               <w:rPr>
@@ -1012,7 +1012,7 @@
               <w:noProof/>
             </w:rPr>
           </w:pPr>
-          <w:hyperlink w:anchor="_Toc243073599" w:history="1">
+          <w:hyperlink w:anchor="_Toc243077451" w:history="1">
             <w:r>
               <w:rPr>
                 <w:rStyle w:val="Collegamentoipertestuale"/>
@@ -1036,7 +1036,7 @@
               <w:rPr>
                 <w:noProof/>
               </w:rPr>
-              <w:instrText xml:space="preserve"> PAGEREF _Toc243073599 \h </w:instrText>
+              <w:instrText xml:space="preserve"> PAGEREF _Toc243077451 \h </w:instrText>
             </w:r>
             <w:r>
               <w:rPr>
@@ -1073,7 +1073,7 @@
               <w:noProof/>
             </w:rPr>
           </w:pPr>
-          <w:hyperlink w:anchor="_Toc243073600" w:history="1">
+          <w:hyperlink w:anchor="_Toc243077452" w:history="1">
             <w:r>
               <w:rPr>
                 <w:rStyle w:val="Collegamentoipertestuale"/>
@@ -1097,7 +1097,7 @@
               <w:rPr>
                 <w:noProof/>
               </w:rPr>
-              <w:instrText xml:space="preserve"> PAGEREF _Toc243073600 \h </w:instrText>
+              <w:instrText xml:space="preserve"> PAGEREF _Toc243077452 \h </w:instrText>
             </w:r>
             <w:r>
               <w:rPr>
@@ -1134,7 +1134,7 @@
               <w:noProof/>
             </w:rPr>
           </w:pPr>
-          <w:hyperlink w:anchor="_Toc243073601" w:history="1">
+          <w:hyperlink w:anchor="_Toc243077453" w:history="1">
             <w:r>
               <w:rPr>
                 <w:rStyle w:val="Collegamentoipertestuale"/>
@@ -1158,7 +1158,7 @@
               <w:rPr>
                 <w:noProof/>
               </w:rPr>
-              <w:instrText xml:space="preserve"> PAGEREF _Toc243073601 \h </w:instrText>
+              <w:instrText xml:space="preserve"> PAGEREF _Toc243077453 \h </w:instrText>
             </w:r>
             <w:r>
               <w:rPr>
@@ -1195,7 +1195,7 @@
               <w:noProof/>
             </w:rPr>
           </w:pPr>
-          <w:hyperlink w:anchor="_Toc243073602" w:history="1">
+          <w:hyperlink w:anchor="_Toc243077454" w:history="1">
             <w:r>
               <w:rPr>
                 <w:rStyle w:val="Collegamentoipertestuale"/>
@@ -1219,7 +1219,7 @@
               <w:rPr>
                 <w:noProof/>
               </w:rPr>
-              <w:instrText xml:space="preserve"> PAGEREF _Toc243073602 \h </w:instrText>
+              <w:instrText xml:space="preserve"> PAGEREF _Toc243077454 \h </w:instrText>
             </w:r>
             <w:r>
               <w:rPr>
@@ -1256,7 +1256,7 @@
               <w:noProof/>
             </w:rPr>
           </w:pPr>
-          <w:hyperlink w:anchor="_Toc243073603" w:history="1">
+          <w:hyperlink w:anchor="_Toc243077455" w:history="1">
             <w:r>
               <w:rPr>
                 <w:rStyle w:val="Collegamentoipertestuale"/>
@@ -1280,7 +1280,7 @@
               <w:rPr>
                 <w:noProof/>
               </w:rPr>
-              <w:instrText xml:space="preserve"> PAGEREF _Toc243073603 \h </w:instrText>
+              <w:instrText xml:space="preserve"> PAGEREF _Toc243077455 \h </w:instrText>
             </w:r>
             <w:r>
               <w:rPr>
@@ -1317,7 +1317,7 @@
               <w:noProof/>
             </w:rPr>
           </w:pPr>
-          <w:hyperlink w:anchor="_Toc243073604" w:history="1">
+          <w:hyperlink w:anchor="_Toc243077456" w:history="1">
             <w:r>
               <w:rPr>
                 <w:rStyle w:val="Collegamentoipertestuale"/>
@@ -1341,7 +1341,7 @@
               <w:rPr>
                 <w:noProof/>
               </w:rPr>
-              <w:instrText xml:space="preserve"> PAGEREF _Toc243073604 \h </w:instrText>
+              <w:instrText xml:space="preserve"> PAGEREF _Toc243077456 \h </w:instrText>
             </w:r>
             <w:r>
               <w:rPr>
@@ -1378,7 +1378,7 @@
               <w:noProof/>
             </w:rPr>
           </w:pPr>
-          <w:hyperlink w:anchor="_Toc243073605" w:history="1">
+          <w:hyperlink w:anchor="_Toc243077457" w:history="1">
             <w:r>
               <w:rPr>
                 <w:rStyle w:val="Collegamentoipertestuale"/>
@@ -1402,7 +1402,7 @@
               <w:rPr>
                 <w:noProof/>
               </w:rPr>
-              <w:instrText xml:space="preserve"> PAGEREF _Toc243073605 \h </w:instrText>
+              <w:instrText xml:space="preserve"> PAGEREF _Toc243077457 \h </w:instrText>
             </w:r>
             <w:r>
               <w:rPr>
@@ -1439,7 +1439,7 @@
               <w:noProof/>
             </w:rPr>
           </w:pPr>
-          <w:hyperlink w:anchor="_Toc243073606" w:history="1">
+          <w:hyperlink w:anchor="_Toc243077458" w:history="1">
             <w:r>
               <w:rPr>
                 <w:rStyle w:val="Collegamentoipertestuale"/>
@@ -1463,7 +1463,7 @@
               <w:rPr>
                 <w:noProof/>
               </w:rPr>
-              <w:instrText xml:space="preserve"> PAGEREF _Toc243073606 \h </w:instrText>
+              <w:instrText xml:space="preserve"> PAGEREF _Toc243077458 \h </w:instrText>
             </w:r>
             <w:r>
               <w:rPr>
@@ -1500,7 +1500,7 @@
               <w:noProof/>
             </w:rPr>
           </w:pPr>
-          <w:hyperlink w:anchor="_Toc243073607" w:history="1">
+          <w:hyperlink w:anchor="_Toc243077459" w:history="1">
             <w:r>
               <w:rPr>
                 <w:rStyle w:val="Collegamentoipertestuale"/>
@@ -1524,7 +1524,7 @@
               <w:rPr>
                 <w:noProof/>
               </w:rPr>
-              <w:instrText xml:space="preserve"> PAGEREF _Toc243073607 \h </w:instrText>
+              <w:instrText xml:space="preserve"> PAGEREF _Toc243077459 \h </w:instrText>
             </w:r>
             <w:r>
               <w:rPr>
@@ -1561,7 +1561,7 @@
               <w:noProof/>
             </w:rPr>
           </w:pPr>
-          <w:hyperlink w:anchor="_Toc243073608" w:history="1">
+          <w:hyperlink w:anchor="_Toc243077460" w:history="1">
             <w:r>
               <w:rPr>
                 <w:rStyle w:val="Collegamentoipertestuale"/>
@@ -1585,7 +1585,7 @@
               <w:rPr>
                 <w:noProof/>
               </w:rPr>
-              <w:instrText xml:space="preserve"> PAGEREF _Toc243073608 \h </w:instrText>
+              <w:instrText xml:space="preserve"> PAGEREF _Toc243077460 \h </w:instrText>
             </w:r>
             <w:r>
               <w:rPr>
@@ -1622,7 +1622,7 @@
               <w:noProof/>
             </w:rPr>
           </w:pPr>
-          <w:hyperlink w:anchor="_Toc243073609" w:history="1">
+          <w:hyperlink w:anchor="_Toc243077461" w:history="1">
             <w:r>
               <w:rPr>
                 <w:rStyle w:val="Collegamentoipertestuale"/>
@@ -1646,7 +1646,7 @@
               <w:rPr>
                 <w:noProof/>
               </w:rPr>
-              <w:instrText xml:space="preserve"> PAGEREF _Toc243073609 \h </w:instrText>
+              <w:instrText xml:space="preserve"> PAGEREF _Toc243077461 \h </w:instrText>
             </w:r>
             <w:r>
               <w:rPr>
@@ -1683,13 +1683,13 @@
               <w:noProof/>
             </w:rPr>
           </w:pPr>
-          <w:hyperlink w:anchor="_Toc243073610" w:history="1">
+          <w:hyperlink w:anchor="_Toc243077462" w:history="1">
             <w:r>
               <w:rPr>
                 <w:rStyle w:val="Collegamentoipertestuale"/>
                 <w:noProof/>
               </w:rPr>
-              <w:t>6.5 Ruoli</w:t>
+              <w:t>6.5 Nuova versione: link diretto per ogni sistema</w:t>
             </w:r>
             <w:r>
               <w:rPr>
@@ -1707,7 +1707,7 @@
               <w:rPr>
                 <w:noProof/>
               </w:rPr>
-              <w:instrText xml:space="preserve"> PAGEREF _Toc243073610 \h </w:instrText>
+              <w:instrText xml:space="preserve"> PAGEREF _Toc243077462 \h </w:instrText>
             </w:r>
             <w:r>
               <w:rPr>
@@ -1725,6 +1725,67 @@
                 <w:noProof/>
               </w:rPr>
               <w:t>13</w:t>
+            </w:r>
+            <w:r>
+              <w:rPr>
+                <w:noProof/>
+              </w:rPr>
+              <w:fldChar w:fldCharType="end"/>
+            </w:r>
+          </w:hyperlink>
+        </w:p>
+        <w:p>
+          <w:pPr>
+            <w:pStyle w:val="Sommario2"/>
+            <w:tabs>
+              <w:tab w:val="right" w:leader="dot" w:pos="9628"/>
+            </w:tabs>
+            <w:rPr>
+              <w:noProof/>
+            </w:rPr>
+          </w:pPr>
+          <w:hyperlink w:anchor="_Toc243077463" w:history="1">
+            <w:r>
+              <w:rPr>
+                <w:rStyle w:val="Collegamentoipertestuale"/>
+                <w:noProof/>
+              </w:rPr>
+              <w:t>6.6 Ruoli</w:t>
+            </w:r>
+            <w:r>
+              <w:rPr>
+                <w:noProof/>
+              </w:rPr>
+              <w:tab/>
+            </w:r>
+            <w:r>
+              <w:rPr>
+                <w:noProof/>
+              </w:rPr>
+              <w:fldChar w:fldCharType="begin"/>
+            </w:r>
+            <w:r>
+              <w:rPr>
+                <w:noProof/>
+              </w:rPr>
+              <w:instrText xml:space="preserve"> PAGEREF _Toc243077463 \h </w:instrText>
+            </w:r>
+            <w:r>
+              <w:rPr>
+                <w:noProof/>
+              </w:rPr>
+            </w:r>
+            <w:r>
+              <w:rPr>
+                <w:noProof/>
+              </w:rPr>
+              <w:fldChar w:fldCharType="separate"/>
+            </w:r>
+            <w:r>
+              <w:rPr>
+                <w:noProof/>
+              </w:rPr>
+              <w:t>14</w:t>
             </w:r>
             <w:r>
               <w:rPr>
@@ -1744,7 +1805,7 @@
               <w:noProof/>
             </w:rPr>
           </w:pPr>
-          <w:hyperlink w:anchor="_Toc243073611" w:history="1">
+          <w:hyperlink w:anchor="_Toc243077464" w:history="1">
             <w:r>
               <w:rPr>
                 <w:rStyle w:val="Collegamentoipertestuale"/>
@@ -1768,7 +1829,7 @@
               <w:rPr>
                 <w:noProof/>
               </w:rPr>
-              <w:instrText xml:space="preserve"> PAGEREF _Toc243073611 \h </w:instrText>
+              <w:instrText xml:space="preserve"> PAGEREF _Toc243077464 \h </w:instrText>
             </w:r>
             <w:r>
               <w:rPr>
@@ -1785,7 +1846,7 @@
               <w:rPr>
                 <w:noProof/>
               </w:rPr>
-              <w:t>13</w:t>
+              <w:t>14</w:t>
             </w:r>
             <w:r>
               <w:rPr>
@@ -1805,7 +1866,7 @@
               <w:noProof/>
             </w:rPr>
           </w:pPr>
-          <w:hyperlink w:anchor="_Toc243073612" w:history="1">
+          <w:hyperlink w:anchor="_Toc243077465" w:history="1">
             <w:r>
               <w:rPr>
                 <w:rStyle w:val="Collegamentoipertestuale"/>
@@ -1829,7 +1890,7 @@
               <w:rPr>
                 <w:noProof/>
               </w:rPr>
-              <w:instrText xml:space="preserve"> PAGEREF _Toc243073612 \h </w:instrText>
+              <w:instrText xml:space="preserve"> PAGEREF _Toc243077465 \h </w:instrText>
             </w:r>
             <w:r>
               <w:rPr>
@@ -1846,7 +1907,7 @@
               <w:rPr>
                 <w:noProof/>
               </w:rPr>
-              <w:t>13</w:t>
+              <w:t>15</w:t>
             </w:r>
             <w:r>
               <w:rPr>
@@ -1866,7 +1927,7 @@
               <w:noProof/>
             </w:rPr>
           </w:pPr>
-          <w:hyperlink w:anchor="_Toc243073613" w:history="1">
+          <w:hyperlink w:anchor="_Toc243077466" w:history="1">
             <w:r>
               <w:rPr>
                 <w:rStyle w:val="Collegamentoipertestuale"/>
@@ -1890,7 +1951,7 @@
               <w:rPr>
                 <w:noProof/>
               </w:rPr>
-              <w:instrText xml:space="preserve"> PAGEREF _Toc243073613 \h </w:instrText>
+              <w:instrText xml:space="preserve"> PAGEREF _Toc243077466 \h </w:instrText>
             </w:r>
             <w:r>
               <w:rPr>
@@ -1907,7 +1968,7 @@
               <w:rPr>
                 <w:noProof/>
               </w:rPr>
-              <w:t>14</w:t>
+              <w:t>15</w:t>
             </w:r>
             <w:r>
               <w:rPr>
@@ -1933,7 +1994,7 @@
       <w:pPr>
         <w:pStyle w:val="Titolo1"/>
       </w:pPr>
-      <w:bookmarkStart w:id="0" w:name="_Toc243073585"/>
+      <w:bookmarkStart w:id="0" w:name="_Toc243077437"/>
       <w:r>
         <w:t>1. In breve</w:t>
       </w:r>
@@ -2101,7 +2162,27 @@
         <w:t>versione 1.0.1</w:t>
       </w:r>
       <w:r>
-        <w:t>: menu Tema e campanella delle notifiche corretti su telefono e tablet (vedi 4.4).</w:t>
+        <w:t>: menu Tema e campanella delle notifiche corretti su telefono e tablet (vedi 4.4);</w:t>
+      </w:r>
+    </w:p>
+    <w:p>
+      <w:pPr>
+        <w:pStyle w:val="Paragrafoelenco"/>
+        <w:numPr>
+          <w:ilvl w:val="0"/>
+          <w:numId w:val="2"/>
+        </w:numPr>
+        <w:spacing w:after="60"/>
+      </w:pPr>
+      <w:r>
+        <w:rPr>
+          <w:b/>
+          <w:bCs/>
+        </w:rPr>
+        <w:t>versione 1.0.2</w:t>
+      </w:r>
+      <w:r>
+        <w:t>: quando esce una versione nuova, link diretto all'installer del proprio sistema (vedi 6.5).</w:t>
       </w:r>
     </w:p>
     <w:p>
@@ -2124,7 +2205,7 @@
       <w:pPr>
         <w:pStyle w:val="Titolo1"/>
       </w:pPr>
-      <w:bookmarkStart w:id="1" w:name="_Toc243073586"/>
+      <w:bookmarkStart w:id="1" w:name="_Toc243077438"/>
       <w:r>
         <w:t>2. Nuovo marchio</w:t>
       </w:r>
@@ -2134,7 +2215,7 @@
       <w:pPr>
         <w:pStyle w:val="Titolo2"/>
       </w:pPr>
-      <w:bookmarkStart w:id="2" w:name="_Toc243073587"/>
+      <w:bookmarkStart w:id="2" w:name="_Toc243077439"/>
       <w:r>
         <w:t>2.1 Nomi e identificativi</w:t>
       </w:r>
@@ -2680,7 +2761,7 @@
       <w:pPr>
         <w:pStyle w:val="Titolo2"/>
       </w:pPr>
-      <w:bookmarkStart w:id="3" w:name="_Toc243073588"/>
+      <w:bookmarkStart w:id="3" w:name="_Toc243077440"/>
       <w:r>
         <w:t>2.2 Colori</w:t>
       </w:r>
@@ -3075,7 +3156,7 @@
       <w:pPr>
         <w:pStyle w:val="Titolo2"/>
       </w:pPr>
-      <w:bookmarkStart w:id="4" w:name="_Toc243073589"/>
+      <w:bookmarkStart w:id="4" w:name="_Toc243077441"/>
       <w:r>
         <w:t>2.3 Icona in uso: 17 «Foglio oro» (serie 4)</w:t>
       </w:r>
@@ -3109,7 +3190,7 @@
           <w:noProof/>
         </w:rPr>
         <w:drawing>
-          <wp:inline distT="0" distB="0" distL="0" distR="0" wp14:anchorId="4C992B73" wp14:editId="2B24B01F">
+          <wp:inline distT="0" distB="0" distL="0" distR="0" wp14:anchorId="32E62506" wp14:editId="4227385D">
             <wp:extent cx="5334000" cy="5895975"/>
             <wp:effectExtent l="0" t="0" r="0" b="0"/>
             <wp:docPr id="2" name="Immagine 2"/>
@@ -3529,7 +3610,7 @@
       <w:pPr>
         <w:pStyle w:val="Titolo2"/>
       </w:pPr>
-      <w:bookmarkStart w:id="5" w:name="_Toc243073590"/>
+      <w:bookmarkStart w:id="5" w:name="_Toc243077442"/>
       <w:r>
         <w:t>2.4 Serie 3, non scelta (la 11 è diventata la serie 4)</w:t>
       </w:r>
@@ -3553,7 +3634,7 @@
           <w:noProof/>
         </w:rPr>
         <w:drawing>
-          <wp:inline distT="0" distB="0" distL="0" distR="0" wp14:anchorId="39856AD5" wp14:editId="4E60317D">
+          <wp:inline distT="0" distB="0" distL="0" distR="0" wp14:anchorId="75AA11D0" wp14:editId="187A4416">
             <wp:extent cx="5905500" cy="4133850"/>
             <wp:effectExtent l="0" t="0" r="0" b="0"/>
             <wp:docPr id="3" name="Immagine 3"/>
@@ -4239,7 +4320,7 @@
       <w:pPr>
         <w:pStyle w:val="Titolo2"/>
       </w:pPr>
-      <w:bookmarkStart w:id="6" w:name="_Toc243073591"/>
+      <w:bookmarkStart w:id="6" w:name="_Toc243077443"/>
       <w:r>
         <w:t>2.5 Serie 2, non scelta</w:t>
       </w:r>
@@ -4263,7 +4344,7 @@
           <w:noProof/>
         </w:rPr>
         <w:drawing>
-          <wp:inline distT="0" distB="0" distL="0" distR="0" wp14:anchorId="5B576685" wp14:editId="4304DB8D">
+          <wp:inline distT="0" distB="0" distL="0" distR="0" wp14:anchorId="2592CCA5" wp14:editId="0BC1A8D1">
             <wp:extent cx="5905500" cy="4133850"/>
             <wp:effectExtent l="0" t="0" r="0" b="0"/>
             <wp:docPr id="4" name="Immagine 4"/>
@@ -4983,7 +5064,7 @@
       <w:pPr>
         <w:pStyle w:val="Titolo2"/>
       </w:pPr>
-      <w:bookmarkStart w:id="7" w:name="_Toc243073592"/>
+      <w:bookmarkStart w:id="7" w:name="_Toc243077444"/>
       <w:r>
         <w:t>2.6 Serie 1, scartata</w:t>
       </w:r>
@@ -5007,7 +5088,7 @@
           <w:noProof/>
         </w:rPr>
         <w:drawing>
-          <wp:inline distT="0" distB="0" distL="0" distR="0" wp14:anchorId="2C6784E5" wp14:editId="1A620269">
+          <wp:inline distT="0" distB="0" distL="0" distR="0" wp14:anchorId="1F76095C" wp14:editId="0E51C114">
             <wp:extent cx="4000500" cy="2800350"/>
             <wp:effectExtent l="0" t="0" r="0" b="0"/>
             <wp:docPr id="5" name="Immagine 5"/>
@@ -5066,7 +5147,7 @@
       <w:pPr>
         <w:pStyle w:val="Titolo2"/>
       </w:pPr>
-      <w:bookmarkStart w:id="8" w:name="_Toc243073593"/>
+      <w:bookmarkStart w:id="8" w:name="_Toc243077445"/>
       <w:r>
         <w:t>2.7 Verifica dei marchi registrati</w:t>
       </w:r>
@@ -5318,7 +5399,7 @@
       <w:pPr>
         <w:pStyle w:val="Titolo1"/>
       </w:pPr>
-      <w:bookmarkStart w:id="9" w:name="_Toc243073594"/>
+      <w:bookmarkStart w:id="9" w:name="_Toc243077446"/>
       <w:r>
         <w:t>3. Temi colore</w:t>
       </w:r>
@@ -5352,7 +5433,7 @@
           <w:noProof/>
         </w:rPr>
         <w:drawing>
-          <wp:inline distT="0" distB="0" distL="0" distR="0" wp14:anchorId="3D0338FB" wp14:editId="3FADCFEC">
+          <wp:inline distT="0" distB="0" distL="0" distR="0" wp14:anchorId="7168C7A5" wp14:editId="5BC00BA9">
             <wp:extent cx="4572000" cy="3429000"/>
             <wp:effectExtent l="0" t="0" r="0" b="0"/>
             <wp:docPr id="6" name="Immagine 6"/>
@@ -6062,7 +6143,7 @@
       <w:pPr>
         <w:pStyle w:val="Titolo1"/>
       </w:pPr>
-      <w:bookmarkStart w:id="10" w:name="_Toc243073595"/>
+      <w:bookmarkStart w:id="10" w:name="_Toc243077447"/>
       <w:r>
         <w:t>4. Correzione: avvisi «come JavaScript»</w:t>
       </w:r>
@@ -6072,7 +6153,7 @@
       <w:pPr>
         <w:pStyle w:val="Titolo2"/>
       </w:pPr>
-      <w:bookmarkStart w:id="11" w:name="_Toc243073596"/>
+      <w:bookmarkStart w:id="11" w:name="_Toc243077448"/>
       <w:r>
         <w:t>4.1 Il problema</w:t>
       </w:r>
@@ -6475,7 +6556,7 @@
       <w:pPr>
         <w:pStyle w:val="Titolo2"/>
       </w:pPr>
-      <w:bookmarkStart w:id="12" w:name="_Toc243073597"/>
+      <w:bookmarkStart w:id="12" w:name="_Toc243077449"/>
       <w:r>
         <w:t>4.2 La soluzione</w:t>
       </w:r>
@@ -6608,7 +6689,7 @@
           <w:noProof/>
         </w:rPr>
         <w:drawing>
-          <wp:inline distT="0" distB="0" distL="0" distR="0" wp14:anchorId="0A0E694E" wp14:editId="65EA7D45">
+          <wp:inline distT="0" distB="0" distL="0" distR="0" wp14:anchorId="718C4302" wp14:editId="2CF3A428">
             <wp:extent cx="4572000" cy="3429000"/>
             <wp:effectExtent l="0" t="0" r="0" b="0"/>
             <wp:docPr id="7" name="Immagine 7"/>
@@ -6667,7 +6748,7 @@
       <w:pPr>
         <w:pStyle w:val="Titolo2"/>
       </w:pPr>
-      <w:bookmarkStart w:id="13" w:name="_Toc243073598"/>
+      <w:bookmarkStart w:id="13" w:name="_Toc243077450"/>
       <w:r>
         <w:t>4.3 Verifiche</w:t>
       </w:r>
@@ -6714,7 +6795,7 @@
       <w:pPr>
         <w:pStyle w:val="Titolo2"/>
       </w:pPr>
-      <w:bookmarkStart w:id="14" w:name="_Toc243073599"/>
+      <w:bookmarkStart w:id="14" w:name="_Toc243077451"/>
       <w:r>
         <w:t>4.4 Android: menu Tema e notifiche (versione 1.0.1)</w:t>
       </w:r>
@@ -7049,7 +7130,7 @@
       <w:pPr>
         <w:pStyle w:val="Titolo1"/>
       </w:pPr>
-      <w:bookmarkStart w:id="15" w:name="_Toc243073600"/>
+      <w:bookmarkStart w:id="15" w:name="_Toc243077452"/>
       <w:r>
         <w:t>5. Decisioni</w:t>
       </w:r>
@@ -7067,7 +7148,7 @@
       <w:pPr>
         <w:pStyle w:val="Titolo2"/>
       </w:pPr>
-      <w:bookmarkStart w:id="16" w:name="_Toc243073601"/>
+      <w:bookmarkStart w:id="16" w:name="_Toc243077453"/>
       <w:r>
         <w:t>5.1 Canale degli aggiornamenti</w:t>
       </w:r>
@@ -7574,7 +7655,7 @@
       <w:pPr>
         <w:pStyle w:val="Titolo2"/>
       </w:pPr>
-      <w:bookmarkStart w:id="17" w:name="_Toc243073602"/>
+      <w:bookmarkStart w:id="17" w:name="_Toc243077454"/>
       <w:r>
         <w:t>5.2 Storia del repository</w:t>
       </w:r>
@@ -8081,7 +8162,7 @@
       <w:pPr>
         <w:pStyle w:val="Titolo2"/>
       </w:pPr>
-      <w:bookmarkStart w:id="18" w:name="_Toc243073603"/>
+      <w:bookmarkStart w:id="18" w:name="_Toc243077455"/>
       <w:r>
         <w:t>5.3 Identificativi del prodotto</w:t>
       </w:r>
@@ -8581,7 +8662,7 @@
       <w:pPr>
         <w:pStyle w:val="Titolo2"/>
       </w:pPr>
-      <w:bookmarkStart w:id="19" w:name="_Toc243073604"/>
+      <w:bookmarkStart w:id="19" w:name="_Toc243077456"/>
       <w:r>
         <w:t>5.4 Avvisi e domande</w:t>
       </w:r>
@@ -9088,7 +9169,7 @@
       <w:pPr>
         <w:pStyle w:val="Titolo1"/>
       </w:pPr>
-      <w:bookmarkStart w:id="20" w:name="_Toc243073605"/>
+      <w:bookmarkStart w:id="20" w:name="_Toc243077457"/>
       <w:r>
         <w:t>6. Come si lavora</w:t>
       </w:r>
@@ -9098,7 +9179,7 @@
       <w:pPr>
         <w:pStyle w:val="Titolo2"/>
       </w:pPr>
-      <w:bookmarkStart w:id="21" w:name="_Toc243073606"/>
+      <w:bookmarkStart w:id="21" w:name="_Toc243077458"/>
       <w:r>
         <w:t>6.1 Comandi</w:t>
       </w:r>
@@ -9168,7 +9249,7 @@
       <w:pPr>
         <w:pStyle w:val="Titolo2"/>
       </w:pPr>
-      <w:bookmarkStart w:id="22" w:name="_Toc243073607"/>
+      <w:bookmarkStart w:id="22" w:name="_Toc243077459"/>
       <w:r>
         <w:t>6.2 Pubblicare una versione</w:t>
       </w:r>
@@ -9296,7 +9377,7 @@
       <w:pPr>
         <w:pStyle w:val="Titolo2"/>
       </w:pPr>
-      <w:bookmarkStart w:id="23" w:name="_Toc243073608"/>
+      <w:bookmarkStart w:id="23" w:name="_Toc243077460"/>
       <w:r>
         <w:t>6.3 Release 1.0.0 (pubblicata il 16 ottobre 2026)</w:t>
       </w:r>
@@ -10023,7 +10104,7 @@
       <w:pPr>
         <w:pStyle w:val="Titolo2"/>
       </w:pPr>
-      <w:bookmarkStart w:id="24" w:name="_Toc243073609"/>
+      <w:bookmarkStart w:id="24" w:name="_Toc243077461"/>
       <w:r>
         <w:t>6.4 Release 1.0.1</w:t>
       </w:r>
@@ -10320,11 +10401,503 @@
       <w:pPr>
         <w:pStyle w:val="Titolo2"/>
       </w:pPr>
-      <w:bookmarkStart w:id="25" w:name="_Toc243073610"/>
-      <w:r>
-        <w:t>6.5 Ruoli</w:t>
+      <w:bookmarkStart w:id="25" w:name="_Toc243077462"/>
+      <w:r>
+        <w:t>6.5 Nuova versione: link diretto per ogni sistema</w:t>
       </w:r>
       <w:bookmarkEnd w:id="25"/>
+    </w:p>
+    <w:p>
+      <w:pPr>
+        <w:spacing w:after="120"/>
+      </w:pPr>
+      <w:r>
+        <w:t>Quando esce una versione nuova, ogni app legge il file della sua piattaforma e propone l'installer giusto, con il link diretto:</w:t>
+      </w:r>
+    </w:p>
+    <w:tbl>
+      <w:tblPr>
+        <w:tblW w:w="9638" w:type="dxa"/>
+        <w:tblBorders>
+          <w:top w:val="single" w:sz="4" w:space="0" w:color="auto"/>
+          <w:left w:val="single" w:sz="4" w:space="0" w:color="auto"/>
+          <w:bottom w:val="single" w:sz="4" w:space="0" w:color="auto"/>
+          <w:right w:val="single" w:sz="4" w:space="0" w:color="auto"/>
+          <w:insideH w:val="single" w:sz="4" w:space="0" w:color="auto"/>
+          <w:insideV w:val="single" w:sz="4" w:space="0" w:color="auto"/>
+        </w:tblBorders>
+        <w:tblLook w:val="04A0" w:firstRow="1" w:lastRow="0" w:firstColumn="1" w:lastColumn="0" w:noHBand="0" w:noVBand="1"/>
+      </w:tblPr>
+      <w:tblGrid>
+        <w:gridCol w:w="1735"/>
+        <w:gridCol w:w="3470"/>
+        <w:gridCol w:w="4433"/>
+      </w:tblGrid>
+      <w:tr>
+        <w:trPr>
+          <w:tblHeader/>
+        </w:trPr>
+        <w:tc>
+          <w:tcPr>
+            <w:tcW w:w="1735" w:type="dxa"/>
+            <w:tcBorders>
+              <w:top w:val="single" w:sz="4" w:space="0" w:color="D4CEC7"/>
+              <w:left w:val="single" w:sz="4" w:space="0" w:color="D4CEC7"/>
+              <w:bottom w:val="single" w:sz="4" w:space="0" w:color="D4CEC7"/>
+              <w:right w:val="single" w:sz="4" w:space="0" w:color="D4CEC7"/>
+            </w:tcBorders>
+            <w:shd w:val="clear" w:color="auto" w:fill="B3122B"/>
+            <w:tcMar>
+              <w:top w:w="60" w:type="dxa"/>
+              <w:left w:w="100" w:type="dxa"/>
+              <w:bottom w:w="60" w:type="dxa"/>
+              <w:right w:w="100" w:type="dxa"/>
+            </w:tcMar>
+          </w:tcPr>
+          <w:p>
+            <w:r>
+              <w:rPr>
+                <w:b/>
+                <w:bCs/>
+                <w:color w:val="FFFFFF"/>
+              </w:rPr>
+              <w:t>Sistema</w:t>
+            </w:r>
+          </w:p>
+        </w:tc>
+        <w:tc>
+          <w:tcPr>
+            <w:tcW w:w="3470" w:type="dxa"/>
+            <w:tcBorders>
+              <w:top w:val="single" w:sz="4" w:space="0" w:color="D4CEC7"/>
+              <w:left w:val="single" w:sz="4" w:space="0" w:color="D4CEC7"/>
+              <w:bottom w:val="single" w:sz="4" w:space="0" w:color="D4CEC7"/>
+              <w:right w:val="single" w:sz="4" w:space="0" w:color="D4CEC7"/>
+            </w:tcBorders>
+            <w:shd w:val="clear" w:color="auto" w:fill="B3122B"/>
+            <w:tcMar>
+              <w:top w:w="60" w:type="dxa"/>
+              <w:left w:w="100" w:type="dxa"/>
+              <w:bottom w:w="60" w:type="dxa"/>
+              <w:right w:w="100" w:type="dxa"/>
+            </w:tcMar>
+          </w:tcPr>
+          <w:p>
+            <w:r>
+              <w:rPr>
+                <w:b/>
+                <w:bCs/>
+                <w:color w:val="FFFFFF"/>
+              </w:rPr>
+              <w:t>File letto dall'app</w:t>
+            </w:r>
+          </w:p>
+        </w:tc>
+        <w:tc>
+          <w:tcPr>
+            <w:tcW w:w="4433" w:type="dxa"/>
+            <w:tcBorders>
+              <w:top w:val="single" w:sz="4" w:space="0" w:color="D4CEC7"/>
+              <w:left w:val="single" w:sz="4" w:space="0" w:color="D4CEC7"/>
+              <w:bottom w:val="single" w:sz="4" w:space="0" w:color="D4CEC7"/>
+              <w:right w:val="single" w:sz="4" w:space="0" w:color="D4CEC7"/>
+            </w:tcBorders>
+            <w:shd w:val="clear" w:color="auto" w:fill="B3122B"/>
+            <w:tcMar>
+              <w:top w:w="60" w:type="dxa"/>
+              <w:left w:w="100" w:type="dxa"/>
+              <w:bottom w:w="60" w:type="dxa"/>
+              <w:right w:w="100" w:type="dxa"/>
+            </w:tcMar>
+          </w:tcPr>
+          <w:p>
+            <w:r>
+              <w:rPr>
+                <w:b/>
+                <w:bCs/>
+                <w:color w:val="FFFFFF"/>
+              </w:rPr>
+              <w:t>Installer proposto</w:t>
+            </w:r>
+          </w:p>
+        </w:tc>
+      </w:tr>
+      <w:tr>
+        <w:tc>
+          <w:tcPr>
+            <w:tcW w:w="1735" w:type="dxa"/>
+            <w:tcBorders>
+              <w:top w:val="single" w:sz="4" w:space="0" w:color="D4CEC7"/>
+              <w:left w:val="single" w:sz="4" w:space="0" w:color="D4CEC7"/>
+              <w:bottom w:val="single" w:sz="4" w:space="0" w:color="D4CEC7"/>
+              <w:right w:val="single" w:sz="4" w:space="0" w:color="D4CEC7"/>
+            </w:tcBorders>
+            <w:tcMar>
+              <w:top w:w="60" w:type="dxa"/>
+              <w:left w:w="100" w:type="dxa"/>
+              <w:bottom w:w="60" w:type="dxa"/>
+              <w:right w:w="100" w:type="dxa"/>
+            </w:tcMar>
+          </w:tcPr>
+          <w:p>
+            <w:r>
+              <w:t>Windows</w:t>
+            </w:r>
+          </w:p>
+        </w:tc>
+        <w:tc>
+          <w:tcPr>
+            <w:tcW w:w="3470" w:type="dxa"/>
+            <w:tcBorders>
+              <w:top w:val="single" w:sz="4" w:space="0" w:color="D4CEC7"/>
+              <w:left w:val="single" w:sz="4" w:space="0" w:color="D4CEC7"/>
+              <w:bottom w:val="single" w:sz="4" w:space="0" w:color="D4CEC7"/>
+              <w:right w:val="single" w:sz="4" w:space="0" w:color="D4CEC7"/>
+            </w:tcBorders>
+            <w:tcMar>
+              <w:top w:w="60" w:type="dxa"/>
+              <w:left w:w="100" w:type="dxa"/>
+              <w:bottom w:w="60" w:type="dxa"/>
+              <w:right w:w="100" w:type="dxa"/>
+            </w:tcMar>
+          </w:tcPr>
+          <w:p>
+            <w:r>
+              <w:t>versione-windows.json</w:t>
+            </w:r>
+          </w:p>
+        </w:tc>
+        <w:tc>
+          <w:tcPr>
+            <w:tcW w:w="4433" w:type="dxa"/>
+            <w:tcBorders>
+              <w:top w:val="single" w:sz="4" w:space="0" w:color="D4CEC7"/>
+              <w:left w:val="single" w:sz="4" w:space="0" w:color="D4CEC7"/>
+              <w:bottom w:val="single" w:sz="4" w:space="0" w:color="D4CEC7"/>
+              <w:right w:val="single" w:sz="4" w:space="0" w:color="D4CEC7"/>
+            </w:tcBorders>
+            <w:tcMar>
+              <w:top w:w="60" w:type="dxa"/>
+              <w:left w:w="100" w:type="dxa"/>
+              <w:bottom w:w="60" w:type="dxa"/>
+              <w:right w:w="100" w:type="dxa"/>
+            </w:tcMar>
+          </w:tcPr>
+          <w:p>
+            <w:r>
+              <w:t>PDFz-X.Y.Z-x64.msi</w:t>
+            </w:r>
+          </w:p>
+        </w:tc>
+      </w:tr>
+      <w:tr>
+        <w:tc>
+          <w:tcPr>
+            <w:tcW w:w="1735" w:type="dxa"/>
+            <w:tcBorders>
+              <w:top w:val="single" w:sz="4" w:space="0" w:color="D4CEC7"/>
+              <w:left w:val="single" w:sz="4" w:space="0" w:color="D4CEC7"/>
+              <w:bottom w:val="single" w:sz="4" w:space="0" w:color="D4CEC7"/>
+              <w:right w:val="single" w:sz="4" w:space="0" w:color="D4CEC7"/>
+            </w:tcBorders>
+            <w:tcMar>
+              <w:top w:w="60" w:type="dxa"/>
+              <w:left w:w="100" w:type="dxa"/>
+              <w:bottom w:w="60" w:type="dxa"/>
+              <w:right w:w="100" w:type="dxa"/>
+            </w:tcMar>
+          </w:tcPr>
+          <w:p>
+            <w:r>
+              <w:t>macOS</w:t>
+            </w:r>
+          </w:p>
+        </w:tc>
+        <w:tc>
+          <w:tcPr>
+            <w:tcW w:w="3470" w:type="dxa"/>
+            <w:tcBorders>
+              <w:top w:val="single" w:sz="4" w:space="0" w:color="D4CEC7"/>
+              <w:left w:val="single" w:sz="4" w:space="0" w:color="D4CEC7"/>
+              <w:bottom w:val="single" w:sz="4" w:space="0" w:color="D4CEC7"/>
+              <w:right w:val="single" w:sz="4" w:space="0" w:color="D4CEC7"/>
+            </w:tcBorders>
+            <w:tcMar>
+              <w:top w:w="60" w:type="dxa"/>
+              <w:left w:w="100" w:type="dxa"/>
+              <w:bottom w:w="60" w:type="dxa"/>
+              <w:right w:w="100" w:type="dxa"/>
+            </w:tcMar>
+          </w:tcPr>
+          <w:p>
+            <w:r>
+              <w:t>versione-macos.json</w:t>
+            </w:r>
+          </w:p>
+        </w:tc>
+        <w:tc>
+          <w:tcPr>
+            <w:tcW w:w="4433" w:type="dxa"/>
+            <w:tcBorders>
+              <w:top w:val="single" w:sz="4" w:space="0" w:color="D4CEC7"/>
+              <w:left w:val="single" w:sz="4" w:space="0" w:color="D4CEC7"/>
+              <w:bottom w:val="single" w:sz="4" w:space="0" w:color="D4CEC7"/>
+              <w:right w:val="single" w:sz="4" w:space="0" w:color="D4CEC7"/>
+            </w:tcBorders>
+            <w:tcMar>
+              <w:top w:w="60" w:type="dxa"/>
+              <w:left w:w="100" w:type="dxa"/>
+              <w:bottom w:w="60" w:type="dxa"/>
+              <w:right w:w="100" w:type="dxa"/>
+            </w:tcMar>
+          </w:tcPr>
+          <w:p>
+            <w:r>
+              <w:t>PDFz-X.Y.Z-macOS-arm64.dmg</w:t>
+            </w:r>
+          </w:p>
+        </w:tc>
+      </w:tr>
+      <w:tr>
+        <w:tc>
+          <w:tcPr>
+            <w:tcW w:w="1735" w:type="dxa"/>
+            <w:tcBorders>
+              <w:top w:val="single" w:sz="4" w:space="0" w:color="D4CEC7"/>
+              <w:left w:val="single" w:sz="4" w:space="0" w:color="D4CEC7"/>
+              <w:bottom w:val="single" w:sz="4" w:space="0" w:color="D4CEC7"/>
+              <w:right w:val="single" w:sz="4" w:space="0" w:color="D4CEC7"/>
+            </w:tcBorders>
+            <w:tcMar>
+              <w:top w:w="60" w:type="dxa"/>
+              <w:left w:w="100" w:type="dxa"/>
+              <w:bottom w:w="60" w:type="dxa"/>
+              <w:right w:w="100" w:type="dxa"/>
+            </w:tcMar>
+          </w:tcPr>
+          <w:p>
+            <w:r>
+              <w:t>Linux</w:t>
+            </w:r>
+          </w:p>
+        </w:tc>
+        <w:tc>
+          <w:tcPr>
+            <w:tcW w:w="3470" w:type="dxa"/>
+            <w:tcBorders>
+              <w:top w:val="single" w:sz="4" w:space="0" w:color="D4CEC7"/>
+              <w:left w:val="single" w:sz="4" w:space="0" w:color="D4CEC7"/>
+              <w:bottom w:val="single" w:sz="4" w:space="0" w:color="D4CEC7"/>
+              <w:right w:val="single" w:sz="4" w:space="0" w:color="D4CEC7"/>
+            </w:tcBorders>
+            <w:tcMar>
+              <w:top w:w="60" w:type="dxa"/>
+              <w:left w:w="100" w:type="dxa"/>
+              <w:bottom w:w="60" w:type="dxa"/>
+              <w:right w:w="100" w:type="dxa"/>
+            </w:tcMar>
+          </w:tcPr>
+          <w:p>
+            <w:r>
+              <w:t>versione-linux.json</w:t>
+            </w:r>
+          </w:p>
+        </w:tc>
+        <w:tc>
+          <w:tcPr>
+            <w:tcW w:w="4433" w:type="dxa"/>
+            <w:tcBorders>
+              <w:top w:val="single" w:sz="4" w:space="0" w:color="D4CEC7"/>
+              <w:left w:val="single" w:sz="4" w:space="0" w:color="D4CEC7"/>
+              <w:bottom w:val="single" w:sz="4" w:space="0" w:color="D4CEC7"/>
+              <w:right w:val="single" w:sz="4" w:space="0" w:color="D4CEC7"/>
+            </w:tcBorders>
+            <w:tcMar>
+              <w:top w:w="60" w:type="dxa"/>
+              <w:left w:w="100" w:type="dxa"/>
+              <w:bottom w:w="60" w:type="dxa"/>
+              <w:right w:w="100" w:type="dxa"/>
+            </w:tcMar>
+          </w:tcPr>
+          <w:p>
+            <w:r>
+              <w:t>PDFz-X.Y.Z-x86_64.AppImage</w:t>
+            </w:r>
+          </w:p>
+        </w:tc>
+      </w:tr>
+      <w:tr>
+        <w:tc>
+          <w:tcPr>
+            <w:tcW w:w="1735" w:type="dxa"/>
+            <w:tcBorders>
+              <w:top w:val="single" w:sz="4" w:space="0" w:color="D4CEC7"/>
+              <w:left w:val="single" w:sz="4" w:space="0" w:color="D4CEC7"/>
+              <w:bottom w:val="single" w:sz="4" w:space="0" w:color="D4CEC7"/>
+              <w:right w:val="single" w:sz="4" w:space="0" w:color="D4CEC7"/>
+            </w:tcBorders>
+            <w:tcMar>
+              <w:top w:w="60" w:type="dxa"/>
+              <w:left w:w="100" w:type="dxa"/>
+              <w:bottom w:w="60" w:type="dxa"/>
+              <w:right w:w="100" w:type="dxa"/>
+            </w:tcMar>
+          </w:tcPr>
+          <w:p>
+            <w:r>
+              <w:t>Android</w:t>
+            </w:r>
+          </w:p>
+        </w:tc>
+        <w:tc>
+          <w:tcPr>
+            <w:tcW w:w="3470" w:type="dxa"/>
+            <w:tcBorders>
+              <w:top w:val="single" w:sz="4" w:space="0" w:color="D4CEC7"/>
+              <w:left w:val="single" w:sz="4" w:space="0" w:color="D4CEC7"/>
+              <w:bottom w:val="single" w:sz="4" w:space="0" w:color="D4CEC7"/>
+              <w:right w:val="single" w:sz="4" w:space="0" w:color="D4CEC7"/>
+            </w:tcBorders>
+            <w:tcMar>
+              <w:top w:w="60" w:type="dxa"/>
+              <w:left w:w="100" w:type="dxa"/>
+              <w:bottom w:w="60" w:type="dxa"/>
+              <w:right w:w="100" w:type="dxa"/>
+            </w:tcMar>
+          </w:tcPr>
+          <w:p>
+            <w:r>
+              <w:t>versione-android.json</w:t>
+            </w:r>
+          </w:p>
+        </w:tc>
+        <w:tc>
+          <w:tcPr>
+            <w:tcW w:w="4433" w:type="dxa"/>
+            <w:tcBorders>
+              <w:top w:val="single" w:sz="4" w:space="0" w:color="D4CEC7"/>
+              <w:left w:val="single" w:sz="4" w:space="0" w:color="D4CEC7"/>
+              <w:bottom w:val="single" w:sz="4" w:space="0" w:color="D4CEC7"/>
+              <w:right w:val="single" w:sz="4" w:space="0" w:color="D4CEC7"/>
+            </w:tcBorders>
+            <w:tcMar>
+              <w:top w:w="60" w:type="dxa"/>
+              <w:left w:w="100" w:type="dxa"/>
+              <w:bottom w:w="60" w:type="dxa"/>
+              <w:right w:w="100" w:type="dxa"/>
+            </w:tcMar>
+          </w:tcPr>
+          <w:p>
+            <w:r>
+              <w:t>PDFz-X.Y.Z-android.apk</w:t>
+            </w:r>
+          </w:p>
+        </w:tc>
+      </w:tr>
+    </w:tbl>
+    <w:p>
+      <w:pPr>
+        <w:spacing w:after="120"/>
+      </w:pPr>
+    </w:p>
+    <w:p>
+      <w:pPr>
+        <w:spacing w:after="120"/>
+      </w:pPr>
+      <w:r>
+        <w:t>Dalla versione 1.0.2 il file contiene il link diretto all'installer di quella versione (es. https://github.com/akito996/pdfz/releases/download/v1.0.2/PDFz-1.0.2-x64.msi), la dimensione e la pagina della release. Nella campanella compare un riquadro con sistema, file e dimensione, il pulsante «Scarica la versione», il link da copiare, la pagina della versione e come installare su quel sistema. Le app 1.0.0 e 1.0.1 usano già il link diretto, con il solo pulsante «Scarica».</w:t>
+      </w:r>
+    </w:p>
+    <w:p>
+      <w:pPr>
+        <w:spacing w:before="120"/>
+        <w:jc w:val="center"/>
+      </w:pPr>
+      <w:r>
+        <w:rPr>
+          <w:noProof/>
+        </w:rPr>
+        <w:drawing>
+          <wp:inline distT="0" distB="0" distL="0" distR="0" wp14:anchorId="19ED52E6" wp14:editId="4091F628">
+            <wp:extent cx="4572000" cy="4429125"/>
+            <wp:effectExtent l="0" t="0" r="0" b="0"/>
+            <wp:docPr id="8" name="Immagine 8"/>
+            <wp:cNvGraphicFramePr>
+              <a:graphicFrameLocks xmlns:a="http://schemas.openxmlformats.org/drawingml/2006/main" noChangeAspect="1"/>
+            </wp:cNvGraphicFramePr>
+            <a:graphic xmlns:a="http://schemas.openxmlformats.org/drawingml/2006/main">
+              <a:graphicData uri="http://schemas.openxmlformats.org/drawingml/2006/picture">
+                <pic:pic xmlns:pic="http://schemas.openxmlformats.org/drawingml/2006/picture">
+                  <pic:nvPicPr>
+                    <pic:cNvPr id="0" name=""/>
+                    <pic:cNvPicPr>
+                      <a:picLocks noChangeAspect="1" noChangeArrowheads="1"/>
+                    </pic:cNvPicPr>
+                  </pic:nvPicPr>
+                  <pic:blipFill>
+                    <a:blip r:embed="rId14"/>
+                    <a:srcRect/>
+                    <a:stretch>
+                      <a:fillRect/>
+                    </a:stretch>
+                  </pic:blipFill>
+                  <pic:spPr bwMode="auto">
+                    <a:xfrm>
+                      <a:off x="0" y="0"/>
+                      <a:ext cx="4572000" cy="4429125"/>
+                    </a:xfrm>
+                    <a:prstGeom prst="rect">
+                      <a:avLst/>
+                    </a:prstGeom>
+                  </pic:spPr>
+                </pic:pic>
+              </a:graphicData>
+            </a:graphic>
+          </wp:inline>
+        </w:drawing>
+      </w:r>
+    </w:p>
+    <w:p>
+      <w:pPr>
+        <w:spacing w:after="200"/>
+        <w:jc w:val="center"/>
+      </w:pPr>
+      <w:r>
+        <w:rPr>
+          <w:i/>
+          <w:iCs/>
+          <w:color w:val="6F6862"/>
+          <w:sz w:val="18"/>
+          <w:szCs w:val="18"/>
+        </w:rPr>
+        <w:t>Figura 7 – Il riquadro del download diretto (aggiornamento simulato, Windows).</w:t>
+      </w:r>
+    </w:p>
+    <w:p>
+      <w:pPr>
+        <w:pBdr>
+          <w:left w:val="single" w:sz="18" w:space="6" w:color="C9A227"/>
+        </w:pBdr>
+        <w:shd w:val="clear" w:color="auto" w:fill="FBF3DA"/>
+        <w:spacing w:before="80" w:after="160"/>
+        <w:ind w:left="120" w:right="120"/>
+      </w:pPr>
+      <w:r>
+        <w:rPr>
+          <w:color w:val="3B3632"/>
+        </w:rPr>
+        <w:t>Funziona solo se le release sono pubbliche: con il repository privato le app non riescono a leggere il file della versione né a scaricare l'installer. Per questo il repository akito996/pdfz viene reso pubblico con la 1.0.2.</w:t>
+      </w:r>
+    </w:p>
+    <w:p>
+      <w:pPr>
+        <w:pStyle w:val="Titolo2"/>
+      </w:pPr>
+      <w:bookmarkStart w:id="26" w:name="_Toc243077463"/>
+      <w:r>
+        <w:t>6.6 Ruoli</w:t>
+      </w:r>
+      <w:bookmarkEnd w:id="26"/>
     </w:p>
     <w:tbl>
       <w:tblPr>
@@ -10593,11 +11166,11 @@
       <w:pPr>
         <w:pStyle w:val="Titolo1"/>
       </w:pPr>
-      <w:bookmarkStart w:id="26" w:name="_Toc243073611"/>
+      <w:bookmarkStart w:id="27" w:name="_Toc243077464"/>
       <w:r>
         <w:t>7. Sicurezza</w:t>
       </w:r>
-      <w:bookmarkEnd w:id="26"/>
+      <w:bookmarkEnd w:id="27"/>
     </w:p>
     <w:p>
       <w:pPr>
@@ -10892,11 +11465,11 @@
       <w:pPr>
         <w:pStyle w:val="Titolo1"/>
       </w:pPr>
-      <w:bookmarkStart w:id="27" w:name="_Toc243073612"/>
+      <w:bookmarkStart w:id="28" w:name="_Toc243077465"/>
       <w:r>
         <w:t>8. Punti aperti</w:t>
       </w:r>
-      <w:bookmarkEnd w:id="27"/>
+      <w:bookmarkEnd w:id="28"/>
     </w:p>
     <w:p>
       <w:pPr>
@@ -11015,11 +11588,11 @@
       <w:pPr>
         <w:pStyle w:val="Titolo1"/>
       </w:pPr>
-      <w:bookmarkStart w:id="28" w:name="_Toc243073613"/>
+      <w:bookmarkStart w:id="29" w:name="_Toc243077466"/>
       <w:r>
         <w:t>9. Pensato per i prossimi 10 anni</w:t>
       </w:r>
-      <w:bookmarkEnd w:id="28"/>
+      <w:bookmarkEnd w:id="29"/>
     </w:p>
     <w:p>
       <w:pPr>
@@ -11133,8 +11706,8 @@
       </w:r>
     </w:p>
     <w:sectPr>
-      <w:headerReference w:type="default" r:id="rId14"/>
-      <w:footerReference w:type="default" r:id="rId15"/>
+      <w:headerReference w:type="default" r:id="rId15"/>
+      <w:footerReference w:type="default" r:id="rId16"/>
       <w:pgSz w:w="11906" w:h="16838"/>
       <w:pgMar w:top="1134" w:right="1134" w:bottom="1134" w:left="1134" w:header="708" w:footer="708" w:gutter="0"/>
       <w:cols w:space="720"/>
@@ -11262,10 +11835,10 @@
 <file path=word/numbering.xml><?xml version="1.0" encoding="utf-8"?>
 <w:numbering xmlns:wpc="http://schemas.microsoft.com/office/word/2010/wordprocessingCanvas" xmlns:cx="http://schemas.microsoft.com/office/drawing/2014/chartex" xmlns:cx1="http://schemas.microsoft.com/office/drawing/2015/9/8/chartex" xmlns:cx2="http://schemas.microsoft.com/office/drawing/2015/10/21/chartex" xmlns:cx3="http://schemas.microsoft.com/office/drawing/2016/5/9/chartex" xmlns:cx4="http://schemas.microsoft.com/office/drawing/2016/5/10/chartex" xmlns:cx5="http://schemas.microsoft.com/office/drawing/2016/5/11/chartex" xmlns:cx6="http://schemas.microsoft.com/office/drawing/2016/5/12/chartex" xmlns:cx7="http://schemas.microsoft.com/office/drawing/2016/5/13/chartex" xmlns:cx8="http://schemas.microsoft.com/office/drawing/2016/5/14/chartex" xmlns:mc="http://schemas.openxmlformats.org/markup-compatibility/2006" xmlns:aink="http://schemas.microsoft.com/office/drawing/2016/ink" xmlns:am3d="http://schemas.microsoft.com/office/drawing/2017/model3d" xmlns:o="urn:schemas-microsoft-com:office:office" xmlns:oel="http://schemas.microsoft.com/office/2019/extlst" xmlns:r="http://schemas.openxmlformats.org/officeDocument/2006/relationships" xmlns:m="http://schemas.openxmlformats.org/officeDocument/2006/math" xmlns:v="urn:schemas-microsoft-com:vml" xmlns:wp14="http://schemas.microsoft.com/office/word/2010/wordprocessingDrawing" xmlns:wp="http://schemas.openxmlformats.org/drawingml/2006/wordprocessingDrawing" xmlns:w10="urn:schemas-microsoft-com:office:word" xmlns:w="http://schemas.openxmlformats.org/wordprocessingml/2006/main" xmlns:w14="http://schemas.microsoft.com/office/word/2010/wordml" xmlns:w15="http://schemas.microsoft.com/office/word/2012/wordml" xmlns:w16cex="http://schemas.microsoft.com/office/word/2018/wordml/cex" xmlns:w16cid="http://schemas.microsoft.com/office/word/2016/wordml/cid" xmlns:w16="http://schemas.microsoft.com/office/word/2018/wordml" xmlns:w16du="http://schemas.microsoft.com/office/word/2023/wordml/word16du" xmlns:w16sdtdh="http://schemas.microsoft.com/office/word/2020/wordml/sdtdatahash" xmlns:w16sdtfl="http://schemas.microsoft.com/office/word/2024/wordml/sdtformatlock" xmlns:w16se="http://schemas.microsoft.com/office/word/2015/wordml/symex" xmlns:wpg="http://schemas.microsoft.com/office/word/2010/wordprocessingGroup" xmlns:wpi="http://schemas.microsoft.com/office/word/2010/wordprocessingInk" xmlns:wne="http://schemas.microsoft.com/office/word/2006/wordml" xmlns:wps="http://schemas.microsoft.com/office/word/2010/wordprocessingShape" mc:Ignorable="w14 w15 w16se w16cid w16 w16cex w16sdtdh w16sdtfl w16du wp14">
   <w:abstractNum w:abstractNumId="0" w15:restartNumberingAfterBreak="0">
-    <w:nsid w:val="03284B65"/>
+    <w:nsid w:val="0BFC03DF"/>
     <w:multiLevelType w:val="hybridMultilevel"/>
-    <w:tmpl w:val="34FC2DA0"/>
-    <w:lvl w:ilvl="0" w:tplc="A3F0CD9A">
+    <w:tmpl w:val="754E95CE"/>
+    <w:lvl w:ilvl="0" w:tplc="7B62C60E">
       <w:start w:val="1"/>
       <w:numFmt w:val="bullet"/>
       <w:lvlText w:val="•"/>
@@ -11274,52 +11847,52 @@
         <w:ind w:left="540" w:hanging="270"/>
       </w:pPr>
     </w:lvl>
-    <w:lvl w:ilvl="1" w:tplc="3B2A1FD6">
+    <w:lvl w:ilvl="1" w:tplc="BA409DA6">
       <w:numFmt w:val="decimal"/>
       <w:lvlText w:val=""/>
       <w:lvlJc w:val="left"/>
     </w:lvl>
-    <w:lvl w:ilvl="2" w:tplc="BA283D8A">
+    <w:lvl w:ilvl="2" w:tplc="5748F308">
       <w:numFmt w:val="decimal"/>
       <w:lvlText w:val=""/>
       <w:lvlJc w:val="left"/>
     </w:lvl>
-    <w:lvl w:ilvl="3" w:tplc="250A778E">
+    <w:lvl w:ilvl="3" w:tplc="1542D9F8">
       <w:numFmt w:val="decimal"/>
       <w:lvlText w:val=""/>
       <w:lvlJc w:val="left"/>
     </w:lvl>
-    <w:lvl w:ilvl="4" w:tplc="26ECB52E">
+    <w:lvl w:ilvl="4" w:tplc="BCE40AE4">
       <w:numFmt w:val="decimal"/>
       <w:lvlText w:val=""/>
       <w:lvlJc w:val="left"/>
     </w:lvl>
-    <w:lvl w:ilvl="5" w:tplc="4A98F874">
+    <w:lvl w:ilvl="5" w:tplc="2E00405A">
       <w:numFmt w:val="decimal"/>
       <w:lvlText w:val=""/>
       <w:lvlJc w:val="left"/>
     </w:lvl>
-    <w:lvl w:ilvl="6" w:tplc="316A368C">
+    <w:lvl w:ilvl="6" w:tplc="3A2C0FF0">
       <w:numFmt w:val="decimal"/>
       <w:lvlText w:val=""/>
       <w:lvlJc w:val="left"/>
     </w:lvl>
-    <w:lvl w:ilvl="7" w:tplc="29EEFF78">
+    <w:lvl w:ilvl="7" w:tplc="B106B726">
       <w:numFmt w:val="decimal"/>
       <w:lvlText w:val=""/>
       <w:lvlJc w:val="left"/>
     </w:lvl>
-    <w:lvl w:ilvl="8" w:tplc="69F65948">
+    <w:lvl w:ilvl="8" w:tplc="A844D316">
       <w:numFmt w:val="decimal"/>
       <w:lvlText w:val=""/>
       <w:lvlJc w:val="left"/>
     </w:lvl>
   </w:abstractNum>
   <w:abstractNum w:abstractNumId="1" w15:restartNumberingAfterBreak="0">
-    <w:nsid w:val="03B42CDC"/>
+    <w:nsid w:val="0CF36770"/>
     <w:multiLevelType w:val="hybridMultilevel"/>
-    <w:tmpl w:val="6308AE70"/>
-    <w:lvl w:ilvl="0" w:tplc="814486F6">
+    <w:tmpl w:val="1A6ACB7A"/>
+    <w:lvl w:ilvl="0" w:tplc="96860F4E">
       <w:start w:val="1"/>
       <w:numFmt w:val="decimal"/>
       <w:lvlText w:val="%1."/>
@@ -11328,52 +11901,52 @@
         <w:ind w:left="540" w:hanging="300"/>
       </w:pPr>
     </w:lvl>
-    <w:lvl w:ilvl="1" w:tplc="1E367684">
+    <w:lvl w:ilvl="1" w:tplc="A06028C6">
       <w:numFmt w:val="decimal"/>
       <w:lvlText w:val=""/>
       <w:lvlJc w:val="left"/>
     </w:lvl>
-    <w:lvl w:ilvl="2" w:tplc="4AE471B0">
+    <w:lvl w:ilvl="2" w:tplc="9E9C57D6">
       <w:numFmt w:val="decimal"/>
       <w:lvlText w:val=""/>
       <w:lvlJc w:val="left"/>
     </w:lvl>
-    <w:lvl w:ilvl="3" w:tplc="0232B28E">
+    <w:lvl w:ilvl="3" w:tplc="2EDCF378">
       <w:numFmt w:val="decimal"/>
       <w:lvlText w:val=""/>
       <w:lvlJc w:val="left"/>
     </w:lvl>
-    <w:lvl w:ilvl="4" w:tplc="A0CAF892">
+    <w:lvl w:ilvl="4" w:tplc="E8627ED6">
       <w:numFmt w:val="decimal"/>
       <w:lvlText w:val=""/>
       <w:lvlJc w:val="left"/>
     </w:lvl>
-    <w:lvl w:ilvl="5" w:tplc="B816B412">
+    <w:lvl w:ilvl="5" w:tplc="4DCCF7E8">
       <w:numFmt w:val="decimal"/>
       <w:lvlText w:val=""/>
       <w:lvlJc w:val="left"/>
     </w:lvl>
-    <w:lvl w:ilvl="6" w:tplc="C8B2DA18">
+    <w:lvl w:ilvl="6" w:tplc="45F8ADF4">
       <w:numFmt w:val="decimal"/>
       <w:lvlText w:val=""/>
       <w:lvlJc w:val="left"/>
     </w:lvl>
-    <w:lvl w:ilvl="7" w:tplc="43D81980">
+    <w:lvl w:ilvl="7" w:tplc="12E4212A">
       <w:numFmt w:val="decimal"/>
       <w:lvlText w:val=""/>
       <w:lvlJc w:val="left"/>
     </w:lvl>
-    <w:lvl w:ilvl="8" w:tplc="8466D28A">
+    <w:lvl w:ilvl="8" w:tplc="97201224">
       <w:numFmt w:val="decimal"/>
       <w:lvlText w:val=""/>
       <w:lvlJc w:val="left"/>
     </w:lvl>
   </w:abstractNum>
   <w:abstractNum w:abstractNumId="2" w15:restartNumberingAfterBreak="0">
-    <w:nsid w:val="29F00CF4"/>
+    <w:nsid w:val="46BD7A14"/>
     <w:multiLevelType w:val="hybridMultilevel"/>
-    <w:tmpl w:val="3C1453C6"/>
-    <w:lvl w:ilvl="0" w:tplc="32BCB2D6" w:tentative="1">
+    <w:tmpl w:val="AEF6A038"/>
+    <w:lvl w:ilvl="0" w:tplc="0E5ADDC2" w:tentative="1">
       <w:start w:val="1"/>
       <w:numFmt w:val="bullet"/>
       <w:lvlText w:val="●"/>
@@ -11382,7 +11955,7 @@
         <w:ind w:left="720" w:hanging="360"/>
       </w:pPr>
     </w:lvl>
-    <w:lvl w:ilvl="1" w:tplc="48EC12AE" w:tentative="1">
+    <w:lvl w:ilvl="1" w:tplc="0A8629E6" w:tentative="1">
       <w:start w:val="1"/>
       <w:numFmt w:val="bullet"/>
       <w:lvlText w:val="○"/>
@@ -11391,7 +11964,7 @@
         <w:ind w:left="1440" w:hanging="360"/>
       </w:pPr>
     </w:lvl>
-    <w:lvl w:ilvl="2" w:tplc="E3D61B12" w:tentative="1">
+    <w:lvl w:ilvl="2" w:tplc="B770B900" w:tentative="1">
       <w:start w:val="1"/>
       <w:numFmt w:val="bullet"/>
       <w:lvlText w:val="■"/>
@@ -11400,7 +11973,7 @@
         <w:ind w:left="2160" w:hanging="360"/>
       </w:pPr>
     </w:lvl>
-    <w:lvl w:ilvl="3" w:tplc="CF441324" w:tentative="1">
+    <w:lvl w:ilvl="3" w:tplc="D11E1820" w:tentative="1">
       <w:start w:val="1"/>
       <w:numFmt w:val="bullet"/>
       <w:lvlText w:val="●"/>
@@ -11409,7 +11982,7 @@
         <w:ind w:left="2880" w:hanging="360"/>
       </w:pPr>
     </w:lvl>
-    <w:lvl w:ilvl="4" w:tplc="A680FE5A" w:tentative="1">
+    <w:lvl w:ilvl="4" w:tplc="F5D8F27C" w:tentative="1">
       <w:start w:val="1"/>
       <w:numFmt w:val="bullet"/>
       <w:lvlText w:val="○"/>
@@ -11418,7 +11991,7 @@
         <w:ind w:left="3600" w:hanging="360"/>
       </w:pPr>
     </w:lvl>
-    <w:lvl w:ilvl="5" w:tplc="6C5EDF80" w:tentative="1">
+    <w:lvl w:ilvl="5" w:tplc="30F20242" w:tentative="1">
       <w:start w:val="1"/>
       <w:numFmt w:val="bullet"/>
       <w:lvlText w:val="■"/>
@@ -11427,7 +12000,7 @@
         <w:ind w:left="4320" w:hanging="360"/>
       </w:pPr>
     </w:lvl>
-    <w:lvl w:ilvl="6" w:tplc="DACC4F0A" w:tentative="1">
+    <w:lvl w:ilvl="6" w:tplc="E31C4006" w:tentative="1">
       <w:start w:val="1"/>
       <w:numFmt w:val="bullet"/>
       <w:lvlText w:val="●"/>
@@ -11436,7 +12009,7 @@
         <w:ind w:left="5040" w:hanging="360"/>
       </w:pPr>
     </w:lvl>
-    <w:lvl w:ilvl="7" w:tplc="9154E0A0" w:tentative="1">
+    <w:lvl w:ilvl="7" w:tplc="A8B8079E" w:tentative="1">
       <w:start w:val="1"/>
       <w:numFmt w:val="bullet"/>
       <w:lvlText w:val="●"/>
@@ -11445,7 +12018,7 @@
         <w:ind w:left="5760" w:hanging="360"/>
       </w:pPr>
     </w:lvl>
-    <w:lvl w:ilvl="8" w:tplc="DEC6E5D2" w:tentative="1">
+    <w:lvl w:ilvl="8" w:tplc="BAD02DA8" w:tentative="1">
       <w:start w:val="1"/>
       <w:numFmt w:val="bullet"/>
       <w:lvlText w:val="●"/>
@@ -11456,10 +12029,10 @@
     </w:lvl>
   </w:abstractNum>
   <w:abstractNum w:abstractNumId="3" w15:restartNumberingAfterBreak="0">
-    <w:nsid w:val="4A043DE5"/>
+    <w:nsid w:val="71FF1702"/>
     <w:multiLevelType w:val="hybridMultilevel"/>
-    <w:tmpl w:val="551EE02E"/>
-    <w:lvl w:ilvl="0" w:tplc="CC545820">
+    <w:tmpl w:val="94C0EF78"/>
+    <w:lvl w:ilvl="0" w:tplc="897821A0">
       <w:start w:val="1"/>
       <w:numFmt w:val="decimal"/>
       <w:lvlText w:val="%1."/>
@@ -11468,66 +12041,66 @@
         <w:ind w:left="540" w:hanging="300"/>
       </w:pPr>
     </w:lvl>
-    <w:lvl w:ilvl="1" w:tplc="2F08B80A">
+    <w:lvl w:ilvl="1" w:tplc="489C1732">
       <w:numFmt w:val="decimal"/>
       <w:lvlText w:val=""/>
       <w:lvlJc w:val="left"/>
     </w:lvl>
-    <w:lvl w:ilvl="2" w:tplc="D4685436">
+    <w:lvl w:ilvl="2" w:tplc="19A2D070">
       <w:numFmt w:val="decimal"/>
       <w:lvlText w:val=""/>
       <w:lvlJc w:val="left"/>
     </w:lvl>
-    <w:lvl w:ilvl="3" w:tplc="2A82298C">
+    <w:lvl w:ilvl="3" w:tplc="102A6016">
       <w:numFmt w:val="decimal"/>
       <w:lvlText w:val=""/>
       <w:lvlJc w:val="left"/>
     </w:lvl>
-    <w:lvl w:ilvl="4" w:tplc="68EA62AC">
+    <w:lvl w:ilvl="4" w:tplc="82A0C0E6">
       <w:numFmt w:val="decimal"/>
       <w:lvlText w:val=""/>
       <w:lvlJc w:val="left"/>
     </w:lvl>
-    <w:lvl w:ilvl="5" w:tplc="BC28CF02">
+    <w:lvl w:ilvl="5" w:tplc="B9E05902">
       <w:numFmt w:val="decimal"/>
       <w:lvlText w:val=""/>
       <w:lvlJc w:val="left"/>
     </w:lvl>
-    <w:lvl w:ilvl="6" w:tplc="356CE448">
+    <w:lvl w:ilvl="6" w:tplc="18BA047A">
       <w:numFmt w:val="decimal"/>
       <w:lvlText w:val=""/>
       <w:lvlJc w:val="left"/>
     </w:lvl>
-    <w:lvl w:ilvl="7" w:tplc="2BA0E0EA">
+    <w:lvl w:ilvl="7" w:tplc="1204A9B6">
       <w:numFmt w:val="decimal"/>
       <w:lvlText w:val=""/>
       <w:lvlJc w:val="left"/>
     </w:lvl>
-    <w:lvl w:ilvl="8" w:tplc="F67EF644">
+    <w:lvl w:ilvl="8" w:tplc="55065466">
       <w:numFmt w:val="decimal"/>
       <w:lvlText w:val=""/>
       <w:lvlJc w:val="left"/>
     </w:lvl>
   </w:abstractNum>
-  <w:num w:numId="1" w16cid:durableId="558327196">
+  <w:num w:numId="1" w16cid:durableId="1068453087">
     <w:abstractNumId w:val="2"/>
     <w:lvlOverride w:ilvl="0">
       <w:startOverride w:val="1"/>
     </w:lvlOverride>
   </w:num>
-  <w:num w:numId="2" w16cid:durableId="1066956913">
+  <w:num w:numId="2" w16cid:durableId="913703695">
     <w:abstractNumId w:val="0"/>
     <w:lvlOverride w:ilvl="0">
       <w:startOverride w:val="1"/>
     </w:lvlOverride>
   </w:num>
-  <w:num w:numId="3" w16cid:durableId="1653410525">
+  <w:num w:numId="3" w16cid:durableId="1422919693">
     <w:abstractNumId w:val="1"/>
     <w:lvlOverride w:ilvl="0">
       <w:startOverride w:val="1"/>
     </w:lvlOverride>
   </w:num>
-  <w:num w:numId="4" w16cid:durableId="875776952">
+  <w:num w:numId="4" w16cid:durableId="1250624257">
     <w:abstractNumId w:val="3"/>
     <w:lvlOverride w:ilvl="0">
       <w:startOverride w:val="1"/>
@@ -12169,7 +12742,7 @@
     <w:autoRedefine/>
     <w:uiPriority w:val="39"/>
     <w:unhideWhenUsed/>
-    <w:rsid w:val="00D87003"/>
+    <w:rsid w:val="0031741C"/>
     <w:pPr>
       <w:spacing w:after="100"/>
     </w:pPr>
@@ -12181,7 +12754,7 @@
     <w:autoRedefine/>
     <w:uiPriority w:val="39"/>
     <w:unhideWhenUsed/>
-    <w:rsid w:val="00D87003"/>
+    <w:rsid w:val="0031741C"/>
     <w:pPr>
       <w:spacing w:after="100"/>
       <w:ind w:left="210"/>

</xml_diff>

<commit_message>
PDFz 1.1.0: schede in una nuova finestra, traduzione tolta
- Schede: con 2 o più schede aperte, una scheda trascinata fuori dalla finestra
  (o tasto destro → "Sposta in una nuova finestra") si apre in una nuova finestra
  con modifiche non salvate, Annulla/Ripeti e password; trascinata su un'altra
  scheda cambia posto. Passaggio con un biglietto monouso del motore
  (/api/schede, 2 minuti); più finestre nell'app desktop, ognuna con la sua Api.
- Traduzione offline tolta: strumento Traduci, CTranslate2/SentencePiece, MSI
  PDFz-Lingue e opzioni di build; i modelli già scaricati si cancellano all'avvio.
- Versione 1.1.0 (MSI 101.1.0, Android 1001001000), CHANGELOG, novità,
  documenti, CLAUDE.md e documentazione Word PDFz_20261021.docx.

Co-Authored-By: Claude Opus 5.5 <noreply@anthropic.com>
</commit_message>
<xml_diff>
--- a/docs/PDFz_20261016.docx
+++ b/docs/PDFz_20261016.docx
@@ -16,7 +16,7 @@
           <w:noProof/>
         </w:rPr>
         <w:drawing>
-          <wp:inline distT="0" distB="0" distL="0" distR="0" wp14:anchorId="4DD2BFCF" wp14:editId="29155838">
+          <wp:inline distT="0" distB="0" distL="0" distR="0" wp14:anchorId="50F9ACFF" wp14:editId="156E97B8">
             <wp:extent cx="3619500" cy="1285875"/>
             <wp:effectExtent l="0" t="0" r="0" b="0"/>
             <wp:docPr id="1" name="Immagine 1"/>
@@ -135,7 +135,7 @@
     <w:sdt>
       <w:sdtPr>
         <w:alias w:val="Indice"/>
-        <w:id w:val="2097592959"/>
+        <w:id w:val="784547481"/>
       </w:sdtPr>
       <w:sdtEndPr/>
       <w:sdtContent>
@@ -158,7 +158,7 @@
           <w:r>
             <w:fldChar w:fldCharType="separate"/>
           </w:r>
-          <w:hyperlink w:anchor="_Toc243077437" w:history="1">
+          <w:hyperlink w:anchor="_Toc243079677" w:history="1">
             <w:r>
               <w:rPr>
                 <w:rStyle w:val="Collegamentoipertestuale"/>
@@ -182,7 +182,7 @@
               <w:rPr>
                 <w:noProof/>
               </w:rPr>
-              <w:instrText xml:space="preserve"> PAGEREF _Toc243077437 \h </w:instrText>
+              <w:instrText xml:space="preserve"> PAGEREF _Toc243079677 \h </w:instrText>
             </w:r>
             <w:r>
               <w:rPr>
@@ -219,7 +219,7 @@
               <w:noProof/>
             </w:rPr>
           </w:pPr>
-          <w:hyperlink w:anchor="_Toc243077438" w:history="1">
+          <w:hyperlink w:anchor="_Toc243079678" w:history="1">
             <w:r>
               <w:rPr>
                 <w:rStyle w:val="Collegamentoipertestuale"/>
@@ -243,7 +243,7 @@
               <w:rPr>
                 <w:noProof/>
               </w:rPr>
-              <w:instrText xml:space="preserve"> PAGEREF _Toc243077438 \h </w:instrText>
+              <w:instrText xml:space="preserve"> PAGEREF _Toc243079678 \h </w:instrText>
             </w:r>
             <w:r>
               <w:rPr>
@@ -280,7 +280,7 @@
               <w:noProof/>
             </w:rPr>
           </w:pPr>
-          <w:hyperlink w:anchor="_Toc243077439" w:history="1">
+          <w:hyperlink w:anchor="_Toc243079679" w:history="1">
             <w:r>
               <w:rPr>
                 <w:rStyle w:val="Collegamentoipertestuale"/>
@@ -304,7 +304,7 @@
               <w:rPr>
                 <w:noProof/>
               </w:rPr>
-              <w:instrText xml:space="preserve"> PAGEREF _Toc243077439 \h </w:instrText>
+              <w:instrText xml:space="preserve"> PAGEREF _Toc243079679 \h </w:instrText>
             </w:r>
             <w:r>
               <w:rPr>
@@ -341,7 +341,7 @@
               <w:noProof/>
             </w:rPr>
           </w:pPr>
-          <w:hyperlink w:anchor="_Toc243077440" w:history="1">
+          <w:hyperlink w:anchor="_Toc243079680" w:history="1">
             <w:r>
               <w:rPr>
                 <w:rStyle w:val="Collegamentoipertestuale"/>
@@ -365,7 +365,7 @@
               <w:rPr>
                 <w:noProof/>
               </w:rPr>
-              <w:instrText xml:space="preserve"> PAGEREF _Toc243077440 \h </w:instrText>
+              <w:instrText xml:space="preserve"> PAGEREF _Toc243079680 \h </w:instrText>
             </w:r>
             <w:r>
               <w:rPr>
@@ -402,7 +402,7 @@
               <w:noProof/>
             </w:rPr>
           </w:pPr>
-          <w:hyperlink w:anchor="_Toc243077441" w:history="1">
+          <w:hyperlink w:anchor="_Toc243079681" w:history="1">
             <w:r>
               <w:rPr>
                 <w:rStyle w:val="Collegamentoipertestuale"/>
@@ -426,7 +426,7 @@
               <w:rPr>
                 <w:noProof/>
               </w:rPr>
-              <w:instrText xml:space="preserve"> PAGEREF _Toc243077441 \h </w:instrText>
+              <w:instrText xml:space="preserve"> PAGEREF _Toc243079681 \h </w:instrText>
             </w:r>
             <w:r>
               <w:rPr>
@@ -463,7 +463,7 @@
               <w:noProof/>
             </w:rPr>
           </w:pPr>
-          <w:hyperlink w:anchor="_Toc243077442" w:history="1">
+          <w:hyperlink w:anchor="_Toc243079682" w:history="1">
             <w:r>
               <w:rPr>
                 <w:rStyle w:val="Collegamentoipertestuale"/>
@@ -487,7 +487,7 @@
               <w:rPr>
                 <w:noProof/>
               </w:rPr>
-              <w:instrText xml:space="preserve"> PAGEREF _Toc243077442 \h </w:instrText>
+              <w:instrText xml:space="preserve"> PAGEREF _Toc243079682 \h </w:instrText>
             </w:r>
             <w:r>
               <w:rPr>
@@ -524,7 +524,7 @@
               <w:noProof/>
             </w:rPr>
           </w:pPr>
-          <w:hyperlink w:anchor="_Toc243077443" w:history="1">
+          <w:hyperlink w:anchor="_Toc243079683" w:history="1">
             <w:r>
               <w:rPr>
                 <w:rStyle w:val="Collegamentoipertestuale"/>
@@ -548,7 +548,7 @@
               <w:rPr>
                 <w:noProof/>
               </w:rPr>
-              <w:instrText xml:space="preserve"> PAGEREF _Toc243077443 \h </w:instrText>
+              <w:instrText xml:space="preserve"> PAGEREF _Toc243079683 \h </w:instrText>
             </w:r>
             <w:r>
               <w:rPr>
@@ -585,7 +585,7 @@
               <w:noProof/>
             </w:rPr>
           </w:pPr>
-          <w:hyperlink w:anchor="_Toc243077444" w:history="1">
+          <w:hyperlink w:anchor="_Toc243079684" w:history="1">
             <w:r>
               <w:rPr>
                 <w:rStyle w:val="Collegamentoipertestuale"/>
@@ -609,7 +609,7 @@
               <w:rPr>
                 <w:noProof/>
               </w:rPr>
-              <w:instrText xml:space="preserve"> PAGEREF _Toc243077444 \h </w:instrText>
+              <w:instrText xml:space="preserve"> PAGEREF _Toc243079684 \h </w:instrText>
             </w:r>
             <w:r>
               <w:rPr>
@@ -646,7 +646,7 @@
               <w:noProof/>
             </w:rPr>
           </w:pPr>
-          <w:hyperlink w:anchor="_Toc243077445" w:history="1">
+          <w:hyperlink w:anchor="_Toc243079685" w:history="1">
             <w:r>
               <w:rPr>
                 <w:rStyle w:val="Collegamentoipertestuale"/>
@@ -670,7 +670,7 @@
               <w:rPr>
                 <w:noProof/>
               </w:rPr>
-              <w:instrText xml:space="preserve"> PAGEREF _Toc243077445 \h </w:instrText>
+              <w:instrText xml:space="preserve"> PAGEREF _Toc243079685 \h </w:instrText>
             </w:r>
             <w:r>
               <w:rPr>
@@ -707,7 +707,7 @@
               <w:noProof/>
             </w:rPr>
           </w:pPr>
-          <w:hyperlink w:anchor="_Toc243077446" w:history="1">
+          <w:hyperlink w:anchor="_Toc243079686" w:history="1">
             <w:r>
               <w:rPr>
                 <w:rStyle w:val="Collegamentoipertestuale"/>
@@ -731,7 +731,7 @@
               <w:rPr>
                 <w:noProof/>
               </w:rPr>
-              <w:instrText xml:space="preserve"> PAGEREF _Toc243077446 \h </w:instrText>
+              <w:instrText xml:space="preserve"> PAGEREF _Toc243079686 \h </w:instrText>
             </w:r>
             <w:r>
               <w:rPr>
@@ -768,7 +768,7 @@
               <w:noProof/>
             </w:rPr>
           </w:pPr>
-          <w:hyperlink w:anchor="_Toc243077447" w:history="1">
+          <w:hyperlink w:anchor="_Toc243079687" w:history="1">
             <w:r>
               <w:rPr>
                 <w:rStyle w:val="Collegamentoipertestuale"/>
@@ -792,7 +792,7 @@
               <w:rPr>
                 <w:noProof/>
               </w:rPr>
-              <w:instrText xml:space="preserve"> PAGEREF _Toc243077447 \h </w:instrText>
+              <w:instrText xml:space="preserve"> PAGEREF _Toc243079687 \h </w:instrText>
             </w:r>
             <w:r>
               <w:rPr>
@@ -829,7 +829,7 @@
               <w:noProof/>
             </w:rPr>
           </w:pPr>
-          <w:hyperlink w:anchor="_Toc243077448" w:history="1">
+          <w:hyperlink w:anchor="_Toc243079688" w:history="1">
             <w:r>
               <w:rPr>
                 <w:rStyle w:val="Collegamentoipertestuale"/>
@@ -853,7 +853,7 @@
               <w:rPr>
                 <w:noProof/>
               </w:rPr>
-              <w:instrText xml:space="preserve"> PAGEREF _Toc243077448 \h </w:instrText>
+              <w:instrText xml:space="preserve"> PAGEREF _Toc243079688 \h </w:instrText>
             </w:r>
             <w:r>
               <w:rPr>
@@ -890,7 +890,7 @@
               <w:noProof/>
             </w:rPr>
           </w:pPr>
-          <w:hyperlink w:anchor="_Toc243077449" w:history="1">
+          <w:hyperlink w:anchor="_Toc243079689" w:history="1">
             <w:r>
               <w:rPr>
                 <w:rStyle w:val="Collegamentoipertestuale"/>
@@ -914,7 +914,7 @@
               <w:rPr>
                 <w:noProof/>
               </w:rPr>
-              <w:instrText xml:space="preserve"> PAGEREF _Toc243077449 \h </w:instrText>
+              <w:instrText xml:space="preserve"> PAGEREF _Toc243079689 \h </w:instrText>
             </w:r>
             <w:r>
               <w:rPr>
@@ -951,7 +951,7 @@
               <w:noProof/>
             </w:rPr>
           </w:pPr>
-          <w:hyperlink w:anchor="_Toc243077450" w:history="1">
+          <w:hyperlink w:anchor="_Toc243079690" w:history="1">
             <w:r>
               <w:rPr>
                 <w:rStyle w:val="Collegamentoipertestuale"/>
@@ -975,7 +975,7 @@
               <w:rPr>
                 <w:noProof/>
               </w:rPr>
-              <w:instrText xml:space="preserve"> PAGEREF _Toc243077450 \h </w:instrText>
+              <w:instrText xml:space="preserve"> PAGEREF _Toc243079690 \h </w:instrText>
             </w:r>
             <w:r>
               <w:rPr>
@@ -1012,7 +1012,7 @@
               <w:noProof/>
             </w:rPr>
           </w:pPr>
-          <w:hyperlink w:anchor="_Toc243077451" w:history="1">
+          <w:hyperlink w:anchor="_Toc243079691" w:history="1">
             <w:r>
               <w:rPr>
                 <w:rStyle w:val="Collegamentoipertestuale"/>
@@ -1036,7 +1036,7 @@
               <w:rPr>
                 <w:noProof/>
               </w:rPr>
-              <w:instrText xml:space="preserve"> PAGEREF _Toc243077451 \h </w:instrText>
+              <w:instrText xml:space="preserve"> PAGEREF _Toc243079691 \h </w:instrText>
             </w:r>
             <w:r>
               <w:rPr>
@@ -1073,7 +1073,7 @@
               <w:noProof/>
             </w:rPr>
           </w:pPr>
-          <w:hyperlink w:anchor="_Toc243077452" w:history="1">
+          <w:hyperlink w:anchor="_Toc243079692" w:history="1">
             <w:r>
               <w:rPr>
                 <w:rStyle w:val="Collegamentoipertestuale"/>
@@ -1097,7 +1097,7 @@
               <w:rPr>
                 <w:noProof/>
               </w:rPr>
-              <w:instrText xml:space="preserve"> PAGEREF _Toc243077452 \h </w:instrText>
+              <w:instrText xml:space="preserve"> PAGEREF _Toc243079692 \h </w:instrText>
             </w:r>
             <w:r>
               <w:rPr>
@@ -1134,7 +1134,7 @@
               <w:noProof/>
             </w:rPr>
           </w:pPr>
-          <w:hyperlink w:anchor="_Toc243077453" w:history="1">
+          <w:hyperlink w:anchor="_Toc243079693" w:history="1">
             <w:r>
               <w:rPr>
                 <w:rStyle w:val="Collegamentoipertestuale"/>
@@ -1158,7 +1158,7 @@
               <w:rPr>
                 <w:noProof/>
               </w:rPr>
-              <w:instrText xml:space="preserve"> PAGEREF _Toc243077453 \h </w:instrText>
+              <w:instrText xml:space="preserve"> PAGEREF _Toc243079693 \h </w:instrText>
             </w:r>
             <w:r>
               <w:rPr>
@@ -1195,7 +1195,7 @@
               <w:noProof/>
             </w:rPr>
           </w:pPr>
-          <w:hyperlink w:anchor="_Toc243077454" w:history="1">
+          <w:hyperlink w:anchor="_Toc243079694" w:history="1">
             <w:r>
               <w:rPr>
                 <w:rStyle w:val="Collegamentoipertestuale"/>
@@ -1219,7 +1219,7 @@
               <w:rPr>
                 <w:noProof/>
               </w:rPr>
-              <w:instrText xml:space="preserve"> PAGEREF _Toc243077454 \h </w:instrText>
+              <w:instrText xml:space="preserve"> PAGEREF _Toc243079694 \h </w:instrText>
             </w:r>
             <w:r>
               <w:rPr>
@@ -1256,7 +1256,7 @@
               <w:noProof/>
             </w:rPr>
           </w:pPr>
-          <w:hyperlink w:anchor="_Toc243077455" w:history="1">
+          <w:hyperlink w:anchor="_Toc243079695" w:history="1">
             <w:r>
               <w:rPr>
                 <w:rStyle w:val="Collegamentoipertestuale"/>
@@ -1280,7 +1280,7 @@
               <w:rPr>
                 <w:noProof/>
               </w:rPr>
-              <w:instrText xml:space="preserve"> PAGEREF _Toc243077455 \h </w:instrText>
+              <w:instrText xml:space="preserve"> PAGEREF _Toc243079695 \h </w:instrText>
             </w:r>
             <w:r>
               <w:rPr>
@@ -1317,7 +1317,7 @@
               <w:noProof/>
             </w:rPr>
           </w:pPr>
-          <w:hyperlink w:anchor="_Toc243077456" w:history="1">
+          <w:hyperlink w:anchor="_Toc243079696" w:history="1">
             <w:r>
               <w:rPr>
                 <w:rStyle w:val="Collegamentoipertestuale"/>
@@ -1341,7 +1341,7 @@
               <w:rPr>
                 <w:noProof/>
               </w:rPr>
-              <w:instrText xml:space="preserve"> PAGEREF _Toc243077456 \h </w:instrText>
+              <w:instrText xml:space="preserve"> PAGEREF _Toc243079696 \h </w:instrText>
             </w:r>
             <w:r>
               <w:rPr>
@@ -1378,7 +1378,7 @@
               <w:noProof/>
             </w:rPr>
           </w:pPr>
-          <w:hyperlink w:anchor="_Toc243077457" w:history="1">
+          <w:hyperlink w:anchor="_Toc243079697" w:history="1">
             <w:r>
               <w:rPr>
                 <w:rStyle w:val="Collegamentoipertestuale"/>
@@ -1402,7 +1402,7 @@
               <w:rPr>
                 <w:noProof/>
               </w:rPr>
-              <w:instrText xml:space="preserve"> PAGEREF _Toc243077457 \h </w:instrText>
+              <w:instrText xml:space="preserve"> PAGEREF _Toc243079697 \h </w:instrText>
             </w:r>
             <w:r>
               <w:rPr>
@@ -1439,7 +1439,7 @@
               <w:noProof/>
             </w:rPr>
           </w:pPr>
-          <w:hyperlink w:anchor="_Toc243077458" w:history="1">
+          <w:hyperlink w:anchor="_Toc243079698" w:history="1">
             <w:r>
               <w:rPr>
                 <w:rStyle w:val="Collegamentoipertestuale"/>
@@ -1463,7 +1463,7 @@
               <w:rPr>
                 <w:noProof/>
               </w:rPr>
-              <w:instrText xml:space="preserve"> PAGEREF _Toc243077458 \h </w:instrText>
+              <w:instrText xml:space="preserve"> PAGEREF _Toc243079698 \h </w:instrText>
             </w:r>
             <w:r>
               <w:rPr>
@@ -1500,7 +1500,7 @@
               <w:noProof/>
             </w:rPr>
           </w:pPr>
-          <w:hyperlink w:anchor="_Toc243077459" w:history="1">
+          <w:hyperlink w:anchor="_Toc243079699" w:history="1">
             <w:r>
               <w:rPr>
                 <w:rStyle w:val="Collegamentoipertestuale"/>
@@ -1524,7 +1524,7 @@
               <w:rPr>
                 <w:noProof/>
               </w:rPr>
-              <w:instrText xml:space="preserve"> PAGEREF _Toc243077459 \h </w:instrText>
+              <w:instrText xml:space="preserve"> PAGEREF _Toc243079699 \h </w:instrText>
             </w:r>
             <w:r>
               <w:rPr>
@@ -1561,7 +1561,7 @@
               <w:noProof/>
             </w:rPr>
           </w:pPr>
-          <w:hyperlink w:anchor="_Toc243077460" w:history="1">
+          <w:hyperlink w:anchor="_Toc243079700" w:history="1">
             <w:r>
               <w:rPr>
                 <w:rStyle w:val="Collegamentoipertestuale"/>
@@ -1585,7 +1585,7 @@
               <w:rPr>
                 <w:noProof/>
               </w:rPr>
-              <w:instrText xml:space="preserve"> PAGEREF _Toc243077460 \h </w:instrText>
+              <w:instrText xml:space="preserve"> PAGEREF _Toc243079700 \h </w:instrText>
             </w:r>
             <w:r>
               <w:rPr>
@@ -1622,7 +1622,7 @@
               <w:noProof/>
             </w:rPr>
           </w:pPr>
-          <w:hyperlink w:anchor="_Toc243077461" w:history="1">
+          <w:hyperlink w:anchor="_Toc243079701" w:history="1">
             <w:r>
               <w:rPr>
                 <w:rStyle w:val="Collegamentoipertestuale"/>
@@ -1646,7 +1646,7 @@
               <w:rPr>
                 <w:noProof/>
               </w:rPr>
-              <w:instrText xml:space="preserve"> PAGEREF _Toc243077461 \h </w:instrText>
+              <w:instrText xml:space="preserve"> PAGEREF _Toc243079701 \h </w:instrText>
             </w:r>
             <w:r>
               <w:rPr>
@@ -1683,13 +1683,13 @@
               <w:noProof/>
             </w:rPr>
           </w:pPr>
-          <w:hyperlink w:anchor="_Toc243077462" w:history="1">
+          <w:hyperlink w:anchor="_Toc243079702" w:history="1">
             <w:r>
               <w:rPr>
                 <w:rStyle w:val="Collegamentoipertestuale"/>
                 <w:noProof/>
               </w:rPr>
-              <w:t>6.5 Nuova versione: link diretto per ogni sistema</w:t>
+              <w:t>6.5 Release 1.0.2 e repository pubblico</w:t>
             </w:r>
             <w:r>
               <w:rPr>
@@ -1707,7 +1707,7 @@
               <w:rPr>
                 <w:noProof/>
               </w:rPr>
-              <w:instrText xml:space="preserve"> PAGEREF _Toc243077462 \h </w:instrText>
+              <w:instrText xml:space="preserve"> PAGEREF _Toc243079702 \h </w:instrText>
             </w:r>
             <w:r>
               <w:rPr>
@@ -1744,13 +1744,13 @@
               <w:noProof/>
             </w:rPr>
           </w:pPr>
-          <w:hyperlink w:anchor="_Toc243077463" w:history="1">
+          <w:hyperlink w:anchor="_Toc243079703" w:history="1">
             <w:r>
               <w:rPr>
                 <w:rStyle w:val="Collegamentoipertestuale"/>
                 <w:noProof/>
               </w:rPr>
-              <w:t>6.6 Ruoli</w:t>
+              <w:t>6.6 Nuova versione: link diretto per ogni sistema</w:t>
             </w:r>
             <w:r>
               <w:rPr>
@@ -1768,7 +1768,68 @@
               <w:rPr>
                 <w:noProof/>
               </w:rPr>
-              <w:instrText xml:space="preserve"> PAGEREF _Toc243077463 \h </w:instrText>
+              <w:instrText xml:space="preserve"> PAGEREF _Toc243079703 \h </w:instrText>
+            </w:r>
+            <w:r>
+              <w:rPr>
+                <w:noProof/>
+              </w:rPr>
+            </w:r>
+            <w:r>
+              <w:rPr>
+                <w:noProof/>
+              </w:rPr>
+              <w:fldChar w:fldCharType="separate"/>
+            </w:r>
+            <w:r>
+              <w:rPr>
+                <w:noProof/>
+              </w:rPr>
+              <w:t>13</w:t>
+            </w:r>
+            <w:r>
+              <w:rPr>
+                <w:noProof/>
+              </w:rPr>
+              <w:fldChar w:fldCharType="end"/>
+            </w:r>
+          </w:hyperlink>
+        </w:p>
+        <w:p>
+          <w:pPr>
+            <w:pStyle w:val="Sommario2"/>
+            <w:tabs>
+              <w:tab w:val="right" w:leader="dot" w:pos="9628"/>
+            </w:tabs>
+            <w:rPr>
+              <w:noProof/>
+            </w:rPr>
+          </w:pPr>
+          <w:hyperlink w:anchor="_Toc243079704" w:history="1">
+            <w:r>
+              <w:rPr>
+                <w:rStyle w:val="Collegamentoipertestuale"/>
+                <w:noProof/>
+              </w:rPr>
+              <w:t>6.7 Ruoli</w:t>
+            </w:r>
+            <w:r>
+              <w:rPr>
+                <w:noProof/>
+              </w:rPr>
+              <w:tab/>
+            </w:r>
+            <w:r>
+              <w:rPr>
+                <w:noProof/>
+              </w:rPr>
+              <w:fldChar w:fldCharType="begin"/>
+            </w:r>
+            <w:r>
+              <w:rPr>
+                <w:noProof/>
+              </w:rPr>
+              <w:instrText xml:space="preserve"> PAGEREF _Toc243079704 \h </w:instrText>
             </w:r>
             <w:r>
               <w:rPr>
@@ -1805,7 +1866,7 @@
               <w:noProof/>
             </w:rPr>
           </w:pPr>
-          <w:hyperlink w:anchor="_Toc243077464" w:history="1">
+          <w:hyperlink w:anchor="_Toc243079705" w:history="1">
             <w:r>
               <w:rPr>
                 <w:rStyle w:val="Collegamentoipertestuale"/>
@@ -1829,7 +1890,7 @@
               <w:rPr>
                 <w:noProof/>
               </w:rPr>
-              <w:instrText xml:space="preserve"> PAGEREF _Toc243077464 \h </w:instrText>
+              <w:instrText xml:space="preserve"> PAGEREF _Toc243079705 \h </w:instrText>
             </w:r>
             <w:r>
               <w:rPr>
@@ -1866,7 +1927,7 @@
               <w:noProof/>
             </w:rPr>
           </w:pPr>
-          <w:hyperlink w:anchor="_Toc243077465" w:history="1">
+          <w:hyperlink w:anchor="_Toc243079706" w:history="1">
             <w:r>
               <w:rPr>
                 <w:rStyle w:val="Collegamentoipertestuale"/>
@@ -1890,7 +1951,7 @@
               <w:rPr>
                 <w:noProof/>
               </w:rPr>
-              <w:instrText xml:space="preserve"> PAGEREF _Toc243077465 \h </w:instrText>
+              <w:instrText xml:space="preserve"> PAGEREF _Toc243079706 \h </w:instrText>
             </w:r>
             <w:r>
               <w:rPr>
@@ -1927,7 +1988,7 @@
               <w:noProof/>
             </w:rPr>
           </w:pPr>
-          <w:hyperlink w:anchor="_Toc243077466" w:history="1">
+          <w:hyperlink w:anchor="_Toc243079707" w:history="1">
             <w:r>
               <w:rPr>
                 <w:rStyle w:val="Collegamentoipertestuale"/>
@@ -1951,7 +2012,7 @@
               <w:rPr>
                 <w:noProof/>
               </w:rPr>
-              <w:instrText xml:space="preserve"> PAGEREF _Toc243077466 \h </w:instrText>
+              <w:instrText xml:space="preserve"> PAGEREF _Toc243079707 \h </w:instrText>
             </w:r>
             <w:r>
               <w:rPr>
@@ -1994,7 +2055,7 @@
       <w:pPr>
         <w:pStyle w:val="Titolo1"/>
       </w:pPr>
-      <w:bookmarkStart w:id="0" w:name="_Toc243077437"/>
+      <w:bookmarkStart w:id="0" w:name="_Toc243079677"/>
       <w:r>
         <w:t>1. In breve</w:t>
       </w:r>
@@ -2205,7 +2266,7 @@
       <w:pPr>
         <w:pStyle w:val="Titolo1"/>
       </w:pPr>
-      <w:bookmarkStart w:id="1" w:name="_Toc243077438"/>
+      <w:bookmarkStart w:id="1" w:name="_Toc243079678"/>
       <w:r>
         <w:t>2. Nuovo marchio</w:t>
       </w:r>
@@ -2215,7 +2276,7 @@
       <w:pPr>
         <w:pStyle w:val="Titolo2"/>
       </w:pPr>
-      <w:bookmarkStart w:id="2" w:name="_Toc243077439"/>
+      <w:bookmarkStart w:id="2" w:name="_Toc243079679"/>
       <w:r>
         <w:t>2.1 Nomi e identificativi</w:t>
       </w:r>
@@ -2761,7 +2822,7 @@
       <w:pPr>
         <w:pStyle w:val="Titolo2"/>
       </w:pPr>
-      <w:bookmarkStart w:id="3" w:name="_Toc243077440"/>
+      <w:bookmarkStart w:id="3" w:name="_Toc243079680"/>
       <w:r>
         <w:t>2.2 Colori</w:t>
       </w:r>
@@ -3156,7 +3217,7 @@
       <w:pPr>
         <w:pStyle w:val="Titolo2"/>
       </w:pPr>
-      <w:bookmarkStart w:id="4" w:name="_Toc243077441"/>
+      <w:bookmarkStart w:id="4" w:name="_Toc243079681"/>
       <w:r>
         <w:t>2.3 Icona in uso: 17 «Foglio oro» (serie 4)</w:t>
       </w:r>
@@ -3190,7 +3251,7 @@
           <w:noProof/>
         </w:rPr>
         <w:drawing>
-          <wp:inline distT="0" distB="0" distL="0" distR="0" wp14:anchorId="32E62506" wp14:editId="4227385D">
+          <wp:inline distT="0" distB="0" distL="0" distR="0" wp14:anchorId="4EBF2298" wp14:editId="159EF644">
             <wp:extent cx="5334000" cy="5895975"/>
             <wp:effectExtent l="0" t="0" r="0" b="0"/>
             <wp:docPr id="2" name="Immagine 2"/>
@@ -3610,7 +3671,7 @@
       <w:pPr>
         <w:pStyle w:val="Titolo2"/>
       </w:pPr>
-      <w:bookmarkStart w:id="5" w:name="_Toc243077442"/>
+      <w:bookmarkStart w:id="5" w:name="_Toc243079682"/>
       <w:r>
         <w:t>2.4 Serie 3, non scelta (la 11 è diventata la serie 4)</w:t>
       </w:r>
@@ -3634,7 +3695,7 @@
           <w:noProof/>
         </w:rPr>
         <w:drawing>
-          <wp:inline distT="0" distB="0" distL="0" distR="0" wp14:anchorId="75AA11D0" wp14:editId="187A4416">
+          <wp:inline distT="0" distB="0" distL="0" distR="0" wp14:anchorId="0E5A4867" wp14:editId="389845A6">
             <wp:extent cx="5905500" cy="4133850"/>
             <wp:effectExtent l="0" t="0" r="0" b="0"/>
             <wp:docPr id="3" name="Immagine 3"/>
@@ -4320,7 +4381,7 @@
       <w:pPr>
         <w:pStyle w:val="Titolo2"/>
       </w:pPr>
-      <w:bookmarkStart w:id="6" w:name="_Toc243077443"/>
+      <w:bookmarkStart w:id="6" w:name="_Toc243079683"/>
       <w:r>
         <w:t>2.5 Serie 2, non scelta</w:t>
       </w:r>
@@ -4344,7 +4405,7 @@
           <w:noProof/>
         </w:rPr>
         <w:drawing>
-          <wp:inline distT="0" distB="0" distL="0" distR="0" wp14:anchorId="2592CCA5" wp14:editId="0BC1A8D1">
+          <wp:inline distT="0" distB="0" distL="0" distR="0" wp14:anchorId="44B4CDEB" wp14:editId="674C7753">
             <wp:extent cx="5905500" cy="4133850"/>
             <wp:effectExtent l="0" t="0" r="0" b="0"/>
             <wp:docPr id="4" name="Immagine 4"/>
@@ -5064,7 +5125,7 @@
       <w:pPr>
         <w:pStyle w:val="Titolo2"/>
       </w:pPr>
-      <w:bookmarkStart w:id="7" w:name="_Toc243077444"/>
+      <w:bookmarkStart w:id="7" w:name="_Toc243079684"/>
       <w:r>
         <w:t>2.6 Serie 1, scartata</w:t>
       </w:r>
@@ -5088,7 +5149,7 @@
           <w:noProof/>
         </w:rPr>
         <w:drawing>
-          <wp:inline distT="0" distB="0" distL="0" distR="0" wp14:anchorId="1F76095C" wp14:editId="0E51C114">
+          <wp:inline distT="0" distB="0" distL="0" distR="0" wp14:anchorId="7B8AABE0" wp14:editId="11F0B2D4">
             <wp:extent cx="4000500" cy="2800350"/>
             <wp:effectExtent l="0" t="0" r="0" b="0"/>
             <wp:docPr id="5" name="Immagine 5"/>
@@ -5147,7 +5208,7 @@
       <w:pPr>
         <w:pStyle w:val="Titolo2"/>
       </w:pPr>
-      <w:bookmarkStart w:id="8" w:name="_Toc243077445"/>
+      <w:bookmarkStart w:id="8" w:name="_Toc243079685"/>
       <w:r>
         <w:t>2.7 Verifica dei marchi registrati</w:t>
       </w:r>
@@ -5399,7 +5460,7 @@
       <w:pPr>
         <w:pStyle w:val="Titolo1"/>
       </w:pPr>
-      <w:bookmarkStart w:id="9" w:name="_Toc243077446"/>
+      <w:bookmarkStart w:id="9" w:name="_Toc243079686"/>
       <w:r>
         <w:t>3. Temi colore</w:t>
       </w:r>
@@ -5433,7 +5494,7 @@
           <w:noProof/>
         </w:rPr>
         <w:drawing>
-          <wp:inline distT="0" distB="0" distL="0" distR="0" wp14:anchorId="7168C7A5" wp14:editId="5BC00BA9">
+          <wp:inline distT="0" distB="0" distL="0" distR="0" wp14:anchorId="5A092BA2" wp14:editId="2CDBBDAB">
             <wp:extent cx="4572000" cy="3429000"/>
             <wp:effectExtent l="0" t="0" r="0" b="0"/>
             <wp:docPr id="6" name="Immagine 6"/>
@@ -6143,7 +6204,7 @@
       <w:pPr>
         <w:pStyle w:val="Titolo1"/>
       </w:pPr>
-      <w:bookmarkStart w:id="10" w:name="_Toc243077447"/>
+      <w:bookmarkStart w:id="10" w:name="_Toc243079687"/>
       <w:r>
         <w:t>4. Correzione: avvisi «come JavaScript»</w:t>
       </w:r>
@@ -6153,7 +6214,7 @@
       <w:pPr>
         <w:pStyle w:val="Titolo2"/>
       </w:pPr>
-      <w:bookmarkStart w:id="11" w:name="_Toc243077448"/>
+      <w:bookmarkStart w:id="11" w:name="_Toc243079688"/>
       <w:r>
         <w:t>4.1 Il problema</w:t>
       </w:r>
@@ -6556,7 +6617,7 @@
       <w:pPr>
         <w:pStyle w:val="Titolo2"/>
       </w:pPr>
-      <w:bookmarkStart w:id="12" w:name="_Toc243077449"/>
+      <w:bookmarkStart w:id="12" w:name="_Toc243079689"/>
       <w:r>
         <w:t>4.2 La soluzione</w:t>
       </w:r>
@@ -6689,7 +6750,7 @@
           <w:noProof/>
         </w:rPr>
         <w:drawing>
-          <wp:inline distT="0" distB="0" distL="0" distR="0" wp14:anchorId="718C4302" wp14:editId="2CF3A428">
+          <wp:inline distT="0" distB="0" distL="0" distR="0" wp14:anchorId="05081E78" wp14:editId="238590CD">
             <wp:extent cx="4572000" cy="3429000"/>
             <wp:effectExtent l="0" t="0" r="0" b="0"/>
             <wp:docPr id="7" name="Immagine 7"/>
@@ -6748,7 +6809,7 @@
       <w:pPr>
         <w:pStyle w:val="Titolo2"/>
       </w:pPr>
-      <w:bookmarkStart w:id="13" w:name="_Toc243077450"/>
+      <w:bookmarkStart w:id="13" w:name="_Toc243079690"/>
       <w:r>
         <w:t>4.3 Verifiche</w:t>
       </w:r>
@@ -6795,7 +6856,7 @@
       <w:pPr>
         <w:pStyle w:val="Titolo2"/>
       </w:pPr>
-      <w:bookmarkStart w:id="14" w:name="_Toc243077451"/>
+      <w:bookmarkStart w:id="14" w:name="_Toc243079691"/>
       <w:r>
         <w:t>4.4 Android: menu Tema e notifiche (versione 1.0.1)</w:t>
       </w:r>
@@ -7130,7 +7191,7 @@
       <w:pPr>
         <w:pStyle w:val="Titolo1"/>
       </w:pPr>
-      <w:bookmarkStart w:id="15" w:name="_Toc243077452"/>
+      <w:bookmarkStart w:id="15" w:name="_Toc243079692"/>
       <w:r>
         <w:t>5. Decisioni</w:t>
       </w:r>
@@ -7148,7 +7209,7 @@
       <w:pPr>
         <w:pStyle w:val="Titolo2"/>
       </w:pPr>
-      <w:bookmarkStart w:id="16" w:name="_Toc243077453"/>
+      <w:bookmarkStart w:id="16" w:name="_Toc243079693"/>
       <w:r>
         <w:t>5.1 Canale degli aggiornamenti</w:t>
       </w:r>
@@ -7655,7 +7716,7 @@
       <w:pPr>
         <w:pStyle w:val="Titolo2"/>
       </w:pPr>
-      <w:bookmarkStart w:id="17" w:name="_Toc243077454"/>
+      <w:bookmarkStart w:id="17" w:name="_Toc243079694"/>
       <w:r>
         <w:t>5.2 Storia del repository</w:t>
       </w:r>
@@ -8162,7 +8223,7 @@
       <w:pPr>
         <w:pStyle w:val="Titolo2"/>
       </w:pPr>
-      <w:bookmarkStart w:id="18" w:name="_Toc243077455"/>
+      <w:bookmarkStart w:id="18" w:name="_Toc243079695"/>
       <w:r>
         <w:t>5.3 Identificativi del prodotto</w:t>
       </w:r>
@@ -8662,7 +8723,7 @@
       <w:pPr>
         <w:pStyle w:val="Titolo2"/>
       </w:pPr>
-      <w:bookmarkStart w:id="19" w:name="_Toc243077456"/>
+      <w:bookmarkStart w:id="19" w:name="_Toc243079696"/>
       <w:r>
         <w:t>5.4 Avvisi e domande</w:t>
       </w:r>
@@ -9169,7 +9230,7 @@
       <w:pPr>
         <w:pStyle w:val="Titolo1"/>
       </w:pPr>
-      <w:bookmarkStart w:id="20" w:name="_Toc243077457"/>
+      <w:bookmarkStart w:id="20" w:name="_Toc243079697"/>
       <w:r>
         <w:t>6. Come si lavora</w:t>
       </w:r>
@@ -9179,7 +9240,7 @@
       <w:pPr>
         <w:pStyle w:val="Titolo2"/>
       </w:pPr>
-      <w:bookmarkStart w:id="21" w:name="_Toc243077458"/>
+      <w:bookmarkStart w:id="21" w:name="_Toc243079698"/>
       <w:r>
         <w:t>6.1 Comandi</w:t>
       </w:r>
@@ -9249,7 +9310,7 @@
       <w:pPr>
         <w:pStyle w:val="Titolo2"/>
       </w:pPr>
-      <w:bookmarkStart w:id="22" w:name="_Toc243077459"/>
+      <w:bookmarkStart w:id="22" w:name="_Toc243079699"/>
       <w:r>
         <w:t>6.2 Pubblicare una versione</w:t>
       </w:r>
@@ -9377,7 +9438,7 @@
       <w:pPr>
         <w:pStyle w:val="Titolo2"/>
       </w:pPr>
-      <w:bookmarkStart w:id="23" w:name="_Toc243077460"/>
+      <w:bookmarkStart w:id="23" w:name="_Toc243079700"/>
       <w:r>
         <w:t>6.3 Release 1.0.0 (pubblicata il 16 ottobre 2026)</w:t>
       </w:r>
@@ -10104,7 +10165,7 @@
       <w:pPr>
         <w:pStyle w:val="Titolo2"/>
       </w:pPr>
-      <w:bookmarkStart w:id="24" w:name="_Toc243077461"/>
+      <w:bookmarkStart w:id="24" w:name="_Toc243079701"/>
       <w:r>
         <w:t>6.4 Release 1.0.1</w:t>
       </w:r>
@@ -10401,11 +10462,433 @@
       <w:pPr>
         <w:pStyle w:val="Titolo2"/>
       </w:pPr>
-      <w:bookmarkStart w:id="25" w:name="_Toc243077462"/>
-      <w:r>
-        <w:t>6.5 Nuova versione: link diretto per ogni sistema</w:t>
+      <w:bookmarkStart w:id="25" w:name="_Toc243079702"/>
+      <w:r>
+        <w:t>6.5 Release 1.0.2 e repository pubblico</w:t>
       </w:r>
       <w:bookmarkEnd w:id="25"/>
+    </w:p>
+    <w:p>
+      <w:pPr>
+        <w:spacing w:after="120"/>
+      </w:pPr>
+      <w:r>
+        <w:t xml:space="preserve">Tag </w:t>
+      </w:r>
+      <w:r>
+        <w:rPr>
+          <w:rFonts w:ascii="Consolas" w:eastAsia="Consolas" w:hAnsi="Consolas" w:cs="Consolas"/>
+          <w:sz w:val="19"/>
+          <w:szCs w:val="19"/>
+        </w:rPr>
+        <w:t>v1.0.2</w:t>
+      </w:r>
+      <w:r>
+        <w:t xml:space="preserve"> pubblicato il 16 ottobre 2026 (pipeline riuscita in 10 minuti, release «Latest»). Il repository akito996/pdfz è stato reso pubblico: le app leggono il file della versione e scaricano l'installer senza account GitHub.</w:t>
+      </w:r>
+    </w:p>
+    <w:tbl>
+      <w:tblPr>
+        <w:tblW w:w="9638" w:type="dxa"/>
+        <w:tblBorders>
+          <w:top w:val="single" w:sz="4" w:space="0" w:color="auto"/>
+          <w:left w:val="single" w:sz="4" w:space="0" w:color="auto"/>
+          <w:bottom w:val="single" w:sz="4" w:space="0" w:color="auto"/>
+          <w:right w:val="single" w:sz="4" w:space="0" w:color="auto"/>
+          <w:insideH w:val="single" w:sz="4" w:space="0" w:color="auto"/>
+          <w:insideV w:val="single" w:sz="4" w:space="0" w:color="auto"/>
+        </w:tblBorders>
+        <w:tblLook w:val="04A0" w:firstRow="1" w:lastRow="0" w:firstColumn="1" w:lastColumn="0" w:noHBand="0" w:noVBand="1"/>
+      </w:tblPr>
+      <w:tblGrid>
+        <w:gridCol w:w="1928"/>
+        <w:gridCol w:w="6168"/>
+        <w:gridCol w:w="1542"/>
+      </w:tblGrid>
+      <w:tr>
+        <w:trPr>
+          <w:tblHeader/>
+        </w:trPr>
+        <w:tc>
+          <w:tcPr>
+            <w:tcW w:w="1928" w:type="dxa"/>
+            <w:tcBorders>
+              <w:top w:val="single" w:sz="4" w:space="0" w:color="D4CEC7"/>
+              <w:left w:val="single" w:sz="4" w:space="0" w:color="D4CEC7"/>
+              <w:bottom w:val="single" w:sz="4" w:space="0" w:color="D4CEC7"/>
+              <w:right w:val="single" w:sz="4" w:space="0" w:color="D4CEC7"/>
+            </w:tcBorders>
+            <w:shd w:val="clear" w:color="auto" w:fill="B3122B"/>
+            <w:tcMar>
+              <w:top w:w="60" w:type="dxa"/>
+              <w:left w:w="100" w:type="dxa"/>
+              <w:bottom w:w="60" w:type="dxa"/>
+              <w:right w:w="100" w:type="dxa"/>
+            </w:tcMar>
+          </w:tcPr>
+          <w:p>
+            <w:r>
+              <w:rPr>
+                <w:b/>
+                <w:bCs/>
+                <w:color w:val="FFFFFF"/>
+              </w:rPr>
+              <w:t>Sistema</w:t>
+            </w:r>
+          </w:p>
+        </w:tc>
+        <w:tc>
+          <w:tcPr>
+            <w:tcW w:w="6168" w:type="dxa"/>
+            <w:tcBorders>
+              <w:top w:val="single" w:sz="4" w:space="0" w:color="D4CEC7"/>
+              <w:left w:val="single" w:sz="4" w:space="0" w:color="D4CEC7"/>
+              <w:bottom w:val="single" w:sz="4" w:space="0" w:color="D4CEC7"/>
+              <w:right w:val="single" w:sz="4" w:space="0" w:color="D4CEC7"/>
+            </w:tcBorders>
+            <w:shd w:val="clear" w:color="auto" w:fill="B3122B"/>
+            <w:tcMar>
+              <w:top w:w="60" w:type="dxa"/>
+              <w:left w:w="100" w:type="dxa"/>
+              <w:bottom w:w="60" w:type="dxa"/>
+              <w:right w:w="100" w:type="dxa"/>
+            </w:tcMar>
+          </w:tcPr>
+          <w:p>
+            <w:r>
+              <w:rPr>
+                <w:b/>
+                <w:bCs/>
+                <w:color w:val="FFFFFF"/>
+              </w:rPr>
+              <w:t>Link diretto (verificato senza login)</w:t>
+            </w:r>
+          </w:p>
+        </w:tc>
+        <w:tc>
+          <w:tcPr>
+            <w:tcW w:w="1542" w:type="dxa"/>
+            <w:tcBorders>
+              <w:top w:val="single" w:sz="4" w:space="0" w:color="D4CEC7"/>
+              <w:left w:val="single" w:sz="4" w:space="0" w:color="D4CEC7"/>
+              <w:bottom w:val="single" w:sz="4" w:space="0" w:color="D4CEC7"/>
+              <w:right w:val="single" w:sz="4" w:space="0" w:color="D4CEC7"/>
+            </w:tcBorders>
+            <w:shd w:val="clear" w:color="auto" w:fill="B3122B"/>
+            <w:tcMar>
+              <w:top w:w="60" w:type="dxa"/>
+              <w:left w:w="100" w:type="dxa"/>
+              <w:bottom w:w="60" w:type="dxa"/>
+              <w:right w:w="100" w:type="dxa"/>
+            </w:tcMar>
+          </w:tcPr>
+          <w:p>
+            <w:r>
+              <w:rPr>
+                <w:b/>
+                <w:bCs/>
+                <w:color w:val="FFFFFF"/>
+              </w:rPr>
+              <w:t>Dimensione</w:t>
+            </w:r>
+          </w:p>
+        </w:tc>
+      </w:tr>
+      <w:tr>
+        <w:tc>
+          <w:tcPr>
+            <w:tcW w:w="1928" w:type="dxa"/>
+            <w:tcBorders>
+              <w:top w:val="single" w:sz="4" w:space="0" w:color="D4CEC7"/>
+              <w:left w:val="single" w:sz="4" w:space="0" w:color="D4CEC7"/>
+              <w:bottom w:val="single" w:sz="4" w:space="0" w:color="D4CEC7"/>
+              <w:right w:val="single" w:sz="4" w:space="0" w:color="D4CEC7"/>
+            </w:tcBorders>
+            <w:tcMar>
+              <w:top w:w="60" w:type="dxa"/>
+              <w:left w:w="100" w:type="dxa"/>
+              <w:bottom w:w="60" w:type="dxa"/>
+              <w:right w:w="100" w:type="dxa"/>
+            </w:tcMar>
+          </w:tcPr>
+          <w:p>
+            <w:r>
+              <w:t>Windows</w:t>
+            </w:r>
+          </w:p>
+        </w:tc>
+        <w:tc>
+          <w:tcPr>
+            <w:tcW w:w="6168" w:type="dxa"/>
+            <w:tcBorders>
+              <w:top w:val="single" w:sz="4" w:space="0" w:color="D4CEC7"/>
+              <w:left w:val="single" w:sz="4" w:space="0" w:color="D4CEC7"/>
+              <w:bottom w:val="single" w:sz="4" w:space="0" w:color="D4CEC7"/>
+              <w:right w:val="single" w:sz="4" w:space="0" w:color="D4CEC7"/>
+            </w:tcBorders>
+            <w:tcMar>
+              <w:top w:w="60" w:type="dxa"/>
+              <w:left w:w="100" w:type="dxa"/>
+              <w:bottom w:w="60" w:type="dxa"/>
+              <w:right w:w="100" w:type="dxa"/>
+            </w:tcMar>
+          </w:tcPr>
+          <w:p>
+            <w:r>
+              <w:t>https://github.com/akito996/pdfz/releases/download/v1.0.2/PDFz-1.0.2-x64.msi</w:t>
+            </w:r>
+          </w:p>
+        </w:tc>
+        <w:tc>
+          <w:tcPr>
+            <w:tcW w:w="1542" w:type="dxa"/>
+            <w:tcBorders>
+              <w:top w:val="single" w:sz="4" w:space="0" w:color="D4CEC7"/>
+              <w:left w:val="single" w:sz="4" w:space="0" w:color="D4CEC7"/>
+              <w:bottom w:val="single" w:sz="4" w:space="0" w:color="D4CEC7"/>
+              <w:right w:val="single" w:sz="4" w:space="0" w:color="D4CEC7"/>
+            </w:tcBorders>
+            <w:tcMar>
+              <w:top w:w="60" w:type="dxa"/>
+              <w:left w:w="100" w:type="dxa"/>
+              <w:bottom w:w="60" w:type="dxa"/>
+              <w:right w:w="100" w:type="dxa"/>
+            </w:tcMar>
+          </w:tcPr>
+          <w:p>
+            <w:r>
+              <w:t>136,8 MB</w:t>
+            </w:r>
+          </w:p>
+        </w:tc>
+      </w:tr>
+      <w:tr>
+        <w:tc>
+          <w:tcPr>
+            <w:tcW w:w="1928" w:type="dxa"/>
+            <w:tcBorders>
+              <w:top w:val="single" w:sz="4" w:space="0" w:color="D4CEC7"/>
+              <w:left w:val="single" w:sz="4" w:space="0" w:color="D4CEC7"/>
+              <w:bottom w:val="single" w:sz="4" w:space="0" w:color="D4CEC7"/>
+              <w:right w:val="single" w:sz="4" w:space="0" w:color="D4CEC7"/>
+            </w:tcBorders>
+            <w:tcMar>
+              <w:top w:w="60" w:type="dxa"/>
+              <w:left w:w="100" w:type="dxa"/>
+              <w:bottom w:w="60" w:type="dxa"/>
+              <w:right w:w="100" w:type="dxa"/>
+            </w:tcMar>
+          </w:tcPr>
+          <w:p>
+            <w:r>
+              <w:t>macOS (Apple Silicon)</w:t>
+            </w:r>
+          </w:p>
+        </w:tc>
+        <w:tc>
+          <w:tcPr>
+            <w:tcW w:w="6168" w:type="dxa"/>
+            <w:tcBorders>
+              <w:top w:val="single" w:sz="4" w:space="0" w:color="D4CEC7"/>
+              <w:left w:val="single" w:sz="4" w:space="0" w:color="D4CEC7"/>
+              <w:bottom w:val="single" w:sz="4" w:space="0" w:color="D4CEC7"/>
+              <w:right w:val="single" w:sz="4" w:space="0" w:color="D4CEC7"/>
+            </w:tcBorders>
+            <w:tcMar>
+              <w:top w:w="60" w:type="dxa"/>
+              <w:left w:w="100" w:type="dxa"/>
+              <w:bottom w:w="60" w:type="dxa"/>
+              <w:right w:w="100" w:type="dxa"/>
+            </w:tcMar>
+          </w:tcPr>
+          <w:p>
+            <w:r>
+              <w:t>https://github.com/akito996/pdfz/releases/download/v1.0.2/PDFz-1.0.2-macOS-arm64.dmg</w:t>
+            </w:r>
+          </w:p>
+        </w:tc>
+        <w:tc>
+          <w:tcPr>
+            <w:tcW w:w="1542" w:type="dxa"/>
+            <w:tcBorders>
+              <w:top w:val="single" w:sz="4" w:space="0" w:color="D4CEC7"/>
+              <w:left w:val="single" w:sz="4" w:space="0" w:color="D4CEC7"/>
+              <w:bottom w:val="single" w:sz="4" w:space="0" w:color="D4CEC7"/>
+              <w:right w:val="single" w:sz="4" w:space="0" w:color="D4CEC7"/>
+            </w:tcBorders>
+            <w:tcMar>
+              <w:top w:w="60" w:type="dxa"/>
+              <w:left w:w="100" w:type="dxa"/>
+              <w:bottom w:w="60" w:type="dxa"/>
+              <w:right w:w="100" w:type="dxa"/>
+            </w:tcMar>
+          </w:tcPr>
+          <w:p>
+            <w:r>
+              <w:t>139,3 MB</w:t>
+            </w:r>
+          </w:p>
+        </w:tc>
+      </w:tr>
+      <w:tr>
+        <w:tc>
+          <w:tcPr>
+            <w:tcW w:w="1928" w:type="dxa"/>
+            <w:tcBorders>
+              <w:top w:val="single" w:sz="4" w:space="0" w:color="D4CEC7"/>
+              <w:left w:val="single" w:sz="4" w:space="0" w:color="D4CEC7"/>
+              <w:bottom w:val="single" w:sz="4" w:space="0" w:color="D4CEC7"/>
+              <w:right w:val="single" w:sz="4" w:space="0" w:color="D4CEC7"/>
+            </w:tcBorders>
+            <w:tcMar>
+              <w:top w:w="60" w:type="dxa"/>
+              <w:left w:w="100" w:type="dxa"/>
+              <w:bottom w:w="60" w:type="dxa"/>
+              <w:right w:w="100" w:type="dxa"/>
+            </w:tcMar>
+          </w:tcPr>
+          <w:p>
+            <w:r>
+              <w:t>Linux</w:t>
+            </w:r>
+          </w:p>
+        </w:tc>
+        <w:tc>
+          <w:tcPr>
+            <w:tcW w:w="6168" w:type="dxa"/>
+            <w:tcBorders>
+              <w:top w:val="single" w:sz="4" w:space="0" w:color="D4CEC7"/>
+              <w:left w:val="single" w:sz="4" w:space="0" w:color="D4CEC7"/>
+              <w:bottom w:val="single" w:sz="4" w:space="0" w:color="D4CEC7"/>
+              <w:right w:val="single" w:sz="4" w:space="0" w:color="D4CEC7"/>
+            </w:tcBorders>
+            <w:tcMar>
+              <w:top w:w="60" w:type="dxa"/>
+              <w:left w:w="100" w:type="dxa"/>
+              <w:bottom w:w="60" w:type="dxa"/>
+              <w:right w:w="100" w:type="dxa"/>
+            </w:tcMar>
+          </w:tcPr>
+          <w:p>
+            <w:r>
+              <w:t>https://github.com/akito996/pdfz/releases/download/v1.0.2/PDFz-1.0.2-x86_64.AppImage</w:t>
+            </w:r>
+          </w:p>
+        </w:tc>
+        <w:tc>
+          <w:tcPr>
+            <w:tcW w:w="1542" w:type="dxa"/>
+            <w:tcBorders>
+              <w:top w:val="single" w:sz="4" w:space="0" w:color="D4CEC7"/>
+              <w:left w:val="single" w:sz="4" w:space="0" w:color="D4CEC7"/>
+              <w:bottom w:val="single" w:sz="4" w:space="0" w:color="D4CEC7"/>
+              <w:right w:val="single" w:sz="4" w:space="0" w:color="D4CEC7"/>
+            </w:tcBorders>
+            <w:tcMar>
+              <w:top w:w="60" w:type="dxa"/>
+              <w:left w:w="100" w:type="dxa"/>
+              <w:bottom w:w="60" w:type="dxa"/>
+              <w:right w:w="100" w:type="dxa"/>
+            </w:tcMar>
+          </w:tcPr>
+          <w:p>
+            <w:r>
+              <w:t>199,7 MB</w:t>
+            </w:r>
+          </w:p>
+        </w:tc>
+      </w:tr>
+      <w:tr>
+        <w:tc>
+          <w:tcPr>
+            <w:tcW w:w="1928" w:type="dxa"/>
+            <w:tcBorders>
+              <w:top w:val="single" w:sz="4" w:space="0" w:color="D4CEC7"/>
+              <w:left w:val="single" w:sz="4" w:space="0" w:color="D4CEC7"/>
+              <w:bottom w:val="single" w:sz="4" w:space="0" w:color="D4CEC7"/>
+              <w:right w:val="single" w:sz="4" w:space="0" w:color="D4CEC7"/>
+            </w:tcBorders>
+            <w:tcMar>
+              <w:top w:w="60" w:type="dxa"/>
+              <w:left w:w="100" w:type="dxa"/>
+              <w:bottom w:w="60" w:type="dxa"/>
+              <w:right w:w="100" w:type="dxa"/>
+            </w:tcMar>
+          </w:tcPr>
+          <w:p>
+            <w:r>
+              <w:t>Android</w:t>
+            </w:r>
+          </w:p>
+        </w:tc>
+        <w:tc>
+          <w:tcPr>
+            <w:tcW w:w="6168" w:type="dxa"/>
+            <w:tcBorders>
+              <w:top w:val="single" w:sz="4" w:space="0" w:color="D4CEC7"/>
+              <w:left w:val="single" w:sz="4" w:space="0" w:color="D4CEC7"/>
+              <w:bottom w:val="single" w:sz="4" w:space="0" w:color="D4CEC7"/>
+              <w:right w:val="single" w:sz="4" w:space="0" w:color="D4CEC7"/>
+            </w:tcBorders>
+            <w:tcMar>
+              <w:top w:w="60" w:type="dxa"/>
+              <w:left w:w="100" w:type="dxa"/>
+              <w:bottom w:w="60" w:type="dxa"/>
+              <w:right w:w="100" w:type="dxa"/>
+            </w:tcMar>
+          </w:tcPr>
+          <w:p>
+            <w:r>
+              <w:t>https://github.com/akito996/pdfz/releases/download/v1.0.2/PDFz-1.0.2-android.apk</w:t>
+            </w:r>
+          </w:p>
+        </w:tc>
+        <w:tc>
+          <w:tcPr>
+            <w:tcW w:w="1542" w:type="dxa"/>
+            <w:tcBorders>
+              <w:top w:val="single" w:sz="4" w:space="0" w:color="D4CEC7"/>
+              <w:left w:val="single" w:sz="4" w:space="0" w:color="D4CEC7"/>
+              <w:bottom w:val="single" w:sz="4" w:space="0" w:color="D4CEC7"/>
+              <w:right w:val="single" w:sz="4" w:space="0" w:color="D4CEC7"/>
+            </w:tcBorders>
+            <w:tcMar>
+              <w:top w:w="60" w:type="dxa"/>
+              <w:left w:w="100" w:type="dxa"/>
+              <w:bottom w:w="60" w:type="dxa"/>
+              <w:right w:w="100" w:type="dxa"/>
+            </w:tcMar>
+          </w:tcPr>
+          <w:p>
+            <w:r>
+              <w:t>64,6 MB</w:t>
+            </w:r>
+          </w:p>
+        </w:tc>
+      </w:tr>
+    </w:tbl>
+    <w:p>
+      <w:pPr>
+        <w:spacing w:after="120"/>
+      </w:pPr>
+    </w:p>
+    <w:p>
+      <w:pPr>
+        <w:spacing w:after="120"/>
+      </w:pPr>
+      <w:r>
+        <w:t>Prova fatta: il motore di un'app 1.0.1 (Windows, Linux, Android, macOS) trova la 1.0.2 e riceve il link diretto al proprio installer; ogni link risponde e la dimensione coincide con quella del file della versione.</w:t>
+      </w:r>
+    </w:p>
+    <w:p>
+      <w:pPr>
+        <w:pStyle w:val="Titolo2"/>
+      </w:pPr>
+      <w:bookmarkStart w:id="26" w:name="_Toc243079703"/>
+      <w:r>
+        <w:t>6.6 Nuova versione: link diretto per ogni sistema</w:t>
+      </w:r>
+      <w:bookmarkEnd w:id="26"/>
     </w:p>
     <w:p>
       <w:pPr>
@@ -10818,7 +11301,7 @@
           <w:noProof/>
         </w:rPr>
         <w:drawing>
-          <wp:inline distT="0" distB="0" distL="0" distR="0" wp14:anchorId="19ED52E6" wp14:editId="4091F628">
+          <wp:inline distT="0" distB="0" distL="0" distR="0" wp14:anchorId="5610CC95" wp14:editId="5D854E3D">
             <wp:extent cx="4572000" cy="4429125"/>
             <wp:effectExtent l="0" t="0" r="0" b="0"/>
             <wp:docPr id="8" name="Immagine 8"/>
@@ -10886,18 +11369,18 @@
         <w:rPr>
           <w:color w:val="3B3632"/>
         </w:rPr>
-        <w:t>Funziona solo se le release sono pubbliche: con il repository privato le app non riescono a leggere il file della versione né a scaricare l'installer. Per questo il repository akito996/pdfz viene reso pubblico con la 1.0.2.</w:t>
+        <w:t>Funziona solo con release pubbliche: per questo con la 1.0.2 il repository akito996/pdfz è stato reso pubblico.</w:t>
       </w:r>
     </w:p>
     <w:p>
       <w:pPr>
         <w:pStyle w:val="Titolo2"/>
       </w:pPr>
-      <w:bookmarkStart w:id="26" w:name="_Toc243077463"/>
-      <w:r>
-        <w:t>6.6 Ruoli</w:t>
-      </w:r>
-      <w:bookmarkEnd w:id="26"/>
+      <w:bookmarkStart w:id="27" w:name="_Toc243079704"/>
+      <w:r>
+        <w:t>6.7 Ruoli</w:t>
+      </w:r>
+      <w:bookmarkEnd w:id="27"/>
     </w:p>
     <w:tbl>
       <w:tblPr>
@@ -11166,11 +11649,11 @@
       <w:pPr>
         <w:pStyle w:val="Titolo1"/>
       </w:pPr>
-      <w:bookmarkStart w:id="27" w:name="_Toc243077464"/>
+      <w:bookmarkStart w:id="28" w:name="_Toc243079705"/>
       <w:r>
         <w:t>7. Sicurezza</w:t>
       </w:r>
-      <w:bookmarkEnd w:id="27"/>
+      <w:bookmarkEnd w:id="28"/>
     </w:p>
     <w:p>
       <w:pPr>
@@ -11465,11 +11948,11 @@
       <w:pPr>
         <w:pStyle w:val="Titolo1"/>
       </w:pPr>
-      <w:bookmarkStart w:id="28" w:name="_Toc243077465"/>
+      <w:bookmarkStart w:id="29" w:name="_Toc243079706"/>
       <w:r>
         <w:t>8. Punti aperti</w:t>
       </w:r>
-      <w:bookmarkEnd w:id="28"/>
+      <w:bookmarkEnd w:id="29"/>
     </w:p>
     <w:p>
       <w:pPr>
@@ -11505,10 +11988,10 @@
           <w:b/>
           <w:bCs/>
         </w:rPr>
-        <w:t>Repository pubblico o privato</w:t>
-      </w:r>
-      <w:r>
-        <w:t>: con il repository privato i link delle release si aprono solo con l'accesso a GitHub e l'avviso di nuova versione non funziona.</w:t>
+        <w:t>Prova su dispositivi veri</w:t>
+      </w:r>
+      <w:r>
+        <w:t xml:space="preserve"> dell'avviso di nuova versione e del download diretto (PC e telefono con la 1.0.1 installata).</w:t>
       </w:r>
     </w:p>
     <w:p>
@@ -11588,11 +12071,11 @@
       <w:pPr>
         <w:pStyle w:val="Titolo1"/>
       </w:pPr>
-      <w:bookmarkStart w:id="29" w:name="_Toc243077466"/>
+      <w:bookmarkStart w:id="30" w:name="_Toc243079707"/>
       <w:r>
         <w:t>9. Pensato per i prossimi 10 anni</w:t>
       </w:r>
-      <w:bookmarkEnd w:id="29"/>
+      <w:bookmarkEnd w:id="30"/>
     </w:p>
     <w:p>
       <w:pPr>
@@ -11835,10 +12318,96 @@
 <file path=word/numbering.xml><?xml version="1.0" encoding="utf-8"?>
 <w:numbering xmlns:wpc="http://schemas.microsoft.com/office/word/2010/wordprocessingCanvas" xmlns:cx="http://schemas.microsoft.com/office/drawing/2014/chartex" xmlns:cx1="http://schemas.microsoft.com/office/drawing/2015/9/8/chartex" xmlns:cx2="http://schemas.microsoft.com/office/drawing/2015/10/21/chartex" xmlns:cx3="http://schemas.microsoft.com/office/drawing/2016/5/9/chartex" xmlns:cx4="http://schemas.microsoft.com/office/drawing/2016/5/10/chartex" xmlns:cx5="http://schemas.microsoft.com/office/drawing/2016/5/11/chartex" xmlns:cx6="http://schemas.microsoft.com/office/drawing/2016/5/12/chartex" xmlns:cx7="http://schemas.microsoft.com/office/drawing/2016/5/13/chartex" xmlns:cx8="http://schemas.microsoft.com/office/drawing/2016/5/14/chartex" xmlns:mc="http://schemas.openxmlformats.org/markup-compatibility/2006" xmlns:aink="http://schemas.microsoft.com/office/drawing/2016/ink" xmlns:am3d="http://schemas.microsoft.com/office/drawing/2017/model3d" xmlns:o="urn:schemas-microsoft-com:office:office" xmlns:oel="http://schemas.microsoft.com/office/2019/extlst" xmlns:r="http://schemas.openxmlformats.org/officeDocument/2006/relationships" xmlns:m="http://schemas.openxmlformats.org/officeDocument/2006/math" xmlns:v="urn:schemas-microsoft-com:vml" xmlns:wp14="http://schemas.microsoft.com/office/word/2010/wordprocessingDrawing" xmlns:wp="http://schemas.openxmlformats.org/drawingml/2006/wordprocessingDrawing" xmlns:w10="urn:schemas-microsoft-com:office:word" xmlns:w="http://schemas.openxmlformats.org/wordprocessingml/2006/main" xmlns:w14="http://schemas.microsoft.com/office/word/2010/wordml" xmlns:w15="http://schemas.microsoft.com/office/word/2012/wordml" xmlns:w16cex="http://schemas.microsoft.com/office/word/2018/wordml/cex" xmlns:w16cid="http://schemas.microsoft.com/office/word/2016/wordml/cid" xmlns:w16="http://schemas.microsoft.com/office/word/2018/wordml" xmlns:w16du="http://schemas.microsoft.com/office/word/2023/wordml/word16du" xmlns:w16sdtdh="http://schemas.microsoft.com/office/word/2020/wordml/sdtdatahash" xmlns:w16sdtfl="http://schemas.microsoft.com/office/word/2024/wordml/sdtformatlock" xmlns:w16se="http://schemas.microsoft.com/office/word/2015/wordml/symex" xmlns:wpg="http://schemas.microsoft.com/office/word/2010/wordprocessingGroup" xmlns:wpi="http://schemas.microsoft.com/office/word/2010/wordprocessingInk" xmlns:wne="http://schemas.microsoft.com/office/word/2006/wordml" xmlns:wps="http://schemas.microsoft.com/office/word/2010/wordprocessingShape" mc:Ignorable="w14 w15 w16se w16cid w16 w16cex w16sdtdh w16sdtfl w16du wp14">
   <w:abstractNum w:abstractNumId="0" w15:restartNumberingAfterBreak="0">
-    <w:nsid w:val="0BFC03DF"/>
+    <w:nsid w:val="271E5532"/>
     <w:multiLevelType w:val="hybridMultilevel"/>
-    <w:tmpl w:val="754E95CE"/>
-    <w:lvl w:ilvl="0" w:tplc="7B62C60E">
+    <w:tmpl w:val="B98EEC68"/>
+    <w:lvl w:ilvl="0" w:tplc="D932F324" w:tentative="1">
+      <w:start w:val="1"/>
+      <w:numFmt w:val="bullet"/>
+      <w:lvlText w:val="●"/>
+      <w:lvlJc w:val="left"/>
+      <w:pPr>
+        <w:ind w:left="720" w:hanging="360"/>
+      </w:pPr>
+    </w:lvl>
+    <w:lvl w:ilvl="1" w:tplc="7788FDD6" w:tentative="1">
+      <w:start w:val="1"/>
+      <w:numFmt w:val="bullet"/>
+      <w:lvlText w:val="○"/>
+      <w:lvlJc w:val="left"/>
+      <w:pPr>
+        <w:ind w:left="1440" w:hanging="360"/>
+      </w:pPr>
+    </w:lvl>
+    <w:lvl w:ilvl="2" w:tplc="937ECD66" w:tentative="1">
+      <w:start w:val="1"/>
+      <w:numFmt w:val="bullet"/>
+      <w:lvlText w:val="■"/>
+      <w:lvlJc w:val="left"/>
+      <w:pPr>
+        <w:ind w:left="2160" w:hanging="360"/>
+      </w:pPr>
+    </w:lvl>
+    <w:lvl w:ilvl="3" w:tplc="5E1E1B76" w:tentative="1">
+      <w:start w:val="1"/>
+      <w:numFmt w:val="bullet"/>
+      <w:lvlText w:val="●"/>
+      <w:lvlJc w:val="left"/>
+      <w:pPr>
+        <w:ind w:left="2880" w:hanging="360"/>
+      </w:pPr>
+    </w:lvl>
+    <w:lvl w:ilvl="4" w:tplc="CCBCD430" w:tentative="1">
+      <w:start w:val="1"/>
+      <w:numFmt w:val="bullet"/>
+      <w:lvlText w:val="○"/>
+      <w:lvlJc w:val="left"/>
+      <w:pPr>
+        <w:ind w:left="3600" w:hanging="360"/>
+      </w:pPr>
+    </w:lvl>
+    <w:lvl w:ilvl="5" w:tplc="C3F8A7E2" w:tentative="1">
+      <w:start w:val="1"/>
+      <w:numFmt w:val="bullet"/>
+      <w:lvlText w:val="■"/>
+      <w:lvlJc w:val="left"/>
+      <w:pPr>
+        <w:ind w:left="4320" w:hanging="360"/>
+      </w:pPr>
+    </w:lvl>
+    <w:lvl w:ilvl="6" w:tplc="1856FF78" w:tentative="1">
+      <w:start w:val="1"/>
+      <w:numFmt w:val="bullet"/>
+      <w:lvlText w:val="●"/>
+      <w:lvlJc w:val="left"/>
+      <w:pPr>
+        <w:ind w:left="5040" w:hanging="360"/>
+      </w:pPr>
+    </w:lvl>
+    <w:lvl w:ilvl="7" w:tplc="26C015D8" w:tentative="1">
+      <w:start w:val="1"/>
+      <w:numFmt w:val="bullet"/>
+      <w:lvlText w:val="●"/>
+      <w:lvlJc w:val="left"/>
+      <w:pPr>
+        <w:ind w:left="5760" w:hanging="360"/>
+      </w:pPr>
+    </w:lvl>
+    <w:lvl w:ilvl="8" w:tplc="7A9E9978" w:tentative="1">
+      <w:start w:val="1"/>
+      <w:numFmt w:val="bullet"/>
+      <w:lvlText w:val="●"/>
+      <w:lvlJc w:val="left"/>
+      <w:pPr>
+        <w:ind w:left="6480" w:hanging="360"/>
+      </w:pPr>
+    </w:lvl>
+  </w:abstractNum>
+  <w:abstractNum w:abstractNumId="1" w15:restartNumberingAfterBreak="0">
+    <w:nsid w:val="696E61F7"/>
+    <w:multiLevelType w:val="hybridMultilevel"/>
+    <w:tmpl w:val="182469CA"/>
+    <w:lvl w:ilvl="0" w:tplc="F4E0BCB6">
       <w:start w:val="1"/>
       <w:numFmt w:val="bullet"/>
       <w:lvlText w:val="•"/>
@@ -11847,192 +12416,52 @@
         <w:ind w:left="540" w:hanging="270"/>
       </w:pPr>
     </w:lvl>
-    <w:lvl w:ilvl="1" w:tplc="BA409DA6">
+    <w:lvl w:ilvl="1" w:tplc="1B60B244">
       <w:numFmt w:val="decimal"/>
       <w:lvlText w:val=""/>
       <w:lvlJc w:val="left"/>
     </w:lvl>
-    <w:lvl w:ilvl="2" w:tplc="5748F308">
+    <w:lvl w:ilvl="2" w:tplc="7FD81780">
       <w:numFmt w:val="decimal"/>
       <w:lvlText w:val=""/>
       <w:lvlJc w:val="left"/>
     </w:lvl>
-    <w:lvl w:ilvl="3" w:tplc="1542D9F8">
+    <w:lvl w:ilvl="3" w:tplc="F03002D0">
       <w:numFmt w:val="decimal"/>
       <w:lvlText w:val=""/>
       <w:lvlJc w:val="left"/>
     </w:lvl>
-    <w:lvl w:ilvl="4" w:tplc="BCE40AE4">
+    <w:lvl w:ilvl="4" w:tplc="54082C94">
       <w:numFmt w:val="decimal"/>
       <w:lvlText w:val=""/>
       <w:lvlJc w:val="left"/>
     </w:lvl>
-    <w:lvl w:ilvl="5" w:tplc="2E00405A">
+    <w:lvl w:ilvl="5" w:tplc="B64AB128">
       <w:numFmt w:val="decimal"/>
       <w:lvlText w:val=""/>
       <w:lvlJc w:val="left"/>
     </w:lvl>
-    <w:lvl w:ilvl="6" w:tplc="3A2C0FF0">
+    <w:lvl w:ilvl="6" w:tplc="D8D2825C">
       <w:numFmt w:val="decimal"/>
       <w:lvlText w:val=""/>
       <w:lvlJc w:val="left"/>
     </w:lvl>
-    <w:lvl w:ilvl="7" w:tplc="B106B726">
+    <w:lvl w:ilvl="7" w:tplc="9E1C15E4">
       <w:numFmt w:val="decimal"/>
       <w:lvlText w:val=""/>
       <w:lvlJc w:val="left"/>
     </w:lvl>
-    <w:lvl w:ilvl="8" w:tplc="A844D316">
-      <w:numFmt w:val="decimal"/>
-      <w:lvlText w:val=""/>
-      <w:lvlJc w:val="left"/>
-    </w:lvl>
-  </w:abstractNum>
-  <w:abstractNum w:abstractNumId="1" w15:restartNumberingAfterBreak="0">
-    <w:nsid w:val="0CF36770"/>
-    <w:multiLevelType w:val="hybridMultilevel"/>
-    <w:tmpl w:val="1A6ACB7A"/>
-    <w:lvl w:ilvl="0" w:tplc="96860F4E">
-      <w:start w:val="1"/>
-      <w:numFmt w:val="decimal"/>
-      <w:lvlText w:val="%1."/>
-      <w:lvlJc w:val="left"/>
-      <w:pPr>
-        <w:ind w:left="540" w:hanging="300"/>
-      </w:pPr>
-    </w:lvl>
-    <w:lvl w:ilvl="1" w:tplc="A06028C6">
-      <w:numFmt w:val="decimal"/>
-      <w:lvlText w:val=""/>
-      <w:lvlJc w:val="left"/>
-    </w:lvl>
-    <w:lvl w:ilvl="2" w:tplc="9E9C57D6">
-      <w:numFmt w:val="decimal"/>
-      <w:lvlText w:val=""/>
-      <w:lvlJc w:val="left"/>
-    </w:lvl>
-    <w:lvl w:ilvl="3" w:tplc="2EDCF378">
-      <w:numFmt w:val="decimal"/>
-      <w:lvlText w:val=""/>
-      <w:lvlJc w:val="left"/>
-    </w:lvl>
-    <w:lvl w:ilvl="4" w:tplc="E8627ED6">
-      <w:numFmt w:val="decimal"/>
-      <w:lvlText w:val=""/>
-      <w:lvlJc w:val="left"/>
-    </w:lvl>
-    <w:lvl w:ilvl="5" w:tplc="4DCCF7E8">
-      <w:numFmt w:val="decimal"/>
-      <w:lvlText w:val=""/>
-      <w:lvlJc w:val="left"/>
-    </w:lvl>
-    <w:lvl w:ilvl="6" w:tplc="45F8ADF4">
-      <w:numFmt w:val="decimal"/>
-      <w:lvlText w:val=""/>
-      <w:lvlJc w:val="left"/>
-    </w:lvl>
-    <w:lvl w:ilvl="7" w:tplc="12E4212A">
-      <w:numFmt w:val="decimal"/>
-      <w:lvlText w:val=""/>
-      <w:lvlJc w:val="left"/>
-    </w:lvl>
-    <w:lvl w:ilvl="8" w:tplc="97201224">
+    <w:lvl w:ilvl="8" w:tplc="19DEDC7A">
       <w:numFmt w:val="decimal"/>
       <w:lvlText w:val=""/>
       <w:lvlJc w:val="left"/>
     </w:lvl>
   </w:abstractNum>
   <w:abstractNum w:abstractNumId="2" w15:restartNumberingAfterBreak="0">
-    <w:nsid w:val="46BD7A14"/>
+    <w:nsid w:val="78BD438D"/>
     <w:multiLevelType w:val="hybridMultilevel"/>
-    <w:tmpl w:val="AEF6A038"/>
-    <w:lvl w:ilvl="0" w:tplc="0E5ADDC2" w:tentative="1">
-      <w:start w:val="1"/>
-      <w:numFmt w:val="bullet"/>
-      <w:lvlText w:val="●"/>
-      <w:lvlJc w:val="left"/>
-      <w:pPr>
-        <w:ind w:left="720" w:hanging="360"/>
-      </w:pPr>
-    </w:lvl>
-    <w:lvl w:ilvl="1" w:tplc="0A8629E6" w:tentative="1">
-      <w:start w:val="1"/>
-      <w:numFmt w:val="bullet"/>
-      <w:lvlText w:val="○"/>
-      <w:lvlJc w:val="left"/>
-      <w:pPr>
-        <w:ind w:left="1440" w:hanging="360"/>
-      </w:pPr>
-    </w:lvl>
-    <w:lvl w:ilvl="2" w:tplc="B770B900" w:tentative="1">
-      <w:start w:val="1"/>
-      <w:numFmt w:val="bullet"/>
-      <w:lvlText w:val="■"/>
-      <w:lvlJc w:val="left"/>
-      <w:pPr>
-        <w:ind w:left="2160" w:hanging="360"/>
-      </w:pPr>
-    </w:lvl>
-    <w:lvl w:ilvl="3" w:tplc="D11E1820" w:tentative="1">
-      <w:start w:val="1"/>
-      <w:numFmt w:val="bullet"/>
-      <w:lvlText w:val="●"/>
-      <w:lvlJc w:val="left"/>
-      <w:pPr>
-        <w:ind w:left="2880" w:hanging="360"/>
-      </w:pPr>
-    </w:lvl>
-    <w:lvl w:ilvl="4" w:tplc="F5D8F27C" w:tentative="1">
-      <w:start w:val="1"/>
-      <w:numFmt w:val="bullet"/>
-      <w:lvlText w:val="○"/>
-      <w:lvlJc w:val="left"/>
-      <w:pPr>
-        <w:ind w:left="3600" w:hanging="360"/>
-      </w:pPr>
-    </w:lvl>
-    <w:lvl w:ilvl="5" w:tplc="30F20242" w:tentative="1">
-      <w:start w:val="1"/>
-      <w:numFmt w:val="bullet"/>
-      <w:lvlText w:val="■"/>
-      <w:lvlJc w:val="left"/>
-      <w:pPr>
-        <w:ind w:left="4320" w:hanging="360"/>
-      </w:pPr>
-    </w:lvl>
-    <w:lvl w:ilvl="6" w:tplc="E31C4006" w:tentative="1">
-      <w:start w:val="1"/>
-      <w:numFmt w:val="bullet"/>
-      <w:lvlText w:val="●"/>
-      <w:lvlJc w:val="left"/>
-      <w:pPr>
-        <w:ind w:left="5040" w:hanging="360"/>
-      </w:pPr>
-    </w:lvl>
-    <w:lvl w:ilvl="7" w:tplc="A8B8079E" w:tentative="1">
-      <w:start w:val="1"/>
-      <w:numFmt w:val="bullet"/>
-      <w:lvlText w:val="●"/>
-      <w:lvlJc w:val="left"/>
-      <w:pPr>
-        <w:ind w:left="5760" w:hanging="360"/>
-      </w:pPr>
-    </w:lvl>
-    <w:lvl w:ilvl="8" w:tplc="BAD02DA8" w:tentative="1">
-      <w:start w:val="1"/>
-      <w:numFmt w:val="bullet"/>
-      <w:lvlText w:val="●"/>
-      <w:lvlJc w:val="left"/>
-      <w:pPr>
-        <w:ind w:left="6480" w:hanging="360"/>
-      </w:pPr>
-    </w:lvl>
-  </w:abstractNum>
-  <w:abstractNum w:abstractNumId="3" w15:restartNumberingAfterBreak="0">
-    <w:nsid w:val="71FF1702"/>
-    <w:multiLevelType w:val="hybridMultilevel"/>
-    <w:tmpl w:val="94C0EF78"/>
-    <w:lvl w:ilvl="0" w:tplc="897821A0">
+    <w:tmpl w:val="8C5AC5C0"/>
+    <w:lvl w:ilvl="0" w:tplc="FAAC4A94">
       <w:start w:val="1"/>
       <w:numFmt w:val="decimal"/>
       <w:lvlText w:val="%1."/>
@@ -12041,66 +12470,120 @@
         <w:ind w:left="540" w:hanging="300"/>
       </w:pPr>
     </w:lvl>
-    <w:lvl w:ilvl="1" w:tplc="489C1732">
+    <w:lvl w:ilvl="1" w:tplc="7FF8C8F0">
       <w:numFmt w:val="decimal"/>
       <w:lvlText w:val=""/>
       <w:lvlJc w:val="left"/>
     </w:lvl>
-    <w:lvl w:ilvl="2" w:tplc="19A2D070">
+    <w:lvl w:ilvl="2" w:tplc="13F2A39C">
       <w:numFmt w:val="decimal"/>
       <w:lvlText w:val=""/>
       <w:lvlJc w:val="left"/>
     </w:lvl>
-    <w:lvl w:ilvl="3" w:tplc="102A6016">
+    <w:lvl w:ilvl="3" w:tplc="37D2BA20">
       <w:numFmt w:val="decimal"/>
       <w:lvlText w:val=""/>
       <w:lvlJc w:val="left"/>
     </w:lvl>
-    <w:lvl w:ilvl="4" w:tplc="82A0C0E6">
+    <w:lvl w:ilvl="4" w:tplc="E642321C">
       <w:numFmt w:val="decimal"/>
       <w:lvlText w:val=""/>
       <w:lvlJc w:val="left"/>
     </w:lvl>
-    <w:lvl w:ilvl="5" w:tplc="B9E05902">
+    <w:lvl w:ilvl="5" w:tplc="AC9A138E">
       <w:numFmt w:val="decimal"/>
       <w:lvlText w:val=""/>
       <w:lvlJc w:val="left"/>
     </w:lvl>
-    <w:lvl w:ilvl="6" w:tplc="18BA047A">
+    <w:lvl w:ilvl="6" w:tplc="79041F28">
       <w:numFmt w:val="decimal"/>
       <w:lvlText w:val=""/>
       <w:lvlJc w:val="left"/>
     </w:lvl>
-    <w:lvl w:ilvl="7" w:tplc="1204A9B6">
+    <w:lvl w:ilvl="7" w:tplc="8D7C5ABA">
       <w:numFmt w:val="decimal"/>
       <w:lvlText w:val=""/>
       <w:lvlJc w:val="left"/>
     </w:lvl>
-    <w:lvl w:ilvl="8" w:tplc="55065466">
+    <w:lvl w:ilvl="8" w:tplc="F258B3A0">
       <w:numFmt w:val="decimal"/>
       <w:lvlText w:val=""/>
       <w:lvlJc w:val="left"/>
     </w:lvl>
   </w:abstractNum>
-  <w:num w:numId="1" w16cid:durableId="1068453087">
+  <w:abstractNum w:abstractNumId="3" w15:restartNumberingAfterBreak="0">
+    <w:nsid w:val="7A903586"/>
+    <w:multiLevelType w:val="hybridMultilevel"/>
+    <w:tmpl w:val="377E5316"/>
+    <w:lvl w:ilvl="0" w:tplc="F66AC69E">
+      <w:start w:val="1"/>
+      <w:numFmt w:val="decimal"/>
+      <w:lvlText w:val="%1."/>
+      <w:lvlJc w:val="left"/>
+      <w:pPr>
+        <w:ind w:left="540" w:hanging="300"/>
+      </w:pPr>
+    </w:lvl>
+    <w:lvl w:ilvl="1" w:tplc="159207D0">
+      <w:numFmt w:val="decimal"/>
+      <w:lvlText w:val=""/>
+      <w:lvlJc w:val="left"/>
+    </w:lvl>
+    <w:lvl w:ilvl="2" w:tplc="FDCC099A">
+      <w:numFmt w:val="decimal"/>
+      <w:lvlText w:val=""/>
+      <w:lvlJc w:val="left"/>
+    </w:lvl>
+    <w:lvl w:ilvl="3" w:tplc="A38017A0">
+      <w:numFmt w:val="decimal"/>
+      <w:lvlText w:val=""/>
+      <w:lvlJc w:val="left"/>
+    </w:lvl>
+    <w:lvl w:ilvl="4" w:tplc="BE66F166">
+      <w:numFmt w:val="decimal"/>
+      <w:lvlText w:val=""/>
+      <w:lvlJc w:val="left"/>
+    </w:lvl>
+    <w:lvl w:ilvl="5" w:tplc="6508592C">
+      <w:numFmt w:val="decimal"/>
+      <w:lvlText w:val=""/>
+      <w:lvlJc w:val="left"/>
+    </w:lvl>
+    <w:lvl w:ilvl="6" w:tplc="84788596">
+      <w:numFmt w:val="decimal"/>
+      <w:lvlText w:val=""/>
+      <w:lvlJc w:val="left"/>
+    </w:lvl>
+    <w:lvl w:ilvl="7" w:tplc="52120D9E">
+      <w:numFmt w:val="decimal"/>
+      <w:lvlText w:val=""/>
+      <w:lvlJc w:val="left"/>
+    </w:lvl>
+    <w:lvl w:ilvl="8" w:tplc="E668DEF6">
+      <w:numFmt w:val="decimal"/>
+      <w:lvlText w:val=""/>
+      <w:lvlJc w:val="left"/>
+    </w:lvl>
+  </w:abstractNum>
+  <w:num w:numId="1" w16cid:durableId="510946548">
+    <w:abstractNumId w:val="0"/>
+    <w:lvlOverride w:ilvl="0">
+      <w:startOverride w:val="1"/>
+    </w:lvlOverride>
+  </w:num>
+  <w:num w:numId="2" w16cid:durableId="886140080">
+    <w:abstractNumId w:val="1"/>
+    <w:lvlOverride w:ilvl="0">
+      <w:startOverride w:val="1"/>
+    </w:lvlOverride>
+  </w:num>
+  <w:num w:numId="3" w16cid:durableId="1853959087">
     <w:abstractNumId w:val="2"/>
     <w:lvlOverride w:ilvl="0">
       <w:startOverride w:val="1"/>
     </w:lvlOverride>
   </w:num>
-  <w:num w:numId="2" w16cid:durableId="913703695">
-    <w:abstractNumId w:val="0"/>
-    <w:lvlOverride w:ilvl="0">
-      <w:startOverride w:val="1"/>
-    </w:lvlOverride>
-  </w:num>
-  <w:num w:numId="3" w16cid:durableId="1422919693">
-    <w:abstractNumId w:val="1"/>
-    <w:lvlOverride w:ilvl="0">
-      <w:startOverride w:val="1"/>
-    </w:lvlOverride>
-  </w:num>
-  <w:num w:numId="4" w16cid:durableId="1250624257">
+  <w:num w:numId="4" w16cid:durableId="80683970">
     <w:abstractNumId w:val="3"/>
     <w:lvlOverride w:ilvl="0">
       <w:startOverride w:val="1"/>
@@ -12742,7 +13225,7 @@
     <w:autoRedefine/>
     <w:uiPriority w:val="39"/>
     <w:unhideWhenUsed/>
-    <w:rsid w:val="0031741C"/>
+    <w:rsid w:val="002816FC"/>
     <w:pPr>
       <w:spacing w:after="100"/>
     </w:pPr>
@@ -12754,7 +13237,7 @@
     <w:autoRedefine/>
     <w:uiPriority w:val="39"/>
     <w:unhideWhenUsed/>
-    <w:rsid w:val="0031741C"/>
+    <w:rsid w:val="002816FC"/>
     <w:pPr>
       <w:spacing w:after="100"/>
       <w:ind w:left="210"/>

</xml_diff>